<commit_message>
Doc: Proposal Form, Working on 4,5,6 - L00183767
</commit_message>
<xml_diff>
--- a/Documents/Final_Year_Project_Proposal_Form.docx
+++ b/Documents/Final_Year_Project_Proposal_Form.docx
@@ -304,6 +304,12 @@
                 <w:rFonts w:ascii="Arial" w:hAnsi="Arial" w:cs="Arial"/>
               </w:rPr>
             </w:pPr>
+            <w:r>
+              <w:rPr>
+                <w:rFonts w:ascii="Arial" w:hAnsi="Arial" w:cs="Arial"/>
+              </w:rPr>
+              <w:t xml:space="preserve">Applied Computing </w:t>
+            </w:r>
           </w:p>
         </w:tc>
       </w:tr>
@@ -984,157 +990,221 @@
               <w:spacing w:line="360" w:lineRule="atLeast"/>
               <w:rPr>
                 <w:rFonts w:ascii="Arial" w:hAnsi="Arial" w:cs="Arial"/>
+              </w:rPr>
+            </w:pPr>
+          </w:p>
+          <w:p>
+            <w:pPr>
+              <w:spacing w:line="360" w:lineRule="atLeast"/>
+              <w:rPr>
+                <w:rFonts w:ascii="Arial" w:hAnsi="Arial" w:cs="Arial"/>
+              </w:rPr>
+            </w:pPr>
+            <w:r>
+              <w:rPr>
+                <w:rFonts w:ascii="Arial" w:hAnsi="Arial" w:cs="Arial"/>
+              </w:rPr>
+              <w:t xml:space="preserve">The present world population of 8 billion people is </w:t>
+            </w:r>
+            <w:r>
+              <w:rPr>
+                <w:rFonts w:ascii="Arial" w:hAnsi="Arial" w:cs="Arial"/>
+              </w:rPr>
+              <w:t>projected</w:t>
+            </w:r>
+            <w:r>
+              <w:rPr>
+                <w:rFonts w:ascii="Arial" w:hAnsi="Arial" w:cs="Arial"/>
+              </w:rPr>
+              <w:t xml:space="preserve"> to reach 9.8 billion by 2050. The worldwide demand for food will rise as the population of the world grows, putting strain on the global food supply system. Massive quantities of kitchen and food waste are accumulated </w:t>
+            </w:r>
+            <w:r>
+              <w:rPr>
+                <w:rFonts w:ascii="Arial" w:hAnsi="Arial" w:cs="Arial"/>
+              </w:rPr>
+              <w:t>because of</w:t>
+            </w:r>
+            <w:r>
+              <w:rPr>
+                <w:rFonts w:ascii="Arial" w:hAnsi="Arial" w:cs="Arial"/>
+              </w:rPr>
+              <w:t xml:space="preserve"> industrialization and poor management of waste.</w:t>
+            </w:r>
+            <w:r>
+              <w:rPr>
+                <w:rFonts w:ascii="Arial" w:hAnsi="Arial" w:cs="Arial"/>
+              </w:rPr>
+              <w:fldChar w:fldCharType="begin"/>
+            </w:r>
+            <w:r>
+              <w:rPr>
+                <w:rFonts w:ascii="Arial" w:hAnsi="Arial" w:cs="Arial"/>
+              </w:rPr>
+              <w:instrText xml:space="preserve"> ADDIN ZOTERO_ITEM CSL_CITATION {"citationID":"ypBTucPb","properties":{"formattedCitation":"(Haldar {\\i{}et al.} 2022)","plainCitation":"(Haldar et al. 2022)","noteIndex":0},"citationItems":[{"id":44,"uris":["http://zotero.org/users/local/ALZH0Phn/items/ZV4SSNKD"],"itemData":{"id":44,"type":"article-journal","abstract":"Increased urbanization and industrialization accelerated demand for energy, large-scale waste output, and negative environmental consequences. Therefore, the implementation of an effective solid-waste-management (SWM) policy for the handling of food waste is of great importance. The global food waste generation is estimated at about 1.6 gigatons/yr which attributes to an economic revenue of 750 billion USD. It can be converted into high-value enzymes, surfactants, Poly-hydroxybutyrate, biofuels, etc. However, the heterogeneous composition of food with high organic load and varying moisture content makes their transformation into value-added products difficult. This review aims to bring forth the possibilities and repercussions of food waste management. The socio-economic challenges related to SWM are comprehensively discussed particularly in terms of environmental concern. The engineering aspect in the collection, storage, and biotransformation of food waste into useful value-added products such as biofuels, advanced biomaterials, bioactive compounds, and platform chemicals are critically reviewed for efficient food waste management.","container-title":"Bioresource Technology","DOI":"10.1016/j.biortech.2022.127390","ISSN":"0960-8524","journalAbbreviation":"Bioresource Technology","page":"127390","source":"ScienceDirect","title":"Understanding the management of household food waste and its engineering for sustainable valorization- A state-of-the-art review","volume":"358","author":[{"family":"Haldar","given":"Dibyajyoti"},{"family":"Shabbirahmed","given":"Asma Musfira"},{"family":"Singhania","given":"Reeta Rani"},{"family":"Chen","given":"Chiu-Wen"},{"family":"Dong","given":"Cheng-Di"},{"family":"Ponnusamy","given":"Vinoth Kumar"},{"family":"Patel","given":"Anil Kumar"}],"issued":{"date-parts":[["2022",8,1]]}}}],"schema":"https://github.com/citation-style-language/schema/raw/master/csl-citation.json"} </w:instrText>
+            </w:r>
+            <w:r>
+              <w:rPr>
+                <w:rFonts w:ascii="Arial" w:hAnsi="Arial" w:cs="Arial"/>
+              </w:rPr>
+              <w:fldChar w:fldCharType="separate"/>
+            </w:r>
+            <w:r>
+              <w:rPr>
+                <w:rFonts w:ascii="Arial" w:hAnsi="Arial" w:cs="Arial"/>
+              </w:rPr>
+              <w:t xml:space="preserve">(Haldar </w:t>
+            </w:r>
+            <w:r>
+              <w:rPr>
+                <w:rFonts w:ascii="Arial" w:hAnsi="Arial" w:cs="Arial"/>
                 <w:i/>
                 <w:iCs/>
-                <w:sz w:val="24"/>
-                <w:szCs w:val="24"/>
-              </w:rPr>
-            </w:pPr>
+              </w:rPr>
+              <w:t>et al.</w:t>
+            </w:r>
+            <w:r>
+              <w:rPr>
+                <w:rFonts w:ascii="Arial" w:hAnsi="Arial" w:cs="Arial"/>
+              </w:rPr>
+              <w:t xml:space="preserve"> 2022)</w:t>
+            </w:r>
+            <w:r>
+              <w:rPr>
+                <w:rFonts w:ascii="Arial" w:hAnsi="Arial" w:cs="Arial"/>
+              </w:rPr>
+              <w:fldChar w:fldCharType="end"/>
+            </w:r>
+            <w:r>
+              <w:rPr>
+                <w:rFonts w:ascii="Arial" w:hAnsi="Arial" w:cs="Arial"/>
+              </w:rPr>
+              <w:t xml:space="preserve">. </w:t>
+            </w:r>
+          </w:p>
+          <w:p>
+            <w:pPr>
+              <w:spacing w:line="360" w:lineRule="atLeast"/>
+              <w:rPr>
+                <w:rFonts w:ascii="Arial" w:hAnsi="Arial" w:cs="Arial"/>
+              </w:rPr>
+            </w:pPr>
+          </w:p>
+          <w:p>
+            <w:pPr>
+              <w:spacing w:line="360" w:lineRule="atLeast"/>
+              <w:rPr>
+                <w:rFonts w:ascii="Arial" w:hAnsi="Arial" w:cs="Arial"/>
+              </w:rPr>
+            </w:pPr>
+            <w:r>
+              <w:rPr>
+                <w:rFonts w:ascii="Arial" w:hAnsi="Arial" w:cs="Arial"/>
+              </w:rPr>
+              <w:t>According to the Food</w:t>
+            </w:r>
+            <w:r>
+              <w:rPr>
+                <w:rFonts w:ascii="Arial" w:hAnsi="Arial" w:cs="Arial"/>
+              </w:rPr>
+              <w:t xml:space="preserve"> and Agriculture Organization (FAO), around 1.3 billion tons of food is lost and squandered every year, costing the world economy 750 billion dollars.</w:t>
+            </w:r>
+            <w:r>
+              <w:rPr>
+                <w:rFonts w:ascii="Arial" w:hAnsi="Arial" w:cs="Arial"/>
+              </w:rPr>
+              <w:fldChar w:fldCharType="begin"/>
+            </w:r>
+            <w:r>
+              <w:rPr>
+                <w:rFonts w:ascii="Arial" w:hAnsi="Arial" w:cs="Arial"/>
+              </w:rPr>
+              <w:instrText xml:space="preserve"> ADDIN ZOTERO_ITEM CSL_CITATION {"citationID":"gRt2sfQr","properties":{"formattedCitation":"(Haldar {\\i{}et al.} 2022)","plainCitation":"(Haldar et al. 2022)","noteIndex":0},"citationItems":[{"id":44,"uris":["http://zotero.org/users/local/ALZH0Phn/items/ZV4SSNKD"],"itemData":{"id":44,"type":"article-journal","abstract":"Increased urbanization and industrialization accelerated demand for energy, large-scale waste output, and negative environmental consequences. Therefore, the implementation of an effective solid-waste-management (SWM) policy for the handling of food waste is of great importance. The global food waste generation is estimated at about 1.6 gigatons/yr which attributes to an economic revenue of 750 billion USD. It can be converted into high-value enzymes, surfactants, Poly-hydroxybutyrate, biofuels, etc. However, the heterogeneous composition of food with high organic load and varying moisture content makes their transformation into value-added products difficult. This review aims to bring forth the possibilities and repercussions of food waste management. The socio-economic challenges related to SWM are comprehensively discussed particularly in terms of environmental concern. The engineering aspect in the collection, storage, and biotransformation of food waste into useful value-added products such as biofuels, advanced biomaterials, bioactive compounds, and platform chemicals are critically reviewed for efficient food waste management.","container-title":"Bioresource Technology","DOI":"10.1016/j.biortech.2022.127390","ISSN":"0960-8524","journalAbbreviation":"Bioresource Technology","page":"127390","source":"ScienceDirect","title":"Understanding the management of household food waste and its engineering for sustainable valorization- A state-of-the-art review","volume":"358","author":[{"family":"Haldar","given":"Dibyajyoti"},{"family":"Shabbirahmed","given":"Asma Musfira"},{"family":"Singhania","given":"Reeta Rani"},{"family":"Chen","given":"Chiu-Wen"},{"family":"Dong","given":"Cheng-Di"},{"family":"Ponnusamy","given":"Vinoth Kumar"},{"family":"Patel","given":"Anil Kumar"}],"issued":{"date-parts":[["2022",8,1]]}}}],"schema":"https://github.com/citation-style-language/schema/raw/master/csl-citation.json"} </w:instrText>
+            </w:r>
+            <w:r>
+              <w:rPr>
+                <w:rFonts w:ascii="Arial" w:hAnsi="Arial" w:cs="Arial"/>
+              </w:rPr>
+              <w:fldChar w:fldCharType="separate"/>
+            </w:r>
+            <w:r>
+              <w:rPr>
+                <w:rFonts w:ascii="Arial" w:hAnsi="Arial" w:cs="Arial"/>
+              </w:rPr>
+              <w:t xml:space="preserve">(Haldar </w:t>
+            </w:r>
             <w:r>
               <w:rPr>
                 <w:rFonts w:ascii="Arial" w:hAnsi="Arial" w:cs="Arial"/>
                 <w:i/>
                 <w:iCs/>
-                <w:sz w:val="24"/>
-                <w:szCs w:val="24"/>
-              </w:rPr>
-              <w:t>Background information on the topic.</w:t>
-            </w:r>
-          </w:p>
-          <w:p>
-            <w:pPr>
-              <w:spacing w:line="360" w:lineRule="atLeast"/>
-              <w:rPr>
-                <w:rFonts w:ascii="Arial" w:hAnsi="Arial" w:cs="Arial"/>
-                <w:i/>
-                <w:iCs/>
-                <w:sz w:val="24"/>
-                <w:szCs w:val="24"/>
-              </w:rPr>
-            </w:pPr>
-            <w:r>
-              <w:rPr>
-                <w:rFonts w:ascii="Arial" w:hAnsi="Arial" w:cs="Arial"/>
-                <w:i/>
-                <w:iCs/>
-                <w:sz w:val="24"/>
-                <w:szCs w:val="24"/>
-              </w:rPr>
-              <w:t xml:space="preserve">Project </w:t>
-            </w:r>
-            <w:r>
-              <w:rPr>
-                <w:rFonts w:ascii="Arial" w:hAnsi="Arial" w:cs="Arial"/>
-                <w:i/>
-                <w:iCs/>
-                <w:sz w:val="24"/>
-                <w:szCs w:val="24"/>
-              </w:rPr>
-              <w:t xml:space="preserve">Rationale </w:t>
-            </w:r>
-            <w:r>
-              <w:rPr>
-                <w:rFonts w:ascii="Arial" w:hAnsi="Arial" w:cs="Arial"/>
-                <w:i/>
-                <w:iCs/>
-                <w:sz w:val="24"/>
-                <w:szCs w:val="24"/>
-              </w:rPr>
-              <w:t>and Significance</w:t>
-            </w:r>
-          </w:p>
-          <w:p>
-            <w:pPr>
-              <w:spacing w:line="360" w:lineRule="atLeast"/>
-              <w:rPr>
-                <w:rFonts w:ascii="Arial" w:hAnsi="Arial" w:cs="Arial"/>
-                <w:i/>
-                <w:iCs/>
-                <w:sz w:val="24"/>
-                <w:szCs w:val="24"/>
-              </w:rPr>
-            </w:pPr>
-            <w:r>
-              <w:rPr>
-                <w:rFonts w:ascii="Arial" w:hAnsi="Arial" w:cs="Arial"/>
-                <w:i/>
-                <w:iCs/>
-                <w:sz w:val="24"/>
-                <w:szCs w:val="24"/>
-              </w:rPr>
-              <w:t xml:space="preserve">Clear statement of the problem </w:t>
-            </w:r>
-            <w:r>
-              <w:rPr>
-                <w:rFonts w:ascii="Arial" w:hAnsi="Arial" w:cs="Arial"/>
-                <w:i/>
-                <w:iCs/>
-                <w:sz w:val="24"/>
-                <w:szCs w:val="24"/>
-              </w:rPr>
-              <w:t>you are investigating/overarching aim.</w:t>
-            </w:r>
-          </w:p>
-          <w:p>
-            <w:pPr>
-              <w:spacing w:line="360" w:lineRule="atLeast"/>
-              <w:rPr>
-                <w:rFonts w:ascii="Arial" w:hAnsi="Arial" w:cs="Arial"/>
-              </w:rPr>
-            </w:pPr>
-          </w:p>
-          <w:p>
-            <w:pPr>
-              <w:spacing w:line="360" w:lineRule="atLeast"/>
-              <w:rPr>
-                <w:rFonts w:ascii="Arial" w:hAnsi="Arial" w:cs="Arial"/>
-              </w:rPr>
-            </w:pPr>
-          </w:p>
-          <w:p>
-            <w:pPr>
-              <w:spacing w:line="360" w:lineRule="atLeast"/>
-              <w:rPr>
-                <w:rFonts w:ascii="Arial" w:hAnsi="Arial" w:cs="Arial"/>
-              </w:rPr>
-            </w:pPr>
-          </w:p>
-          <w:p>
-            <w:pPr>
-              <w:spacing w:line="360" w:lineRule="atLeast"/>
-              <w:rPr>
-                <w:rFonts w:ascii="Arial" w:hAnsi="Arial" w:cs="Arial"/>
-              </w:rPr>
-            </w:pPr>
-            <w:r>
-              <w:rPr>
-                <w:rFonts w:ascii="Arial" w:hAnsi="Arial" w:cs="Arial"/>
-              </w:rPr>
-              <w:t xml:space="preserve">The present world population of 8 billion people is </w:t>
-            </w:r>
-            <w:r>
-              <w:rPr>
-                <w:rFonts w:ascii="Arial" w:hAnsi="Arial" w:cs="Arial"/>
-              </w:rPr>
-              <w:t>projected</w:t>
-            </w:r>
-            <w:r>
-              <w:rPr>
-                <w:rFonts w:ascii="Arial" w:hAnsi="Arial" w:cs="Arial"/>
-              </w:rPr>
-              <w:t xml:space="preserve"> to reach 9.8 billion by 2050. The worldwide demand for food will rise as the population of the world grows, putting strain on the global food supply system. Massive quantities of kitchen and food waste are accumulated </w:t>
-            </w:r>
-            <w:r>
-              <w:rPr>
-                <w:rFonts w:ascii="Arial" w:hAnsi="Arial" w:cs="Arial"/>
-              </w:rPr>
-              <w:t>because of</w:t>
-            </w:r>
-            <w:r>
-              <w:rPr>
-                <w:rFonts w:ascii="Arial" w:hAnsi="Arial" w:cs="Arial"/>
-              </w:rPr>
-              <w:t xml:space="preserve"> industrialization and poor management of waste.</w:t>
+              </w:rPr>
+              <w:t>et al.</w:t>
+            </w:r>
+            <w:r>
+              <w:rPr>
+                <w:rFonts w:ascii="Arial" w:hAnsi="Arial" w:cs="Arial"/>
+              </w:rPr>
+              <w:t xml:space="preserve"> 2022)</w:t>
+            </w:r>
+            <w:r>
+              <w:rPr>
+                <w:rFonts w:ascii="Arial" w:hAnsi="Arial" w:cs="Arial"/>
+              </w:rPr>
+              <w:fldChar w:fldCharType="end"/>
+            </w:r>
+            <w:r>
+              <w:rPr>
+                <w:rFonts w:ascii="Arial" w:hAnsi="Arial" w:cs="Arial"/>
+              </w:rPr>
+              <w:t>.</w:t>
+            </w:r>
+            <w:r>
+              <w:rPr>
+                <w:rFonts w:ascii="Arial" w:hAnsi="Arial" w:cs="Arial"/>
+              </w:rPr>
+              <w:t xml:space="preserve">The </w:t>
+            </w:r>
+            <w:r>
+              <w:rPr>
+                <w:rFonts w:ascii="Arial" w:hAnsi="Arial" w:cs="Arial"/>
+              </w:rPr>
+              <w:t xml:space="preserve">Environmental Protection Agency (EPA) of Ireland estimates that 708,000 tonnes of food waste </w:t>
+            </w:r>
+            <w:r>
+              <w:rPr>
+                <w:rFonts w:ascii="Arial" w:hAnsi="Arial" w:cs="Arial"/>
+              </w:rPr>
+              <w:t>was</w:t>
+            </w:r>
+            <w:r>
+              <w:rPr>
+                <w:rFonts w:ascii="Arial" w:hAnsi="Arial" w:cs="Arial"/>
+              </w:rPr>
+              <w:t xml:space="preserve"> generated in 2024. This equates to 132kg of food waste per person, which is higher than the EU average food waste</w:t>
+            </w:r>
+            <w:r>
+              <w:rPr>
+                <w:rFonts w:ascii="Arial" w:hAnsi="Arial" w:cs="Arial"/>
+              </w:rPr>
+              <w:t xml:space="preserve"> </w:t>
+            </w:r>
+            <w:r>
+              <w:rPr>
+                <w:rFonts w:ascii="Arial" w:hAnsi="Arial" w:cs="Arial"/>
+              </w:rPr>
+              <w:t xml:space="preserve">of 130kg </w:t>
+            </w:r>
+            <w:r>
+              <w:rPr>
+                <w:rFonts w:ascii="Arial" w:hAnsi="Arial" w:cs="Arial"/>
+              </w:rPr>
+              <w:t>per person.</w:t>
+            </w:r>
+            <w:r>
+              <w:rPr>
+                <w:rFonts w:ascii="Arial" w:hAnsi="Arial" w:cs="Arial"/>
+              </w:rPr>
+              <w:t xml:space="preserve"> Out of the 708,000 tonnes, households were at the top of the list with 31% (219,000 tonnes) of the total wastage.</w:t>
             </w:r>
             <w:r>
               <w:rPr>
@@ -1146,7 +1216,7 @@
               <w:rPr>
                 <w:rFonts w:ascii="Arial" w:hAnsi="Arial" w:cs="Arial"/>
               </w:rPr>
-              <w:instrText xml:space="preserve"> ADDIN ZOTERO_ITEM CSL_CITATION {"citationID":"ypBTucPb","properties":{"formattedCitation":"(Haldar {\\i{}et al.} 2022)","plainCitation":"(Haldar et al. 2022)","noteIndex":0},"citationItems":[{"id":44,"uris":["http://zotero.org/users/local/ALZH0Phn/items/ZV4SSNKD"],"itemData":{"id":44,"type":"article-journal","abstract":"Increased urbanization and industrialization accelerated demand for energy, large-scale waste output, and negative environmental consequences. Therefore, the implementation of an effective solid-waste-management (SWM) policy for the handling of food waste is of great importance. The global food waste generation is estimated at about 1.6 gigatons/yr which attributes to an economic revenue of 750 billion USD. It can be converted into high-value enzymes, surfactants, Poly-hydroxybutyrate, biofuels, etc. However, the heterogeneous composition of food with high organic load and varying moisture content makes their transformation into value-added products difficult. This review aims to bring forth the possibilities and repercussions of food waste management. The socio-economic challenges related to SWM are comprehensively discussed particularly in terms of environmental concern. The engineering aspect in the collection, storage, and biotransformation of food waste into useful value-added products such as biofuels, advanced biomaterials, bioactive compounds, and platform chemicals are critically reviewed for efficient food waste management.","container-title":"Bioresource Technology","DOI":"10.1016/j.biortech.2022.127390","ISSN":"0960-8524","journalAbbreviation":"Bioresource Technology","page":"127390","source":"ScienceDirect","title":"Understanding the management of household food waste and its engineering for sustainable valorization- A state-of-the-art review","volume":"358","author":[{"family":"Haldar","given":"Dibyajyoti"},{"family":"Shabbirahmed","given":"Asma Musfira"},{"family":"Singhania","given":"Reeta Rani"},{"family":"Chen","given":"Chiu-Wen"},{"family":"Dong","given":"Cheng-Di"},{"family":"Ponnusamy","given":"Vinoth Kumar"},{"family":"Patel","given":"Anil Kumar"}],"issued":{"date-parts":[["2022",8,1]]}}}],"schema":"https://github.com/citation-style-language/schema/raw/master/csl-citation.json"} </w:instrText>
+              <w:instrText xml:space="preserve"> ADDIN ZOTERO_ITEM CSL_CITATION {"citationID":"zC8m7iW1","properties":{"formattedCitation":"(Agency 2026)","plainCitation":"(Agency 2026)","noteIndex":0},"citationItems":[{"id":46,"uris":["http://zotero.org/users/local/ALZH0Phn/items/EUSXIBAN"],"itemData":{"id":46,"type":"webpage","language":"en","title":"Food Waste Statistics for Ireland","URL":"https://www.epa.ie/our-services/monitoring--assessment/waste/national-waste-statistics/food/","author":[{"family":"Agency","given":"Environmental Protection"}],"accessed":{"date-parts":[["2026",10,2]]}}}],"schema":"https://github.com/citation-style-language/schema/raw/master/csl-citation.json"} </w:instrText>
             </w:r>
             <w:r>
               <w:rPr>
@@ -1158,21 +1228,7 @@
               <w:rPr>
                 <w:rFonts w:ascii="Arial" w:hAnsi="Arial" w:cs="Arial"/>
               </w:rPr>
-              <w:t xml:space="preserve">(Haldar </w:t>
-            </w:r>
-            <w:r>
-              <w:rPr>
-                <w:rFonts w:ascii="Arial" w:hAnsi="Arial" w:cs="Arial"/>
-                <w:i/>
-                <w:iCs/>
-              </w:rPr>
-              <w:t>et al.</w:t>
-            </w:r>
-            <w:r>
-              <w:rPr>
-                <w:rFonts w:ascii="Arial" w:hAnsi="Arial" w:cs="Arial"/>
-              </w:rPr>
-              <w:t xml:space="preserve"> 2022)</w:t>
+              <w:t>(Agency 2026)</w:t>
             </w:r>
             <w:r>
               <w:rPr>
@@ -1184,342 +1240,108 @@
               <w:rPr>
                 <w:rFonts w:ascii="Arial" w:hAnsi="Arial" w:cs="Arial"/>
               </w:rPr>
+              <w:t>.</w:t>
+            </w:r>
+          </w:p>
+          <w:p>
+            <w:pPr>
+              <w:spacing w:line="360" w:lineRule="atLeast"/>
+              <w:rPr>
+                <w:rFonts w:ascii="Arial" w:hAnsi="Arial" w:cs="Arial"/>
+              </w:rPr>
+            </w:pPr>
+          </w:p>
+          <w:p>
+            <w:pPr>
+              <w:spacing w:line="360" w:lineRule="atLeast"/>
+              <w:rPr>
+                <w:rFonts w:ascii="Arial" w:hAnsi="Arial" w:cs="Arial"/>
+              </w:rPr>
+            </w:pPr>
+            <w:r>
+              <w:rPr>
+                <w:rFonts w:ascii="Arial" w:hAnsi="Arial" w:cs="Arial"/>
+              </w:rPr>
+              <w:t>Food waste cost</w:t>
+            </w:r>
+            <w:r>
+              <w:rPr>
+                <w:rFonts w:ascii="Arial" w:hAnsi="Arial" w:cs="Arial"/>
+              </w:rPr>
+              <w:t xml:space="preserve">s </w:t>
+            </w:r>
+            <w:r>
+              <w:rPr>
+                <w:rFonts w:ascii="Arial" w:hAnsi="Arial" w:cs="Arial"/>
+              </w:rPr>
+              <w:t>the average Irish household around €60 per month</w:t>
+            </w:r>
+            <w:r>
+              <w:rPr>
+                <w:rFonts w:ascii="Arial" w:hAnsi="Arial" w:cs="Arial"/>
+              </w:rPr>
+              <w:t xml:space="preserve"> which equates to </w:t>
+            </w:r>
+            <w:r>
+              <w:rPr>
+                <w:rFonts w:ascii="Arial" w:hAnsi="Arial" w:cs="Arial"/>
+              </w:rPr>
+              <w:t xml:space="preserve">€700 per year. </w:t>
+            </w:r>
+            <w:r>
+              <w:rPr>
+                <w:rFonts w:ascii="Arial" w:hAnsi="Arial" w:cs="Arial"/>
+              </w:rPr>
+              <w:t>That’s</w:t>
+            </w:r>
+            <w:r>
+              <w:rPr>
+                <w:rFonts w:ascii="Arial" w:hAnsi="Arial" w:cs="Arial"/>
+              </w:rPr>
+              <w:t xml:space="preserve"> an annual national cost of €1.29 billion. </w:t>
+            </w:r>
+            <w:r>
+              <w:rPr>
+                <w:rFonts w:ascii="Arial" w:hAnsi="Arial" w:cs="Arial"/>
+              </w:rPr>
+              <w:fldChar w:fldCharType="begin"/>
+            </w:r>
+            <w:r>
+              <w:rPr>
+                <w:rFonts w:ascii="Arial" w:hAnsi="Arial" w:cs="Arial"/>
+              </w:rPr>
+              <w:instrText xml:space="preserve"> ADDIN ZOTERO_ITEM CSL_CITATION {"citationID":"m4O6c7QB","properties":{"formattedCitation":"(Agency 2026)","plainCitation":"(Agency 2026)","noteIndex":0},"citationItems":[{"id":46,"uris":["http://zotero.org/users/local/ALZH0Phn/items/EUSXIBAN"],"itemData":{"id":46,"type":"webpage","language":"en","title":"Food Waste Statistics for Ireland","URL":"https://www.epa.ie/our-services/monitoring--assessment/waste/national-waste-statistics/food/","author":[{"family":"Agency","given":"Environmental Protection"}],"accessed":{"date-parts":[["2026",10,2]]}}}],"schema":"https://github.com/citation-style-language/schema/raw/master/csl-citation.json"} </w:instrText>
+            </w:r>
+            <w:r>
+              <w:rPr>
+                <w:rFonts w:ascii="Arial" w:hAnsi="Arial" w:cs="Arial"/>
+              </w:rPr>
+              <w:fldChar w:fldCharType="separate"/>
+            </w:r>
+            <w:r>
+              <w:rPr>
+                <w:rFonts w:ascii="Arial" w:hAnsi="Arial" w:cs="Arial"/>
+              </w:rPr>
+              <w:t>(Agency 2026)</w:t>
+            </w:r>
+            <w:r>
+              <w:rPr>
+                <w:rFonts w:ascii="Arial" w:hAnsi="Arial" w:cs="Arial"/>
+              </w:rPr>
+              <w:fldChar w:fldCharType="end"/>
+            </w:r>
+            <w:r>
+              <w:rPr>
+                <w:rFonts w:ascii="Arial" w:hAnsi="Arial" w:cs="Arial"/>
+              </w:rPr>
               <w:t xml:space="preserve">. </w:t>
             </w:r>
-          </w:p>
-          <w:p>
-            <w:pPr>
-              <w:spacing w:line="360" w:lineRule="atLeast"/>
-              <w:rPr>
-                <w:rFonts w:ascii="Arial" w:hAnsi="Arial" w:cs="Arial"/>
-              </w:rPr>
-            </w:pPr>
-          </w:p>
-          <w:p>
-            <w:pPr>
-              <w:spacing w:line="360" w:lineRule="atLeast"/>
-              <w:rPr>
-                <w:rFonts w:ascii="Arial" w:hAnsi="Arial" w:cs="Arial"/>
-              </w:rPr>
-            </w:pPr>
-            <w:r>
-              <w:rPr>
-                <w:rFonts w:ascii="Arial" w:hAnsi="Arial" w:cs="Arial"/>
-              </w:rPr>
-              <w:t>According to the Food</w:t>
-            </w:r>
-            <w:r>
-              <w:rPr>
-                <w:rFonts w:ascii="Arial" w:hAnsi="Arial" w:cs="Arial"/>
-              </w:rPr>
-              <w:t xml:space="preserve"> and Agriculture Organization (FAO), around 1.3 billion tons of food is lost and squandered every year, costing the world economy 750 billion dollars.</w:t>
-            </w:r>
-            <w:r>
-              <w:rPr>
-                <w:rFonts w:ascii="Arial" w:hAnsi="Arial" w:cs="Arial"/>
-              </w:rPr>
-              <w:fldChar w:fldCharType="begin"/>
-            </w:r>
-            <w:r>
-              <w:rPr>
-                <w:rFonts w:ascii="Arial" w:hAnsi="Arial" w:cs="Arial"/>
-              </w:rPr>
-              <w:instrText xml:space="preserve"> ADDIN ZOTERO_ITEM CSL_CITATION {"citationID":"gRt2sfQr","properties":{"formattedCitation":"(Haldar {\\i{}et al.} 2022)","plainCitation":"(Haldar et al. 2022)","noteIndex":0},"citationItems":[{"id":44,"uris":["http://zotero.org/users/local/ALZH0Phn/items/ZV4SSNKD"],"itemData":{"id":44,"type":"article-journal","abstract":"Increased urbanization and industrialization accelerated demand for energy, large-scale waste output, and negative environmental consequences. Therefore, the implementation of an effective solid-waste-management (SWM) policy for the handling of food waste is of great importance. The global food waste generation is estimated at about 1.6 gigatons/yr which attributes to an economic revenue of 750 billion USD. It can be converted into high-value enzymes, surfactants, Poly-hydroxybutyrate, biofuels, etc. However, the heterogeneous composition of food with high organic load and varying moisture content makes their transformation into value-added products difficult. This review aims to bring forth the possibilities and repercussions of food waste management. The socio-economic challenges related to SWM are comprehensively discussed particularly in terms of environmental concern. The engineering aspect in the collection, storage, and biotransformation of food waste into useful value-added products such as biofuels, advanced biomaterials, bioactive compounds, and platform chemicals are critically reviewed for efficient food waste management.","container-title":"Bioresource Technology","DOI":"10.1016/j.biortech.2022.127390","ISSN":"0960-8524","journalAbbreviation":"Bioresource Technology","page":"127390","source":"ScienceDirect","title":"Understanding the management of household food waste and its engineering for sustainable valorization- A state-of-the-art review","volume":"358","author":[{"family":"Haldar","given":"Dibyajyoti"},{"family":"Shabbirahmed","given":"Asma Musfira"},{"family":"Singhania","given":"Reeta Rani"},{"family":"Chen","given":"Chiu-Wen"},{"family":"Dong","given":"Cheng-Di"},{"family":"Ponnusamy","given":"Vinoth Kumar"},{"family":"Patel","given":"Anil Kumar"}],"issued":{"date-parts":[["2022",8,1]]}}}],"schema":"https://github.com/citation-style-language/schema/raw/master/csl-citation.json"} </w:instrText>
-            </w:r>
-            <w:r>
-              <w:rPr>
-                <w:rFonts w:ascii="Arial" w:hAnsi="Arial" w:cs="Arial"/>
-              </w:rPr>
-              <w:fldChar w:fldCharType="separate"/>
-            </w:r>
-            <w:r>
-              <w:rPr>
-                <w:rFonts w:ascii="Arial" w:hAnsi="Arial" w:cs="Arial"/>
-              </w:rPr>
-              <w:t xml:space="preserve">(Haldar </w:t>
-            </w:r>
-            <w:r>
-              <w:rPr>
-                <w:rFonts w:ascii="Arial" w:hAnsi="Arial" w:cs="Arial"/>
-                <w:i/>
-                <w:iCs/>
-              </w:rPr>
-              <w:t>et al.</w:t>
-            </w:r>
-            <w:r>
-              <w:rPr>
-                <w:rFonts w:ascii="Arial" w:hAnsi="Arial" w:cs="Arial"/>
-              </w:rPr>
-              <w:t xml:space="preserve"> 2022)</w:t>
-            </w:r>
-            <w:r>
-              <w:rPr>
-                <w:rFonts w:ascii="Arial" w:hAnsi="Arial" w:cs="Arial"/>
-              </w:rPr>
-              <w:fldChar w:fldCharType="end"/>
-            </w:r>
-            <w:r>
-              <w:rPr>
-                <w:rFonts w:ascii="Arial" w:hAnsi="Arial" w:cs="Arial"/>
-              </w:rPr>
-              <w:t>.</w:t>
-            </w:r>
-            <w:r>
-              <w:rPr>
-                <w:rFonts w:ascii="Arial" w:hAnsi="Arial" w:cs="Arial"/>
-              </w:rPr>
-              <w:t xml:space="preserve">The </w:t>
-            </w:r>
-            <w:r>
-              <w:rPr>
-                <w:rFonts w:ascii="Arial" w:hAnsi="Arial" w:cs="Arial"/>
-              </w:rPr>
-              <w:t xml:space="preserve">Environmental Protection Agency (EPA) of Ireland estimates that 708,000 tonnes of food waste </w:t>
-            </w:r>
-            <w:r>
-              <w:rPr>
-                <w:rFonts w:ascii="Arial" w:hAnsi="Arial" w:cs="Arial"/>
-              </w:rPr>
-              <w:t>was</w:t>
-            </w:r>
-            <w:r>
-              <w:rPr>
-                <w:rFonts w:ascii="Arial" w:hAnsi="Arial" w:cs="Arial"/>
-              </w:rPr>
-              <w:t xml:space="preserve"> generated in 2024. This equates to 132kg of food waste per person, which is higher than the EU average food waste</w:t>
-            </w:r>
-            <w:r>
-              <w:rPr>
-                <w:rFonts w:ascii="Arial" w:hAnsi="Arial" w:cs="Arial"/>
-              </w:rPr>
-              <w:t xml:space="preserve"> </w:t>
-            </w:r>
-            <w:r>
-              <w:rPr>
-                <w:rFonts w:ascii="Arial" w:hAnsi="Arial" w:cs="Arial"/>
-              </w:rPr>
-              <w:t xml:space="preserve">of 130kg </w:t>
-            </w:r>
-            <w:r>
-              <w:rPr>
-                <w:rFonts w:ascii="Arial" w:hAnsi="Arial" w:cs="Arial"/>
-              </w:rPr>
-              <w:t>per person.</w:t>
-            </w:r>
-            <w:r>
-              <w:rPr>
-                <w:rFonts w:ascii="Arial" w:hAnsi="Arial" w:cs="Arial"/>
-              </w:rPr>
-              <w:t xml:space="preserve"> Out of the 708,000 tonnes, households were at the top of the list with 31% (219,000 tonnes) of the total wastage.</w:t>
-            </w:r>
-            <w:r>
-              <w:rPr>
-                <w:rFonts w:ascii="Arial" w:hAnsi="Arial" w:cs="Arial"/>
-              </w:rPr>
-              <w:fldChar w:fldCharType="begin"/>
-            </w:r>
-            <w:r>
-              <w:rPr>
-                <w:rFonts w:ascii="Arial" w:hAnsi="Arial" w:cs="Arial"/>
-              </w:rPr>
-              <w:instrText xml:space="preserve"> ADDIN ZOTERO_ITEM CSL_CITATION {"citationID":"zC8m7iW1","properties":{"formattedCitation":"(Agency 2026)","plainCitation":"(Agency 2026)","noteIndex":0},"citationItems":[{"id":46,"uris":["http://zotero.org/users/local/ALZH0Phn/items/EUSXIBAN"],"itemData":{"id":46,"type":"webpage","language":"en","title":"Food Waste Statistics for Ireland","URL":"https://www.epa.ie/our-services/monitoring--assessment/waste/national-waste-statistics/food/","author":[{"family":"Agency","given":"Environmental Protection"}],"accessed":{"date-parts":[["2026",10,2]]}}}],"schema":"https://github.com/citation-style-language/schema/raw/master/csl-citation.json"} </w:instrText>
-            </w:r>
-            <w:r>
-              <w:rPr>
-                <w:rFonts w:ascii="Arial" w:hAnsi="Arial" w:cs="Arial"/>
-              </w:rPr>
-              <w:fldChar w:fldCharType="separate"/>
-            </w:r>
-            <w:r>
-              <w:rPr>
-                <w:rFonts w:ascii="Arial" w:hAnsi="Arial" w:cs="Arial"/>
-              </w:rPr>
-              <w:t>(Agency 2026)</w:t>
-            </w:r>
-            <w:r>
-              <w:rPr>
-                <w:rFonts w:ascii="Arial" w:hAnsi="Arial" w:cs="Arial"/>
-              </w:rPr>
-              <w:fldChar w:fldCharType="end"/>
-            </w:r>
-            <w:r>
-              <w:rPr>
-                <w:rFonts w:ascii="Arial" w:hAnsi="Arial" w:cs="Arial"/>
-              </w:rPr>
-              <w:t>.</w:t>
-            </w:r>
-          </w:p>
-          <w:p>
-            <w:pPr>
-              <w:spacing w:line="360" w:lineRule="atLeast"/>
-              <w:rPr>
-                <w:rFonts w:ascii="Arial" w:hAnsi="Arial" w:cs="Arial"/>
-              </w:rPr>
-            </w:pPr>
-          </w:p>
-          <w:p>
-            <w:pPr>
-              <w:spacing w:line="360" w:lineRule="atLeast"/>
-              <w:rPr>
-                <w:rFonts w:ascii="Arial" w:hAnsi="Arial" w:cs="Arial"/>
-              </w:rPr>
-            </w:pPr>
-            <w:r>
-              <w:rPr>
-                <w:rFonts w:ascii="Arial" w:hAnsi="Arial" w:cs="Arial"/>
-              </w:rPr>
-              <w:t>Food waste cost</w:t>
-            </w:r>
-            <w:r>
-              <w:rPr>
-                <w:rFonts w:ascii="Arial" w:hAnsi="Arial" w:cs="Arial"/>
-              </w:rPr>
-              <w:t xml:space="preserve">s </w:t>
-            </w:r>
-            <w:r>
-              <w:rPr>
-                <w:rFonts w:ascii="Arial" w:hAnsi="Arial" w:cs="Arial"/>
-              </w:rPr>
-              <w:t>the average Irish household around €60 per month</w:t>
-            </w:r>
-            <w:r>
-              <w:rPr>
-                <w:rFonts w:ascii="Arial" w:hAnsi="Arial" w:cs="Arial"/>
-              </w:rPr>
-              <w:t xml:space="preserve"> which equates to </w:t>
-            </w:r>
-            <w:r>
-              <w:rPr>
-                <w:rFonts w:ascii="Arial" w:hAnsi="Arial" w:cs="Arial"/>
-              </w:rPr>
-              <w:t xml:space="preserve">€700 per year. </w:t>
-            </w:r>
-            <w:r>
-              <w:rPr>
-                <w:rFonts w:ascii="Arial" w:hAnsi="Arial" w:cs="Arial"/>
-              </w:rPr>
-              <w:t>That’s</w:t>
-            </w:r>
-            <w:r>
-              <w:rPr>
-                <w:rFonts w:ascii="Arial" w:hAnsi="Arial" w:cs="Arial"/>
-              </w:rPr>
-              <w:t xml:space="preserve"> an annual national cost of €1.29 billion. </w:t>
-            </w:r>
-            <w:r>
-              <w:rPr>
-                <w:rFonts w:ascii="Arial" w:hAnsi="Arial" w:cs="Arial"/>
-              </w:rPr>
-              <w:fldChar w:fldCharType="begin"/>
-            </w:r>
-            <w:r>
-              <w:rPr>
-                <w:rFonts w:ascii="Arial" w:hAnsi="Arial" w:cs="Arial"/>
-              </w:rPr>
-              <w:instrText xml:space="preserve"> ADDIN ZOTERO_ITEM CSL_CITATION {"citationID":"m4O6c7QB","properties":{"formattedCitation":"(Agency 2026)","plainCitation":"(Agency 2026)","noteIndex":0},"citationItems":[{"id":46,"uris":["http://zotero.org/users/local/ALZH0Phn/items/EUSXIBAN"],"itemData":{"id":46,"type":"webpage","language":"en","title":"Food Waste Statistics for Ireland","URL":"https://www.epa.ie/our-services/monitoring--assessment/waste/national-waste-statistics/food/","author":[{"family":"Agency","given":"Environmental Protection"}],"accessed":{"date-parts":[["2026",10,2]]}}}],"schema":"https://github.com/citation-style-language/schema/raw/master/csl-citation.json"} </w:instrText>
-            </w:r>
-            <w:r>
-              <w:rPr>
-                <w:rFonts w:ascii="Arial" w:hAnsi="Arial" w:cs="Arial"/>
-              </w:rPr>
-              <w:fldChar w:fldCharType="separate"/>
-            </w:r>
-            <w:r>
-              <w:rPr>
-                <w:rFonts w:ascii="Arial" w:hAnsi="Arial" w:cs="Arial"/>
-              </w:rPr>
-              <w:t>(Agency 2026)</w:t>
-            </w:r>
-            <w:r>
-              <w:rPr>
-                <w:rFonts w:ascii="Arial" w:hAnsi="Arial" w:cs="Arial"/>
-              </w:rPr>
-              <w:fldChar w:fldCharType="end"/>
-            </w:r>
-            <w:r>
-              <w:rPr>
-                <w:rFonts w:ascii="Arial" w:hAnsi="Arial" w:cs="Arial"/>
-              </w:rPr>
-              <w:t xml:space="preserve">. </w:t>
-            </w:r>
             <w:r>
               <w:rPr>
                 <w:rFonts w:ascii="Arial" w:hAnsi="Arial" w:cs="Arial"/>
               </w:rPr>
               <w:t>Food waste prevention is therefore an important approach to reducing the environmental and economic impacts associated with household food waste.</w:t>
             </w:r>
-          </w:p>
-          <w:p>
-            <w:pPr>
-              <w:spacing w:line="360" w:lineRule="atLeast"/>
-              <w:rPr>
-                <w:rFonts w:ascii="Arial" w:hAnsi="Arial" w:cs="Arial"/>
-              </w:rPr>
-            </w:pPr>
-          </w:p>
-          <w:p>
-            <w:pPr>
-              <w:spacing w:line="360" w:lineRule="atLeast"/>
-              <w:rPr>
-                <w:rFonts w:ascii="Arial" w:hAnsi="Arial" w:cs="Arial"/>
-              </w:rPr>
-            </w:pPr>
-          </w:p>
-          <w:p>
-            <w:pPr>
-              <w:spacing w:line="360" w:lineRule="atLeast"/>
-              <w:rPr>
-                <w:rFonts w:ascii="Arial" w:hAnsi="Arial" w:cs="Arial"/>
-              </w:rPr>
-            </w:pPr>
-          </w:p>
-          <w:p>
-            <w:pPr>
-              <w:spacing w:line="360" w:lineRule="atLeast"/>
-              <w:rPr>
-                <w:rFonts w:ascii="Arial" w:hAnsi="Arial" w:cs="Arial"/>
-              </w:rPr>
-            </w:pPr>
-          </w:p>
-          <w:p>
-            <w:pPr>
-              <w:spacing w:line="360" w:lineRule="atLeast"/>
-              <w:rPr>
-                <w:rFonts w:ascii="Arial" w:hAnsi="Arial" w:cs="Arial"/>
-              </w:rPr>
-            </w:pPr>
-          </w:p>
-          <w:p>
-            <w:pPr>
-              <w:spacing w:line="360" w:lineRule="atLeast"/>
-              <w:rPr>
-                <w:rFonts w:ascii="Arial" w:hAnsi="Arial" w:cs="Arial"/>
-              </w:rPr>
-            </w:pPr>
-          </w:p>
-          <w:p>
-            <w:pPr>
-              <w:spacing w:line="360" w:lineRule="atLeast"/>
-              <w:rPr>
-                <w:rFonts w:ascii="Arial" w:hAnsi="Arial" w:cs="Arial"/>
-              </w:rPr>
-            </w:pPr>
-          </w:p>
-          <w:p>
-            <w:pPr>
-              <w:spacing w:line="360" w:lineRule="atLeast"/>
-              <w:rPr>
-                <w:rFonts w:ascii="Arial" w:hAnsi="Arial" w:cs="Arial"/>
-              </w:rPr>
-            </w:pPr>
-          </w:p>
-          <w:p>
-            <w:pPr>
-              <w:spacing w:line="360" w:lineRule="atLeast"/>
-              <w:rPr>
-                <w:rFonts w:ascii="Arial" w:hAnsi="Arial" w:cs="Arial"/>
-              </w:rPr>
-            </w:pPr>
           </w:p>
           <w:p>
             <w:pPr>
@@ -1663,6 +1485,7 @@
                 <w:bCs/>
                 <w:noProof/>
               </w:rPr>
+              <w:lastRenderedPageBreak/>
               <w:drawing>
                 <wp:inline distT="0" distB="0" distL="0" distR="0" wp14:anchorId="6C1AC99B" wp14:editId="5AB536D1">
                   <wp:extent cx="5706271" cy="2800741"/>
@@ -1801,50 +1624,106 @@
               <w:rPr>
                 <w:rFonts w:ascii="Arial" w:hAnsi="Arial" w:cs="Arial"/>
               </w:rPr>
-              <w:t>The proposed application aims to address these issues by providing users with a digital catalogue of the food and products that are in their household. Users will be able to record the food they have and the relevant information such as expiry dates. This will provide the users with greater visibility of the food already inside there home and help them make more informed decisions when it comes to planning meals and purchasing additional food.</w:t>
-            </w:r>
-          </w:p>
-          <w:p>
-            <w:pPr>
-              <w:spacing w:line="360" w:lineRule="atLeast"/>
-              <w:rPr>
-                <w:rFonts w:ascii="Arial" w:hAnsi="Arial" w:cs="Arial"/>
-              </w:rPr>
-            </w:pPr>
-          </w:p>
-          <w:p>
-            <w:pPr>
-              <w:spacing w:line="360" w:lineRule="atLeast"/>
-              <w:rPr>
-                <w:rFonts w:ascii="Arial" w:hAnsi="Arial" w:cs="Arial"/>
-              </w:rPr>
-            </w:pPr>
-            <w:r>
-              <w:rPr>
-                <w:rFonts w:ascii="Arial" w:hAnsi="Arial" w:cs="Arial"/>
-              </w:rPr>
-              <w:t xml:space="preserve">The application will alert the user with notifications that food are expiring soon and provide the user with a report of the foods expiring as well as suggested recipes. Once food has expired and has not been consumed the user can record the details of the food(s) wasted and those statistics can be viewed in a weekly wastage report. </w:t>
-            </w:r>
-          </w:p>
-        </w:tc>
-      </w:tr>
-      <w:tr>
-        <w:trPr>
-          <w:trHeight w:val="11132"/>
-        </w:trPr>
-        <w:tc>
-          <w:tcPr>
-            <w:tcW w:w="9377" w:type="dxa"/>
-          </w:tcPr>
-          <w:p>
-            <w:pPr>
-              <w:spacing w:line="360" w:lineRule="atLeast"/>
-              <w:rPr>
-                <w:rFonts w:ascii="Arial" w:hAnsi="Arial" w:cs="Arial"/>
-                <w:i/>
-                <w:iCs/>
-                <w:sz w:val="24"/>
-                <w:szCs w:val="24"/>
+              <w:t xml:space="preserve">The proposed application aims to address these issues by providing users with a digital catalogue of the food and products that are in their household. Users will be able to record the food they have and the relevant information such as expiry dates. This will provide the users with greater visibility of the food already inside </w:t>
+            </w:r>
+            <w:r>
+              <w:rPr>
+                <w:rFonts w:ascii="Arial" w:hAnsi="Arial" w:cs="Arial"/>
+              </w:rPr>
+              <w:t>their</w:t>
+            </w:r>
+            <w:r>
+              <w:rPr>
+                <w:rFonts w:ascii="Arial" w:hAnsi="Arial" w:cs="Arial"/>
+              </w:rPr>
+              <w:t xml:space="preserve"> home and help them make more informed decisions when it comes to planning meals and purchasing additional food.</w:t>
+            </w:r>
+          </w:p>
+          <w:p>
+            <w:pPr>
+              <w:spacing w:line="360" w:lineRule="atLeast"/>
+              <w:rPr>
+                <w:rFonts w:ascii="Arial" w:hAnsi="Arial" w:cs="Arial"/>
+              </w:rPr>
+            </w:pPr>
+          </w:p>
+          <w:p>
+            <w:pPr>
+              <w:spacing w:line="360" w:lineRule="atLeast"/>
+              <w:rPr>
+                <w:rFonts w:ascii="Arial" w:hAnsi="Arial" w:cs="Arial"/>
+              </w:rPr>
+            </w:pPr>
+            <w:r>
+              <w:rPr>
+                <w:rFonts w:ascii="Arial" w:hAnsi="Arial" w:cs="Arial"/>
+              </w:rPr>
+              <w:t xml:space="preserve">The application will alert the user with notifications that food </w:t>
+            </w:r>
+            <w:r>
+              <w:rPr>
+                <w:rFonts w:ascii="Arial" w:hAnsi="Arial" w:cs="Arial"/>
+              </w:rPr>
+              <w:t>is</w:t>
+            </w:r>
+            <w:r>
+              <w:rPr>
+                <w:rFonts w:ascii="Arial" w:hAnsi="Arial" w:cs="Arial"/>
+              </w:rPr>
+              <w:t xml:space="preserve"> expiring soon and provide the user with a report of the foods expiring as well as suggested recipes. Once food has expired and has not been consumed the user can record the details of the food(s) wasted and those statistics can be viewed in a weekly wastage report. </w:t>
+            </w:r>
+          </w:p>
+          <w:p>
+            <w:pPr>
+              <w:spacing w:line="360" w:lineRule="atLeast"/>
+              <w:rPr>
+                <w:rFonts w:ascii="Arial" w:hAnsi="Arial" w:cs="Arial"/>
+              </w:rPr>
+            </w:pPr>
+          </w:p>
+          <w:p>
+            <w:pPr>
+              <w:spacing w:line="360" w:lineRule="atLeast"/>
+              <w:rPr>
+                <w:rFonts w:ascii="Arial" w:hAnsi="Arial" w:cs="Arial"/>
+              </w:rPr>
+            </w:pPr>
+            <w:r>
+              <w:rPr>
+                <w:rFonts w:ascii="Arial" w:hAnsi="Arial" w:cs="Arial"/>
+              </w:rPr>
+              <w:t xml:space="preserve">The overall aim for the project is to create a working application that if used correctly will help reduce household food wastage by improving the uses visibility of what is in their kitchen and help them plan for future food purchases and meals. </w:t>
+            </w:r>
+          </w:p>
+          <w:p>
+            <w:pPr>
+              <w:spacing w:line="360" w:lineRule="atLeast"/>
+              <w:rPr>
+                <w:rFonts w:ascii="Arial" w:hAnsi="Arial" w:cs="Arial"/>
+              </w:rPr>
+            </w:pPr>
+          </w:p>
+          <w:p>
+            <w:pPr>
+              <w:spacing w:line="360" w:lineRule="atLeast"/>
+              <w:rPr>
+                <w:rFonts w:ascii="Arial" w:hAnsi="Arial" w:cs="Arial"/>
+              </w:rPr>
+            </w:pPr>
+          </w:p>
+          <w:p>
+            <w:pPr>
+              <w:spacing w:line="360" w:lineRule="atLeast"/>
+              <w:rPr>
+                <w:rFonts w:ascii="Arial" w:hAnsi="Arial" w:cs="Arial"/>
+              </w:rPr>
+            </w:pPr>
+          </w:p>
+          <w:p>
+            <w:pPr>
+              <w:spacing w:line="360" w:lineRule="atLeast"/>
+              <w:rPr>
+                <w:rFonts w:ascii="Arial" w:hAnsi="Arial" w:cs="Arial"/>
               </w:rPr>
             </w:pPr>
           </w:p>
@@ -1854,25 +1733,14 @@
     <w:p>
       <w:pPr>
         <w:spacing w:line="360" w:lineRule="atLeast"/>
-        <w:ind w:left="720" w:hanging="720"/>
-        <w:rPr>
-          <w:rFonts w:ascii="Arial" w:hAnsi="Arial" w:cs="Arial"/>
-          <w:b/>
-          <w:bCs/>
-          <w:sz w:val="24"/>
-          <w:szCs w:val="24"/>
-        </w:rPr>
-      </w:pPr>
-      <w:r>
-        <w:rPr>
-          <w:rFonts w:ascii="Arial" w:hAnsi="Arial" w:cs="Arial"/>
-          <w:b/>
-          <w:bCs/>
-          <w:sz w:val="24"/>
-          <w:szCs w:val="24"/>
-        </w:rPr>
-        <w:t xml:space="preserve"> </w:t>
-      </w:r>
+        <w:rPr>
+          <w:rFonts w:ascii="Arial" w:hAnsi="Arial" w:cs="Arial"/>
+          <w:b/>
+          <w:bCs/>
+          <w:sz w:val="24"/>
+          <w:szCs w:val="24"/>
+        </w:rPr>
+      </w:pPr>
     </w:p>
     <w:p>
       <w:pPr>
@@ -1946,7 +1814,6 @@
           <w:sz w:val="24"/>
           <w:szCs w:val="24"/>
         </w:rPr>
-        <w:lastRenderedPageBreak/>
         <w:t>3.</w:t>
       </w:r>
       <w:r>
@@ -2054,70 +1921,6 @@
                 <w:szCs w:val="24"/>
               </w:rPr>
             </w:pPr>
-            <w:r>
-              <w:rPr>
-                <w:rFonts w:ascii="Arial" w:hAnsi="Arial" w:cs="Arial"/>
-                <w:i/>
-                <w:iCs/>
-                <w:sz w:val="24"/>
-                <w:szCs w:val="24"/>
-              </w:rPr>
-              <w:t>Clear statement of the overall aim of your project</w:t>
-            </w:r>
-            <w:r>
-              <w:rPr>
-                <w:rFonts w:ascii="Arial" w:hAnsi="Arial" w:cs="Arial"/>
-                <w:i/>
-                <w:iCs/>
-                <w:sz w:val="24"/>
-                <w:szCs w:val="24"/>
-              </w:rPr>
-              <w:t>.</w:t>
-            </w:r>
-          </w:p>
-          <w:p>
-            <w:pPr>
-              <w:spacing w:line="360" w:lineRule="atLeast"/>
-              <w:rPr>
-                <w:rFonts w:ascii="Arial" w:hAnsi="Arial" w:cs="Arial"/>
-                <w:i/>
-                <w:iCs/>
-                <w:sz w:val="24"/>
-                <w:szCs w:val="24"/>
-              </w:rPr>
-            </w:pPr>
-            <w:r>
-              <w:rPr>
-                <w:rFonts w:ascii="Arial" w:hAnsi="Arial" w:cs="Arial"/>
-                <w:i/>
-                <w:iCs/>
-                <w:sz w:val="24"/>
-                <w:szCs w:val="24"/>
-              </w:rPr>
-              <w:t>List of specific, measurable objectives</w:t>
-            </w:r>
-            <w:r>
-              <w:rPr>
-                <w:rFonts w:ascii="Arial" w:hAnsi="Arial" w:cs="Arial"/>
-                <w:i/>
-                <w:iCs/>
-                <w:sz w:val="24"/>
-                <w:szCs w:val="24"/>
-              </w:rPr>
-              <w:t>.</w:t>
-            </w:r>
-          </w:p>
-          <w:p>
-            <w:pPr>
-              <w:spacing w:line="360" w:lineRule="atLeast"/>
-              <w:rPr>
-                <w:rFonts w:ascii="Arial" w:hAnsi="Arial" w:cs="Arial"/>
-                <w:i/>
-                <w:iCs/>
-                <w:sz w:val="24"/>
-                <w:szCs w:val="24"/>
-              </w:rPr>
-            </w:pPr>
           </w:p>
           <w:p>
             <w:pPr>
@@ -2174,6 +1977,14 @@
               </w:rPr>
               <w:t xml:space="preserve"> the topic of household food waste and the psychology of why people waste food to better understand the underlying issues and try to build my application around the possible solutions of those issues</w:t>
             </w:r>
+            <w:r>
+              <w:rPr>
+                <w:rFonts w:ascii="Arial" w:hAnsi="Arial" w:cs="Arial"/>
+                <w:sz w:val="24"/>
+                <w:szCs w:val="24"/>
+              </w:rPr>
+              <w:t>.</w:t>
+            </w:r>
           </w:p>
           <w:p>
             <w:pPr>
@@ -2244,7 +2055,33 @@
                 <w:sz w:val="24"/>
                 <w:szCs w:val="24"/>
               </w:rPr>
-              <w:t>or RoboFlow to build an intelligent computer vision software that can scan using a phone camera label of products and identify the expiry labels.</w:t>
+              <w:t xml:space="preserve">or </w:t>
+            </w:r>
+            <w:proofErr w:type="spellStart"/>
+            <w:r>
+              <w:rPr>
+                <w:rFonts w:ascii="Arial" w:hAnsi="Arial" w:cs="Arial"/>
+                <w:sz w:val="24"/>
+                <w:szCs w:val="24"/>
+              </w:rPr>
+              <w:t>RoboFlow</w:t>
+            </w:r>
+            <w:proofErr w:type="spellEnd"/>
+            <w:r>
+              <w:rPr>
+                <w:rFonts w:ascii="Arial" w:hAnsi="Arial" w:cs="Arial"/>
+                <w:sz w:val="24"/>
+                <w:szCs w:val="24"/>
+              </w:rPr>
+              <w:t xml:space="preserve"> to build an intelligent computer vision software that can </w:t>
+            </w:r>
+            <w:r>
+              <w:rPr>
+                <w:rFonts w:ascii="Arial" w:hAnsi="Arial" w:cs="Arial"/>
+                <w:sz w:val="24"/>
+                <w:szCs w:val="24"/>
+              </w:rPr>
+              <w:t xml:space="preserve">utilize the camera from a smart phone to identify Labels and Expiry Dates on products. </w:t>
             </w:r>
           </w:p>
           <w:p>
@@ -2274,8 +2111,36 @@
                 <w:sz w:val="24"/>
                 <w:szCs w:val="24"/>
               </w:rPr>
-              <w:t xml:space="preserve">To </w:t>
-            </w:r>
+              <w:t>To Research/Learn</w:t>
+            </w:r>
+            <w:r>
+              <w:rPr>
+                <w:rFonts w:ascii="Arial" w:hAnsi="Arial" w:cs="Arial"/>
+                <w:sz w:val="24"/>
+                <w:szCs w:val="24"/>
+              </w:rPr>
+              <w:t xml:space="preserve"> how to create an application that can be used on a mobile device and utilise its built-in functionality’s (Camera, Notifications).</w:t>
+            </w:r>
+          </w:p>
+          <w:p>
+            <w:pPr>
+              <w:spacing w:line="360" w:lineRule="atLeast"/>
+              <w:rPr>
+                <w:rFonts w:ascii="Arial" w:hAnsi="Arial" w:cs="Arial"/>
+                <w:sz w:val="24"/>
+                <w:szCs w:val="24"/>
+              </w:rPr>
+            </w:pPr>
+          </w:p>
+          <w:p>
+            <w:pPr>
+              <w:spacing w:line="360" w:lineRule="atLeast"/>
+              <w:rPr>
+                <w:rFonts w:ascii="Arial" w:hAnsi="Arial" w:cs="Arial"/>
+                <w:sz w:val="24"/>
+                <w:szCs w:val="24"/>
+              </w:rPr>
+            </w:pPr>
             <w:r>
               <w:rPr>
                 <w:rFonts w:ascii="Arial" w:hAnsi="Arial" w:cs="Arial"/>
@@ -2284,31 +2149,23 @@
                 <w:sz w:val="24"/>
                 <w:szCs w:val="24"/>
               </w:rPr>
-              <w:t>Research/Learn</w:t>
-            </w:r>
-            <w:r>
-              <w:rPr>
-                <w:rFonts w:ascii="Arial" w:hAnsi="Arial" w:cs="Arial"/>
-                <w:sz w:val="24"/>
-                <w:szCs w:val="24"/>
-              </w:rPr>
-              <w:t xml:space="preserve"> how to create an application that can be used on a mobile device and utilise its </w:t>
-            </w:r>
-            <w:r>
-              <w:rPr>
-                <w:rFonts w:ascii="Arial" w:hAnsi="Arial" w:cs="Arial"/>
-                <w:sz w:val="24"/>
-                <w:szCs w:val="24"/>
-              </w:rPr>
-              <w:t>built-in</w:t>
-            </w:r>
-            <w:r>
-              <w:rPr>
-                <w:rFonts w:ascii="Arial" w:hAnsi="Arial" w:cs="Arial"/>
-                <w:sz w:val="24"/>
-                <w:szCs w:val="24"/>
-              </w:rPr>
-              <w:t xml:space="preserve"> functionality’s (Camera, Notifications).</w:t>
+              <w:t>To Research</w:t>
+            </w:r>
+            <w:r>
+              <w:rPr>
+                <w:rFonts w:ascii="Arial" w:hAnsi="Arial" w:cs="Arial"/>
+                <w:sz w:val="24"/>
+                <w:szCs w:val="24"/>
+              </w:rPr>
+              <w:t xml:space="preserve"> how to integrate OpenAI into the applications</w:t>
+            </w:r>
+            <w:r>
+              <w:rPr>
+                <w:rFonts w:ascii="Arial" w:hAnsi="Arial" w:cs="Arial"/>
+                <w:sz w:val="24"/>
+                <w:szCs w:val="24"/>
+              </w:rPr>
+              <w:t xml:space="preserve">. Prompting it to create/provide recipes based on the expiring foods. </w:t>
             </w:r>
           </w:p>
           <w:p>
@@ -2348,23 +2205,31 @@
                 <w:sz w:val="24"/>
                 <w:szCs w:val="24"/>
               </w:rPr>
-              <w:t>Research</w:t>
-            </w:r>
-            <w:r>
-              <w:rPr>
-                <w:rFonts w:ascii="Arial" w:hAnsi="Arial" w:cs="Arial"/>
-                <w:sz w:val="24"/>
-                <w:szCs w:val="24"/>
-              </w:rPr>
-              <w:t xml:space="preserve"> how to integrate OpenAI into the applications</w:t>
-            </w:r>
-            <w:r>
-              <w:rPr>
-                <w:rFonts w:ascii="Arial" w:hAnsi="Arial" w:cs="Arial"/>
-                <w:sz w:val="24"/>
-                <w:szCs w:val="24"/>
-              </w:rPr>
-              <w:t xml:space="preserve">. Prompting it to create/provide recipes based on the expiring foods. </w:t>
+              <w:t>Design/Develop</w:t>
+            </w:r>
+            <w:r>
+              <w:rPr>
+                <w:rFonts w:ascii="Arial" w:hAnsi="Arial" w:cs="Arial"/>
+                <w:sz w:val="24"/>
+                <w:szCs w:val="24"/>
+              </w:rPr>
+              <w:t xml:space="preserve"> an interactive UI that can be used on a mobile device. Allowing all the functionality to be provided in a</w:t>
+            </w:r>
+            <w:r>
+              <w:rPr>
+                <w:rFonts w:ascii="Arial" w:hAnsi="Arial" w:cs="Arial"/>
+                <w:sz w:val="24"/>
+                <w:szCs w:val="24"/>
+              </w:rPr>
+              <w:t>n</w:t>
+            </w:r>
+            <w:r>
+              <w:rPr>
+                <w:rFonts w:ascii="Arial" w:hAnsi="Arial" w:cs="Arial"/>
+                <w:sz w:val="24"/>
+                <w:szCs w:val="24"/>
+              </w:rPr>
+              <w:t xml:space="preserve"> aesthetic manner. </w:t>
             </w:r>
           </w:p>
           <w:p>
@@ -2404,23 +2269,7 @@
                 <w:sz w:val="24"/>
                 <w:szCs w:val="24"/>
               </w:rPr>
-              <w:t>Design/Develop</w:t>
-            </w:r>
-            <w:r>
-              <w:rPr>
-                <w:rFonts w:ascii="Arial" w:hAnsi="Arial" w:cs="Arial"/>
-                <w:sz w:val="24"/>
-                <w:szCs w:val="24"/>
-              </w:rPr>
-              <w:t xml:space="preserve"> an interactive UI that can be used on a mobile device</w:t>
-            </w:r>
-            <w:r>
-              <w:rPr>
-                <w:rFonts w:ascii="Arial" w:hAnsi="Arial" w:cs="Arial"/>
-                <w:sz w:val="24"/>
-                <w:szCs w:val="24"/>
-              </w:rPr>
-              <w:t>. Allowing all the functionality to be provided in a aesthetic manner.</w:t>
+              <w:t>Develop</w:t>
             </w:r>
             <w:r>
               <w:rPr>
@@ -2429,6 +2278,72 @@
                 <w:szCs w:val="24"/>
               </w:rPr>
               <w:t xml:space="preserve"> </w:t>
+            </w:r>
+            <w:r>
+              <w:rPr>
+                <w:rFonts w:ascii="Arial" w:hAnsi="Arial" w:cs="Arial"/>
+                <w:sz w:val="24"/>
+                <w:szCs w:val="24"/>
+              </w:rPr>
+              <w:t>a c</w:t>
+            </w:r>
+            <w:r>
+              <w:rPr>
+                <w:rFonts w:ascii="Arial" w:hAnsi="Arial" w:cs="Arial"/>
+                <w:sz w:val="24"/>
+                <w:szCs w:val="24"/>
+              </w:rPr>
+              <w:t>omputer vision application</w:t>
+            </w:r>
+            <w:r>
+              <w:rPr>
+                <w:rFonts w:ascii="Arial" w:hAnsi="Arial" w:cs="Arial"/>
+                <w:sz w:val="24"/>
+                <w:szCs w:val="24"/>
+              </w:rPr>
+              <w:t xml:space="preserve"> using Yolov8 or </w:t>
+            </w:r>
+            <w:proofErr w:type="spellStart"/>
+            <w:r>
+              <w:rPr>
+                <w:rFonts w:ascii="Arial" w:hAnsi="Arial" w:cs="Arial"/>
+                <w:sz w:val="24"/>
+                <w:szCs w:val="24"/>
+              </w:rPr>
+              <w:t>RoboFlow</w:t>
+            </w:r>
+            <w:proofErr w:type="spellEnd"/>
+            <w:r>
+              <w:rPr>
+                <w:rFonts w:ascii="Arial" w:hAnsi="Arial" w:cs="Arial"/>
+                <w:sz w:val="24"/>
+                <w:szCs w:val="24"/>
+              </w:rPr>
+              <w:t xml:space="preserve"> and train i</w:t>
+            </w:r>
+            <w:r>
+              <w:rPr>
+                <w:rFonts w:ascii="Arial" w:hAnsi="Arial" w:cs="Arial"/>
+                <w:sz w:val="24"/>
+                <w:szCs w:val="24"/>
+              </w:rPr>
+              <w:t xml:space="preserve">t to </w:t>
+            </w:r>
+            <w:r>
+              <w:rPr>
+                <w:rFonts w:ascii="Arial" w:hAnsi="Arial" w:cs="Arial"/>
+                <w:sz w:val="24"/>
+                <w:szCs w:val="24"/>
+              </w:rPr>
+              <w:t xml:space="preserve">record </w:t>
+            </w:r>
+            <w:r>
+              <w:rPr>
+                <w:rFonts w:ascii="Arial" w:hAnsi="Arial" w:cs="Arial"/>
+                <w:sz w:val="24"/>
+                <w:szCs w:val="24"/>
+              </w:rPr>
+              <w:t>expiration dates and scan labels for foods to be recorded into the database.</w:t>
             </w:r>
           </w:p>
           <w:p>
@@ -2458,7 +2373,7 @@
                 <w:sz w:val="24"/>
                 <w:szCs w:val="24"/>
               </w:rPr>
-              <w:t xml:space="preserve">To </w:t>
+              <w:t>To Learn/</w:t>
             </w:r>
             <w:r>
               <w:rPr>
@@ -2468,7 +2383,7 @@
                 <w:sz w:val="24"/>
                 <w:szCs w:val="24"/>
               </w:rPr>
-              <w:t>Develop</w:t>
+              <w:t>Integrate</w:t>
             </w:r>
             <w:r>
               <w:rPr>
@@ -2484,55 +2399,31 @@
                 <w:sz w:val="24"/>
                 <w:szCs w:val="24"/>
               </w:rPr>
-              <w:t>a c</w:t>
-            </w:r>
-            <w:r>
-              <w:rPr>
-                <w:rFonts w:ascii="Arial" w:hAnsi="Arial" w:cs="Arial"/>
-                <w:sz w:val="24"/>
-                <w:szCs w:val="24"/>
-              </w:rPr>
-              <w:t>omputer vision application</w:t>
-            </w:r>
-            <w:r>
-              <w:rPr>
-                <w:rFonts w:ascii="Arial" w:hAnsi="Arial" w:cs="Arial"/>
-                <w:sz w:val="24"/>
-                <w:szCs w:val="24"/>
-              </w:rPr>
-              <w:t xml:space="preserve"> using Yolov8 or RoboFlow</w:t>
-            </w:r>
-            <w:r>
-              <w:rPr>
-                <w:rFonts w:ascii="Arial" w:hAnsi="Arial" w:cs="Arial"/>
-                <w:sz w:val="24"/>
-                <w:szCs w:val="24"/>
-              </w:rPr>
-              <w:t xml:space="preserve"> and train i</w:t>
-            </w:r>
-            <w:r>
-              <w:rPr>
-                <w:rFonts w:ascii="Arial" w:hAnsi="Arial" w:cs="Arial"/>
-                <w:sz w:val="24"/>
-                <w:szCs w:val="24"/>
-              </w:rPr>
-              <w:t xml:space="preserve">t to </w:t>
-            </w:r>
-            <w:r>
-              <w:rPr>
-                <w:rFonts w:ascii="Arial" w:hAnsi="Arial" w:cs="Arial"/>
-                <w:sz w:val="24"/>
-                <w:szCs w:val="24"/>
-              </w:rPr>
-              <w:t xml:space="preserve">record </w:t>
-            </w:r>
-            <w:r>
-              <w:rPr>
-                <w:rFonts w:ascii="Arial" w:hAnsi="Arial" w:cs="Arial"/>
-                <w:sz w:val="24"/>
-                <w:szCs w:val="24"/>
-              </w:rPr>
-              <w:t>expiration dates and scan labels for foods to be recorded into the database.</w:t>
+              <w:t>an</w:t>
+            </w:r>
+            <w:r>
+              <w:rPr>
+                <w:rFonts w:ascii="Arial" w:hAnsi="Arial" w:cs="Arial"/>
+                <w:sz w:val="24"/>
+                <w:szCs w:val="24"/>
+              </w:rPr>
+              <w:t xml:space="preserve"> </w:t>
+            </w:r>
+            <w:r>
+              <w:rPr>
+                <w:rFonts w:ascii="Arial" w:hAnsi="Arial" w:cs="Arial"/>
+                <w:sz w:val="24"/>
+                <w:szCs w:val="24"/>
+              </w:rPr>
+              <w:t>OpenAI into the application to create personalised recipes based on the foods</w:t>
+            </w:r>
+            <w:r>
+              <w:rPr>
+                <w:rFonts w:ascii="Arial" w:hAnsi="Arial" w:cs="Arial"/>
+                <w:sz w:val="24"/>
+                <w:szCs w:val="24"/>
+              </w:rPr>
+              <w:t xml:space="preserve"> that are near expiration.</w:t>
             </w:r>
           </w:p>
           <w:p>
@@ -2562,60 +2453,16 @@
                 <w:sz w:val="24"/>
                 <w:szCs w:val="24"/>
               </w:rPr>
-              <w:t>To Learn/</w:t>
-            </w:r>
-            <w:r>
-              <w:rPr>
-                <w:rFonts w:ascii="Arial" w:hAnsi="Arial" w:cs="Arial"/>
-                <w:b/>
-                <w:bCs/>
-                <w:sz w:val="24"/>
-                <w:szCs w:val="24"/>
-              </w:rPr>
-              <w:t>Integrate</w:t>
-            </w:r>
-            <w:r>
-              <w:rPr>
-                <w:rFonts w:ascii="Arial" w:hAnsi="Arial" w:cs="Arial"/>
-                <w:sz w:val="24"/>
-                <w:szCs w:val="24"/>
-              </w:rPr>
-              <w:t xml:space="preserve"> </w:t>
-            </w:r>
-            <w:r>
-              <w:rPr>
-                <w:rFonts w:ascii="Arial" w:hAnsi="Arial" w:cs="Arial"/>
-                <w:sz w:val="24"/>
-                <w:szCs w:val="24"/>
-              </w:rPr>
-              <w:t xml:space="preserve">An </w:t>
-            </w:r>
-            <w:r>
-              <w:rPr>
-                <w:rFonts w:ascii="Arial" w:hAnsi="Arial" w:cs="Arial"/>
-                <w:sz w:val="24"/>
-                <w:szCs w:val="24"/>
-              </w:rPr>
-              <w:t>OpenAI into the application to create personalised recipes based on the foods</w:t>
-            </w:r>
-            <w:r>
-              <w:rPr>
-                <w:rFonts w:ascii="Arial" w:hAnsi="Arial" w:cs="Arial"/>
-                <w:sz w:val="24"/>
-                <w:szCs w:val="24"/>
-              </w:rPr>
-              <w:t xml:space="preserve"> that are near expiration.</w:t>
-            </w:r>
-          </w:p>
-          <w:p>
-            <w:pPr>
-              <w:spacing w:line="360" w:lineRule="atLeast"/>
-              <w:rPr>
-                <w:rFonts w:ascii="Arial" w:hAnsi="Arial" w:cs="Arial"/>
-                <w:sz w:val="24"/>
-                <w:szCs w:val="24"/>
-              </w:rPr>
-            </w:pPr>
+              <w:t>To Test</w:t>
+            </w:r>
+            <w:r>
+              <w:rPr>
+                <w:rFonts w:ascii="Arial" w:hAnsi="Arial" w:cs="Arial"/>
+                <w:sz w:val="24"/>
+                <w:szCs w:val="24"/>
+              </w:rPr>
+              <w:t xml:space="preserve"> the functionality of my application to verify it can complete all the core requirements outlined in this brief and ultimately benefit people.</w:t>
+            </w:r>
           </w:p>
           <w:p>
             <w:pPr>
@@ -2684,62 +2531,6 @@
     <w:p>
       <w:pPr>
         <w:spacing w:line="360" w:lineRule="atLeast"/>
-        <w:ind w:left="720" w:hanging="720"/>
-        <w:rPr>
-          <w:rFonts w:ascii="Arial" w:hAnsi="Arial" w:cs="Arial"/>
-          <w:b/>
-          <w:bCs/>
-        </w:rPr>
-      </w:pPr>
-    </w:p>
-    <w:p>
-      <w:pPr>
-        <w:spacing w:line="360" w:lineRule="atLeast"/>
-        <w:ind w:left="720" w:hanging="720"/>
-        <w:rPr>
-          <w:rFonts w:ascii="Arial" w:hAnsi="Arial" w:cs="Arial"/>
-          <w:b/>
-          <w:bCs/>
-        </w:rPr>
-      </w:pPr>
-    </w:p>
-    <w:p>
-      <w:pPr>
-        <w:spacing w:line="360" w:lineRule="atLeast"/>
-        <w:ind w:left="720" w:hanging="720"/>
-        <w:rPr>
-          <w:rFonts w:ascii="Arial" w:hAnsi="Arial" w:cs="Arial"/>
-          <w:b/>
-          <w:bCs/>
-        </w:rPr>
-      </w:pPr>
-    </w:p>
-    <w:p>
-      <w:pPr>
-        <w:spacing w:line="360" w:lineRule="atLeast"/>
-        <w:ind w:left="720" w:hanging="720"/>
-        <w:rPr>
-          <w:rFonts w:ascii="Arial" w:hAnsi="Arial" w:cs="Arial"/>
-          <w:b/>
-          <w:bCs/>
-        </w:rPr>
-      </w:pPr>
-    </w:p>
-    <w:p>
-      <w:pPr>
-        <w:spacing w:line="360" w:lineRule="atLeast"/>
-        <w:ind w:left="720" w:hanging="720"/>
-        <w:rPr>
-          <w:rFonts w:ascii="Arial" w:hAnsi="Arial" w:cs="Arial"/>
-          <w:b/>
-          <w:bCs/>
-        </w:rPr>
-      </w:pPr>
-    </w:p>
-    <w:p>
-      <w:pPr>
-        <w:spacing w:line="360" w:lineRule="atLeast"/>
-        <w:ind w:left="720" w:hanging="720"/>
         <w:rPr>
           <w:rFonts w:ascii="Arial" w:hAnsi="Arial" w:cs="Arial"/>
           <w:b/>
@@ -4114,7 +3905,29 @@
                 <w:sz w:val="24"/>
                 <w:szCs w:val="24"/>
               </w:rPr>
-              <w:t>n alternative plan if you can not get access to this hardware.</w:t>
+              <w:t xml:space="preserve">n alternative plan if you </w:t>
+            </w:r>
+            <w:proofErr w:type="spellStart"/>
+            <w:r>
+              <w:rPr>
+                <w:rFonts w:ascii="Arial" w:hAnsi="Arial" w:cs="Arial"/>
+                <w:i/>
+                <w:iCs/>
+                <w:sz w:val="24"/>
+                <w:szCs w:val="24"/>
+              </w:rPr>
+              <w:t>can not</w:t>
+            </w:r>
+            <w:proofErr w:type="spellEnd"/>
+            <w:r>
+              <w:rPr>
+                <w:rFonts w:ascii="Arial" w:hAnsi="Arial" w:cs="Arial"/>
+                <w:i/>
+                <w:iCs/>
+                <w:sz w:val="24"/>
+                <w:szCs w:val="24"/>
+              </w:rPr>
+              <w:t xml:space="preserve"> get access to this hardware.</w:t>
             </w:r>
           </w:p>
         </w:tc>
@@ -4399,7 +4212,47 @@
                 <w:szCs w:val="24"/>
                 <w:lang w:eastAsia="en-IE"/>
               </w:rPr>
-              <w:t xml:space="preserve">Haldar, Dibyajyoti, Asma Musfira Shabbirahmed, Reeta Rani Singhania, et al. ‘Understanding the Management of Household Food Waste and Its Engineering for Sustainable Valorization- A State-of-the-Art Review’. </w:t>
+              <w:t xml:space="preserve">Haldar, </w:t>
+            </w:r>
+            <w:proofErr w:type="spellStart"/>
+            <w:r>
+              <w:rPr>
+                <w:rFonts w:ascii="Times New Roman" w:eastAsia="Times New Roman" w:hAnsi="Times New Roman" w:cs="Times New Roman"/>
+                <w:sz w:val="24"/>
+                <w:szCs w:val="24"/>
+                <w:lang w:eastAsia="en-IE"/>
+              </w:rPr>
+              <w:t>Dibyajyoti</w:t>
+            </w:r>
+            <w:proofErr w:type="spellEnd"/>
+            <w:r>
+              <w:rPr>
+                <w:rFonts w:ascii="Times New Roman" w:eastAsia="Times New Roman" w:hAnsi="Times New Roman" w:cs="Times New Roman"/>
+                <w:sz w:val="24"/>
+                <w:szCs w:val="24"/>
+                <w:lang w:eastAsia="en-IE"/>
+              </w:rPr>
+              <w:t xml:space="preserve">, Asma Musfira Shabbirahmed, Reeta Rani Singhania, et al. ‘Understanding the Management of Household Food Waste and Its Engineering for Sustainable </w:t>
+            </w:r>
+            <w:proofErr w:type="spellStart"/>
+            <w:r>
+              <w:rPr>
+                <w:rFonts w:ascii="Times New Roman" w:eastAsia="Times New Roman" w:hAnsi="Times New Roman" w:cs="Times New Roman"/>
+                <w:sz w:val="24"/>
+                <w:szCs w:val="24"/>
+                <w:lang w:eastAsia="en-IE"/>
+              </w:rPr>
+              <w:t>Valorization</w:t>
+            </w:r>
+            <w:proofErr w:type="spellEnd"/>
+            <w:r>
+              <w:rPr>
+                <w:rFonts w:ascii="Times New Roman" w:eastAsia="Times New Roman" w:hAnsi="Times New Roman" w:cs="Times New Roman"/>
+                <w:sz w:val="24"/>
+                <w:szCs w:val="24"/>
+                <w:lang w:eastAsia="en-IE"/>
+              </w:rPr>
+              <w:t xml:space="preserve">- A State-of-the-Art Review’. </w:t>
             </w:r>
             <w:r>
               <w:rPr>
@@ -4498,7 +4351,27 @@
                 <w:szCs w:val="24"/>
                 <w:lang w:eastAsia="en-IE"/>
               </w:rPr>
-              <w:t xml:space="preserve">hanes, Karin, Karin Dobernig, and Burcu Gözet. ‘Food Waste Matters - A Systematic Review of Household Food Waste Practices and Their Policy Implications’. </w:t>
+              <w:t xml:space="preserve">hanes, Karin, Karin Dobernig, and Burcu </w:t>
+            </w:r>
+            <w:proofErr w:type="spellStart"/>
+            <w:r>
+              <w:rPr>
+                <w:rFonts w:ascii="Times New Roman" w:eastAsia="Times New Roman" w:hAnsi="Times New Roman" w:cs="Times New Roman"/>
+                <w:sz w:val="24"/>
+                <w:szCs w:val="24"/>
+                <w:lang w:eastAsia="en-IE"/>
+              </w:rPr>
+              <w:t>Gözet</w:t>
+            </w:r>
+            <w:proofErr w:type="spellEnd"/>
+            <w:r>
+              <w:rPr>
+                <w:rFonts w:ascii="Times New Roman" w:eastAsia="Times New Roman" w:hAnsi="Times New Roman" w:cs="Times New Roman"/>
+                <w:sz w:val="24"/>
+                <w:szCs w:val="24"/>
+                <w:lang w:eastAsia="en-IE"/>
+              </w:rPr>
+              <w:t xml:space="preserve">. ‘Food Waste Matters - A Systematic Review of Household Food Waste Practices and Their Policy Implications’. </w:t>
             </w:r>
             <w:r>
               <w:rPr>

</xml_diff>

<commit_message>
Doc: Final Year Project Proposal Complete, Project Gantt Chart added - L00183767 - 16/10/2026
</commit_message>
<xml_diff>
--- a/Documents/Final_Year_Project_Proposal_Form.docx
+++ b/Documents/Final_Year_Project_Proposal_Form.docx
@@ -1004,13 +1004,19 @@
               <w:rPr>
                 <w:rFonts w:ascii="Arial" w:hAnsi="Arial" w:cs="Arial"/>
               </w:rPr>
-              <w:t>As the world population grows, worldwide demand for food will rise</w:t>
-            </w:r>
-            <w:r>
-              <w:rPr>
-                <w:rFonts w:ascii="Arial" w:hAnsi="Arial" w:cs="Arial"/>
-              </w:rPr>
-              <w:t xml:space="preserve">, putting strain on the global food supply system. Massive quantities of kitchen and food waste </w:t>
+              <w:t xml:space="preserve">As the world population grows, </w:t>
+            </w:r>
+            <w:r>
+              <w:rPr>
+                <w:rFonts w:ascii="Arial" w:hAnsi="Arial" w:cs="Arial"/>
+              </w:rPr>
+              <w:t>global demand for food will rise, straining</w:t>
+            </w:r>
+            <w:r>
+              <w:rPr>
+                <w:rFonts w:ascii="Arial" w:hAnsi="Arial" w:cs="Arial"/>
+              </w:rPr>
+              <w:t xml:space="preserve"> the global food supply system. Massive quantities of kitchen and food waste </w:t>
             </w:r>
             <w:r>
               <w:rPr>
@@ -1494,7 +1500,7 @@
               <w:rPr>
                 <w:rFonts w:ascii="Arial" w:hAnsi="Arial" w:cs="Arial"/>
               </w:rPr>
-              <w:t>behaviour</w:t>
+              <w:t>behaviours</w:t>
             </w:r>
             <w:r>
               <w:rPr>
@@ -1869,13 +1875,25 @@
               <w:rPr>
                 <w:rFonts w:ascii="Arial" w:hAnsi="Arial" w:cs="Arial"/>
               </w:rPr>
-              <w:t>, the user can record the details of the food(s) wasted,</w:t>
-            </w:r>
-            <w:r>
-              <w:rPr>
-                <w:rFonts w:ascii="Arial" w:hAnsi="Arial" w:cs="Arial"/>
-              </w:rPr>
-              <w:t xml:space="preserve"> and those statistics can be viewed in a weekly wastage report. </w:t>
+              <w:t>, the user can record the details of the food(s) wasted</w:t>
+            </w:r>
+            <w:r>
+              <w:rPr>
+                <w:rFonts w:ascii="Arial" w:hAnsi="Arial" w:cs="Arial"/>
+              </w:rPr>
+              <w:t xml:space="preserve"> and </w:t>
+            </w:r>
+            <w:r>
+              <w:rPr>
+                <w:rFonts w:ascii="Arial" w:hAnsi="Arial" w:cs="Arial"/>
+              </w:rPr>
+              <w:t xml:space="preserve">view those statistics </w:t>
+            </w:r>
+            <w:r>
+              <w:rPr>
+                <w:rFonts w:ascii="Arial" w:hAnsi="Arial" w:cs="Arial"/>
+              </w:rPr>
+              <w:t xml:space="preserve">in a weekly wastage report. </w:t>
             </w:r>
           </w:p>
           <w:p>
@@ -1949,6 +1967,16 @@
         </w:tc>
       </w:tr>
     </w:tbl>
+    <w:p>
+      <w:pPr>
+        <w:spacing w:line="360" w:lineRule="atLeast"/>
+        <w:rPr>
+          <w:rFonts w:ascii="Arial" w:hAnsi="Arial" w:cs="Arial"/>
+          <w:b/>
+          <w:bCs/>
+        </w:rPr>
+      </w:pPr>
+    </w:p>
     <w:p>
       <w:pPr>
         <w:spacing w:line="360" w:lineRule="atLeast"/>
@@ -2151,7 +2179,19 @@
               <w:rPr>
                 <w:rFonts w:ascii="Arial" w:hAnsi="Arial" w:cs="Arial"/>
               </w:rPr>
-              <w:t xml:space="preserve"> household food waste and the psychology behind why people waste food, understand the underlying issues better, and build my application around possible solutions</w:t>
+              <w:t xml:space="preserve"> household food waste and the psychology behind why people waste food, </w:t>
+            </w:r>
+            <w:r>
+              <w:rPr>
+                <w:rFonts w:ascii="Arial" w:hAnsi="Arial" w:cs="Arial"/>
+              </w:rPr>
+              <w:t>better understand the underlying issues</w:t>
+            </w:r>
+            <w:r>
+              <w:rPr>
+                <w:rFonts w:ascii="Arial" w:hAnsi="Arial" w:cs="Arial"/>
+              </w:rPr>
+              <w:t>, and build my application around possible solutions</w:t>
             </w:r>
             <w:r>
               <w:rPr>
@@ -2291,51 +2331,51 @@
                 <w:b/>
                 <w:bCs/>
               </w:rPr>
-              <w:t xml:space="preserve">To </w:t>
-            </w:r>
+              <w:t xml:space="preserve">Research and learn how to create a mobile application that uses built-in device </w:t>
+            </w:r>
+            <w:r>
+              <w:rPr>
+                <w:rFonts w:ascii="Arial" w:hAnsi="Arial" w:cs="Arial"/>
+              </w:rPr>
+              <w:t>functionality</w:t>
+            </w:r>
+            <w:r>
+              <w:rPr>
+                <w:rFonts w:ascii="Arial" w:hAnsi="Arial" w:cs="Arial"/>
+              </w:rPr>
+              <w:t xml:space="preserve"> (Camera, Notifications).</w:t>
+            </w:r>
+          </w:p>
+          <w:p>
+            <w:pPr>
+              <w:spacing w:line="360" w:lineRule="atLeast"/>
+              <w:rPr>
+                <w:rFonts w:ascii="Arial" w:hAnsi="Arial" w:cs="Arial"/>
+              </w:rPr>
+            </w:pPr>
+          </w:p>
+          <w:p>
+            <w:pPr>
+              <w:spacing w:line="360" w:lineRule="atLeast"/>
+              <w:rPr>
+                <w:rFonts w:ascii="Arial" w:hAnsi="Arial" w:cs="Arial"/>
+              </w:rPr>
+            </w:pPr>
             <w:r>
               <w:rPr>
                 <w:rFonts w:ascii="Arial" w:hAnsi="Arial" w:cs="Arial"/>
                 <w:b/>
                 <w:bCs/>
               </w:rPr>
-              <w:t>research and learn</w:t>
-            </w:r>
-            <w:r>
-              <w:rPr>
-                <w:rFonts w:ascii="Arial" w:hAnsi="Arial" w:cs="Arial"/>
-              </w:rPr>
-              <w:t xml:space="preserve"> how to create an application that can be used on a mobile device and utilize its built-in functionality</w:t>
-            </w:r>
-            <w:r>
-              <w:rPr>
-                <w:rFonts w:ascii="Arial" w:hAnsi="Arial" w:cs="Arial"/>
-              </w:rPr>
-              <w:t xml:space="preserve"> (Camera, Notifications).</w:t>
-            </w:r>
-          </w:p>
-          <w:p>
-            <w:pPr>
-              <w:spacing w:line="360" w:lineRule="atLeast"/>
-              <w:rPr>
-                <w:rFonts w:ascii="Arial" w:hAnsi="Arial" w:cs="Arial"/>
-              </w:rPr>
-            </w:pPr>
-          </w:p>
-          <w:p>
-            <w:pPr>
-              <w:spacing w:line="360" w:lineRule="atLeast"/>
-              <w:rPr>
-                <w:rFonts w:ascii="Arial" w:hAnsi="Arial" w:cs="Arial"/>
-              </w:rPr>
-            </w:pPr>
+              <w:t xml:space="preserve">To </w:t>
+            </w:r>
             <w:r>
               <w:rPr>
                 <w:rFonts w:ascii="Arial" w:hAnsi="Arial" w:cs="Arial"/>
                 <w:b/>
                 <w:bCs/>
               </w:rPr>
-              <w:t xml:space="preserve">To </w:t>
+              <w:t>r</w:t>
             </w:r>
             <w:r>
               <w:rPr>
@@ -2343,33 +2383,67 @@
                 <w:b/>
                 <w:bCs/>
               </w:rPr>
-              <w:t>r</w:t>
-            </w:r>
+              <w:t>esearch</w:t>
+            </w:r>
+            <w:r>
+              <w:rPr>
+                <w:rFonts w:ascii="Arial" w:hAnsi="Arial" w:cs="Arial"/>
+              </w:rPr>
+              <w:t xml:space="preserve"> how to integrate OpenAI into the </w:t>
+            </w:r>
+            <w:r>
+              <w:rPr>
+                <w:rFonts w:ascii="Arial" w:hAnsi="Arial" w:cs="Arial"/>
+              </w:rPr>
+              <w:t>application</w:t>
+            </w:r>
+            <w:r>
+              <w:rPr>
+                <w:rFonts w:ascii="Arial" w:hAnsi="Arial" w:cs="Arial"/>
+              </w:rPr>
+              <w:t xml:space="preserve">. Prompting it to create/provide recipes based on the expiring foods. </w:t>
+            </w:r>
+          </w:p>
+          <w:p>
+            <w:pPr>
+              <w:spacing w:line="360" w:lineRule="atLeast"/>
+              <w:rPr>
+                <w:rFonts w:ascii="Arial" w:hAnsi="Arial" w:cs="Arial"/>
+              </w:rPr>
+            </w:pPr>
+          </w:p>
+          <w:p>
+            <w:pPr>
+              <w:spacing w:line="360" w:lineRule="atLeast"/>
+              <w:rPr>
+                <w:rFonts w:ascii="Arial" w:hAnsi="Arial" w:cs="Arial"/>
+              </w:rPr>
+            </w:pPr>
             <w:r>
               <w:rPr>
                 <w:rFonts w:ascii="Arial" w:hAnsi="Arial" w:cs="Arial"/>
                 <w:b/>
                 <w:bCs/>
               </w:rPr>
-              <w:t>esearch</w:t>
-            </w:r>
-            <w:r>
-              <w:rPr>
-                <w:rFonts w:ascii="Arial" w:hAnsi="Arial" w:cs="Arial"/>
-              </w:rPr>
-              <w:t xml:space="preserve"> how to integrate OpenAI into the </w:t>
-            </w:r>
-            <w:r>
-              <w:rPr>
-                <w:rFonts w:ascii="Arial" w:hAnsi="Arial" w:cs="Arial"/>
-              </w:rPr>
-              <w:t>application</w:t>
-            </w:r>
-            <w:r>
-              <w:rPr>
-                <w:rFonts w:ascii="Arial" w:hAnsi="Arial" w:cs="Arial"/>
-              </w:rPr>
-              <w:t xml:space="preserve">. Prompting it to create/provide recipes based on the expiring foods. </w:t>
+              <w:t>To Design/Develop</w:t>
+            </w:r>
+            <w:r>
+              <w:rPr>
+                <w:rFonts w:ascii="Arial" w:hAnsi="Arial" w:cs="Arial"/>
+              </w:rPr>
+              <w:t xml:space="preserve"> an interactive UI. Allowing all the functionality to be provided </w:t>
+            </w:r>
+            <w:r>
+              <w:rPr>
+                <w:rFonts w:ascii="Arial" w:hAnsi="Arial" w:cs="Arial"/>
+              </w:rPr>
+              <w:t>aesthetically</w:t>
+            </w:r>
+            <w:r>
+              <w:rPr>
+                <w:rFonts w:ascii="Arial" w:hAnsi="Arial" w:cs="Arial"/>
+              </w:rPr>
+              <w:t xml:space="preserve">. </w:t>
             </w:r>
           </w:p>
           <w:p>
@@ -2393,162 +2467,132 @@
                 <w:b/>
                 <w:bCs/>
               </w:rPr>
-              <w:t>To Design/Develop</w:t>
-            </w:r>
-            <w:r>
-              <w:rPr>
-                <w:rFonts w:ascii="Arial" w:hAnsi="Arial" w:cs="Arial"/>
-              </w:rPr>
-              <w:t xml:space="preserve"> an interactive UI. Allowing all the functionality to be provided </w:t>
-            </w:r>
-            <w:r>
-              <w:rPr>
-                <w:rFonts w:ascii="Arial" w:hAnsi="Arial" w:cs="Arial"/>
-              </w:rPr>
-              <w:t>aesthetically</w:t>
-            </w:r>
-            <w:r>
-              <w:rPr>
-                <w:rFonts w:ascii="Arial" w:hAnsi="Arial" w:cs="Arial"/>
-              </w:rPr>
-              <w:t xml:space="preserve">. </w:t>
-            </w:r>
-          </w:p>
-          <w:p>
-            <w:pPr>
-              <w:spacing w:line="360" w:lineRule="atLeast"/>
-              <w:rPr>
-                <w:rFonts w:ascii="Arial" w:hAnsi="Arial" w:cs="Arial"/>
-              </w:rPr>
-            </w:pPr>
-          </w:p>
-          <w:p>
-            <w:pPr>
-              <w:spacing w:line="360" w:lineRule="atLeast"/>
-              <w:rPr>
-                <w:rFonts w:ascii="Arial" w:hAnsi="Arial" w:cs="Arial"/>
-              </w:rPr>
-            </w:pPr>
+              <w:t xml:space="preserve">To </w:t>
+            </w:r>
             <w:r>
               <w:rPr>
                 <w:rFonts w:ascii="Arial" w:hAnsi="Arial" w:cs="Arial"/>
                 <w:b/>
                 <w:bCs/>
               </w:rPr>
-              <w:t xml:space="preserve">To </w:t>
-            </w:r>
+              <w:t>develop</w:t>
+            </w:r>
+            <w:r>
+              <w:rPr>
+                <w:rFonts w:ascii="Arial" w:hAnsi="Arial" w:cs="Arial"/>
+              </w:rPr>
+              <w:t xml:space="preserve"> a computer vision application using YOLOv8</w:t>
+            </w:r>
+            <w:r>
+              <w:rPr>
+                <w:rFonts w:ascii="Arial" w:hAnsi="Arial" w:cs="Arial"/>
+              </w:rPr>
+              <w:t>, train it to recognize and record expiration dates,</w:t>
+            </w:r>
+            <w:r>
+              <w:rPr>
+                <w:rFonts w:ascii="Arial" w:hAnsi="Arial" w:cs="Arial"/>
+              </w:rPr>
+              <w:t xml:space="preserve"> and scan food labels for database entry</w:t>
+            </w:r>
+            <w:r>
+              <w:rPr>
+                <w:rFonts w:ascii="Arial" w:hAnsi="Arial" w:cs="Arial"/>
+              </w:rPr>
+              <w:t>.</w:t>
+            </w:r>
+          </w:p>
+          <w:p>
+            <w:pPr>
+              <w:spacing w:line="360" w:lineRule="atLeast"/>
+              <w:rPr>
+                <w:rFonts w:ascii="Arial" w:hAnsi="Arial" w:cs="Arial"/>
+              </w:rPr>
+            </w:pPr>
+          </w:p>
+          <w:p>
+            <w:pPr>
+              <w:spacing w:line="360" w:lineRule="atLeast"/>
+              <w:rPr>
+                <w:rFonts w:ascii="Arial" w:hAnsi="Arial" w:cs="Arial"/>
+              </w:rPr>
+            </w:pPr>
             <w:r>
               <w:rPr>
                 <w:rFonts w:ascii="Arial" w:hAnsi="Arial" w:cs="Arial"/>
                 <w:b/>
                 <w:bCs/>
               </w:rPr>
-              <w:t>develop</w:t>
-            </w:r>
-            <w:r>
-              <w:rPr>
-                <w:rFonts w:ascii="Arial" w:hAnsi="Arial" w:cs="Arial"/>
-              </w:rPr>
-              <w:t xml:space="preserve"> a computer vision application using YOLOv8 and train it to </w:t>
-            </w:r>
-            <w:r>
-              <w:rPr>
-                <w:rFonts w:ascii="Arial" w:hAnsi="Arial" w:cs="Arial"/>
-              </w:rPr>
-              <w:t xml:space="preserve">recognise and record </w:t>
-            </w:r>
-            <w:r>
-              <w:rPr>
-                <w:rFonts w:ascii="Arial" w:hAnsi="Arial" w:cs="Arial"/>
-              </w:rPr>
-              <w:t>expiration dates and scan food labels for database entry</w:t>
-            </w:r>
-            <w:r>
-              <w:rPr>
-                <w:rFonts w:ascii="Arial" w:hAnsi="Arial" w:cs="Arial"/>
-              </w:rPr>
-              <w:t>.</w:t>
-            </w:r>
-          </w:p>
-          <w:p>
-            <w:pPr>
-              <w:spacing w:line="360" w:lineRule="atLeast"/>
-              <w:rPr>
-                <w:rFonts w:ascii="Arial" w:hAnsi="Arial" w:cs="Arial"/>
-              </w:rPr>
-            </w:pPr>
-          </w:p>
-          <w:p>
-            <w:pPr>
-              <w:spacing w:line="360" w:lineRule="atLeast"/>
-              <w:rPr>
-                <w:rFonts w:ascii="Arial" w:hAnsi="Arial" w:cs="Arial"/>
-              </w:rPr>
-            </w:pPr>
+              <w:t xml:space="preserve">To </w:t>
+            </w:r>
             <w:r>
               <w:rPr>
                 <w:rFonts w:ascii="Arial" w:hAnsi="Arial" w:cs="Arial"/>
                 <w:b/>
                 <w:bCs/>
               </w:rPr>
-              <w:t xml:space="preserve">To </w:t>
-            </w:r>
+              <w:t>learn and integrate</w:t>
+            </w:r>
+            <w:r>
+              <w:rPr>
+                <w:rFonts w:ascii="Arial" w:hAnsi="Arial" w:cs="Arial"/>
+              </w:rPr>
+              <w:t xml:space="preserve"> OpenAI into the application to create personalized recipes based on </w:t>
+            </w:r>
+            <w:r>
+              <w:rPr>
+                <w:rFonts w:ascii="Arial" w:hAnsi="Arial" w:cs="Arial"/>
+              </w:rPr>
+              <w:t>foods</w:t>
+            </w:r>
+            <w:r>
+              <w:rPr>
+                <w:rFonts w:ascii="Arial" w:hAnsi="Arial" w:cs="Arial"/>
+              </w:rPr>
+              <w:t xml:space="preserve"> </w:t>
+            </w:r>
+            <w:r>
+              <w:rPr>
+                <w:rFonts w:ascii="Arial" w:hAnsi="Arial" w:cs="Arial"/>
+              </w:rPr>
+              <w:t>nearing</w:t>
+            </w:r>
+            <w:r>
+              <w:rPr>
+                <w:rFonts w:ascii="Arial" w:hAnsi="Arial" w:cs="Arial"/>
+              </w:rPr>
+              <w:t xml:space="preserve"> expiration.</w:t>
+            </w:r>
+          </w:p>
+          <w:p>
+            <w:pPr>
+              <w:spacing w:line="360" w:lineRule="atLeast"/>
+              <w:rPr>
+                <w:rFonts w:ascii="Arial" w:hAnsi="Arial" w:cs="Arial"/>
+              </w:rPr>
+            </w:pPr>
+          </w:p>
+          <w:p>
+            <w:pPr>
+              <w:spacing w:line="360" w:lineRule="atLeast"/>
+              <w:rPr>
+                <w:rFonts w:ascii="Arial" w:hAnsi="Arial" w:cs="Arial"/>
+              </w:rPr>
+            </w:pPr>
             <w:r>
               <w:rPr>
                 <w:rFonts w:ascii="Arial" w:hAnsi="Arial" w:cs="Arial"/>
                 <w:b/>
                 <w:bCs/>
               </w:rPr>
-              <w:t>learn and integrate</w:t>
-            </w:r>
-            <w:r>
-              <w:rPr>
-                <w:rFonts w:ascii="Arial" w:hAnsi="Arial" w:cs="Arial"/>
-              </w:rPr>
-              <w:t xml:space="preserve"> OpenAI into the application to create personalized recipes based on </w:t>
-            </w:r>
-            <w:r>
-              <w:rPr>
-                <w:rFonts w:ascii="Arial" w:hAnsi="Arial" w:cs="Arial"/>
-              </w:rPr>
-              <w:t>foods</w:t>
-            </w:r>
-            <w:r>
-              <w:rPr>
-                <w:rFonts w:ascii="Arial" w:hAnsi="Arial" w:cs="Arial"/>
-              </w:rPr>
-              <w:t xml:space="preserve"> that are near expiration.</w:t>
-            </w:r>
-          </w:p>
-          <w:p>
-            <w:pPr>
-              <w:spacing w:line="360" w:lineRule="atLeast"/>
-              <w:rPr>
-                <w:rFonts w:ascii="Arial" w:hAnsi="Arial" w:cs="Arial"/>
-              </w:rPr>
-            </w:pPr>
-          </w:p>
-          <w:p>
-            <w:pPr>
-              <w:spacing w:line="360" w:lineRule="atLeast"/>
-              <w:rPr>
-                <w:rFonts w:ascii="Arial" w:hAnsi="Arial" w:cs="Arial"/>
-              </w:rPr>
-            </w:pPr>
+              <w:t xml:space="preserve">To </w:t>
+            </w:r>
             <w:r>
               <w:rPr>
                 <w:rFonts w:ascii="Arial" w:hAnsi="Arial" w:cs="Arial"/>
                 <w:b/>
                 <w:bCs/>
               </w:rPr>
-              <w:t xml:space="preserve">To </w:t>
-            </w:r>
-            <w:r>
-              <w:rPr>
-                <w:rFonts w:ascii="Arial" w:hAnsi="Arial" w:cs="Arial"/>
-                <w:b/>
-                <w:bCs/>
-              </w:rPr>
               <w:t>test</w:t>
             </w:r>
             <w:r>
@@ -2561,7 +2605,19 @@
               <w:rPr>
                 <w:rFonts w:ascii="Arial" w:hAnsi="Arial" w:cs="Arial"/>
               </w:rPr>
-              <w:t>accuracy of the computer vision software and determine if it has reached and acceptable level of accuracy</w:t>
+              <w:t xml:space="preserve">accuracy of the computer vision software and determine if it has reached </w:t>
+            </w:r>
+            <w:r>
+              <w:rPr>
+                <w:rFonts w:ascii="Arial" w:hAnsi="Arial" w:cs="Arial"/>
+              </w:rPr>
+              <w:t>an</w:t>
+            </w:r>
+            <w:r>
+              <w:rPr>
+                <w:rFonts w:ascii="Arial" w:hAnsi="Arial" w:cs="Arial"/>
+              </w:rPr>
+              <w:t xml:space="preserve"> acceptable level of accuracy</w:t>
             </w:r>
             <w:r>
               <w:rPr>
@@ -2639,7 +2695,6 @@
     <w:p>
       <w:pPr>
         <w:spacing w:line="360" w:lineRule="atLeast"/>
-        <w:ind w:left="720" w:hanging="720"/>
         <w:rPr>
           <w:rFonts w:ascii="Arial" w:hAnsi="Arial" w:cs="Arial"/>
           <w:b/>
@@ -2657,13 +2712,23 @@
           <w:bCs/>
         </w:rPr>
       </w:pPr>
-      <w:r>
+    </w:p>
+    <w:p>
+      <w:pPr>
+        <w:spacing w:line="360" w:lineRule="atLeast"/>
+        <w:ind w:left="720" w:hanging="720"/>
         <w:rPr>
           <w:rFonts w:ascii="Arial" w:hAnsi="Arial" w:cs="Arial"/>
           <w:b/>
           <w:bCs/>
         </w:rPr>
-        <w:lastRenderedPageBreak/>
+      </w:pPr>
+      <w:r>
+        <w:rPr>
+          <w:rFonts w:ascii="Arial" w:hAnsi="Arial" w:cs="Arial"/>
+          <w:b/>
+          <w:bCs/>
+        </w:rPr>
         <w:t>4</w:t>
       </w:r>
       <w:r>
@@ -3178,7 +3243,21 @@
               <w:rPr>
                 <w:rFonts w:ascii="Arial" w:hAnsi="Arial" w:cs="Arial"/>
               </w:rPr>
-              <w:t xml:space="preserve"> that failing to plan meals or check existing household food supplies before shopping can contribute to unnecessary purchases and food spoilage (Schanes </w:t>
+              <w:t xml:space="preserve"> that failing to plan meals or check existing household food supplies before shopping can contribute to unnecessary purchases and food spoilage (</w:t>
+            </w:r>
+            <w:proofErr w:type="spellStart"/>
+            <w:r>
+              <w:rPr>
+                <w:rFonts w:ascii="Arial" w:hAnsi="Arial" w:cs="Arial"/>
+              </w:rPr>
+              <w:t>Schanes</w:t>
+            </w:r>
+            <w:proofErr w:type="spellEnd"/>
+            <w:r>
+              <w:rPr>
+                <w:rFonts w:ascii="Arial" w:hAnsi="Arial" w:cs="Arial"/>
+              </w:rPr>
+              <w:t xml:space="preserve"> </w:t>
             </w:r>
             <w:r>
               <w:rPr>
@@ -3435,11 +3514,19 @@
               </w:rPr>
               <w:t xml:space="preserve">Pre-consumption is another major area of wasteful behavior. </w:t>
             </w:r>
-            <w:r>
-              <w:rPr>
-                <w:rFonts w:ascii="Arial" w:hAnsi="Arial" w:cs="Arial"/>
-              </w:rPr>
-              <w:t xml:space="preserve">Schanes et al. (2018) also identify date-label confusion and </w:t>
+            <w:proofErr w:type="spellStart"/>
+            <w:r>
+              <w:rPr>
+                <w:rFonts w:ascii="Arial" w:hAnsi="Arial" w:cs="Arial"/>
+              </w:rPr>
+              <w:t>Schanes</w:t>
+            </w:r>
+            <w:proofErr w:type="spellEnd"/>
+            <w:r>
+              <w:rPr>
+                <w:rFonts w:ascii="Arial" w:hAnsi="Arial" w:cs="Arial"/>
+              </w:rPr>
+              <w:t xml:space="preserve"> et al. (2018) also identify date-label confusion and </w:t>
             </w:r>
             <w:r>
               <w:rPr>
@@ -3606,14 +3693,21 @@
                 <w:rFonts w:ascii="Arial" w:hAnsi="Arial" w:cs="Arial"/>
                 <w:lang w:val="en-US"/>
               </w:rPr>
-              <w:t>Because food waste can be influenced by the factors mentioned</w:t>
-            </w:r>
-            <w:r>
-              <w:rPr>
-                <w:rFonts w:ascii="Arial" w:hAnsi="Arial" w:cs="Arial"/>
-                <w:lang w:val="en-US"/>
-              </w:rPr>
-              <w:t xml:space="preserve"> earlier, a single approach may not be equally effective for every user. The proposed application could therefore record discarded food and identify recurring food waste patterns. Based on th</w:t>
+              <w:t xml:space="preserve">Because </w:t>
+            </w:r>
+            <w:r>
+              <w:rPr>
+                <w:rFonts w:ascii="Arial" w:hAnsi="Arial" w:cs="Arial"/>
+                <w:lang w:val="en-US"/>
+              </w:rPr>
+              <w:t>the factors mentioned earlier can influence food waste</w:t>
+            </w:r>
+            <w:r>
+              <w:rPr>
+                <w:rFonts w:ascii="Arial" w:hAnsi="Arial" w:cs="Arial"/>
+                <w:lang w:val="en-US"/>
+              </w:rPr>
+              <w:t>, a single approach may not be equally effective for every user. The proposed application could therefore record discarded food and identify recurring food waste patterns. Based on th</w:t>
             </w:r>
             <w:r>
               <w:rPr>
@@ -3664,7 +3758,21 @@
               <w:rPr>
                 <w:rFonts w:ascii="Arial" w:hAnsi="Arial" w:cs="Arial"/>
               </w:rPr>
-              <w:t xml:space="preserve">Overall, Schanes et al. (2018) </w:t>
+              <w:t xml:space="preserve">Overall, </w:t>
+            </w:r>
+            <w:proofErr w:type="spellStart"/>
+            <w:r>
+              <w:rPr>
+                <w:rFonts w:ascii="Arial" w:hAnsi="Arial" w:cs="Arial"/>
+              </w:rPr>
+              <w:t>Schanes</w:t>
+            </w:r>
+            <w:proofErr w:type="spellEnd"/>
+            <w:r>
+              <w:rPr>
+                <w:rFonts w:ascii="Arial" w:hAnsi="Arial" w:cs="Arial"/>
+              </w:rPr>
+              <w:t xml:space="preserve"> et al. (2018) </w:t>
             </w:r>
             <w:r>
               <w:rPr>
@@ -3682,7 +3790,19 @@
               <w:rPr>
                 <w:rFonts w:ascii="Arial" w:hAnsi="Arial" w:cs="Arial"/>
               </w:rPr>
-              <w:t xml:space="preserve"> causes of household food waste. Their findings suggest that improving food visibility, planning and understanding of date labels could help households manage their supplies more effectively. However, these </w:t>
+              <w:t xml:space="preserve"> causes of household food waste. Their findings suggest that improving food visibility, planning</w:t>
+            </w:r>
+            <w:r>
+              <w:rPr>
+                <w:rFonts w:ascii="Arial" w:hAnsi="Arial" w:cs="Arial"/>
+              </w:rPr>
+              <w:t>,</w:t>
+            </w:r>
+            <w:r>
+              <w:rPr>
+                <w:rFonts w:ascii="Arial" w:hAnsi="Arial" w:cs="Arial"/>
+              </w:rPr>
+              <w:t xml:space="preserve"> and understanding of date labels could help households manage their supplies more effectively. However, these </w:t>
             </w:r>
             <w:r>
               <w:rPr>
@@ -3772,14 +3892,21 @@
                 <w:rFonts w:ascii="Arial" w:hAnsi="Arial" w:cs="Arial"/>
                 <w:lang w:val="en-US"/>
               </w:rPr>
-              <w:t>Many technological applications are currently</w:t>
-            </w:r>
-            <w:r>
-              <w:rPr>
-                <w:rFonts w:ascii="Arial" w:hAnsi="Arial" w:cs="Arial"/>
-                <w:lang w:val="en-US"/>
-              </w:rPr>
-              <w:t xml:space="preserve"> used to reduce food waste. The article by </w:t>
+              <w:t xml:space="preserve">Many technological applications </w:t>
+            </w:r>
+            <w:r>
+              <w:rPr>
+                <w:rFonts w:ascii="Arial" w:hAnsi="Arial" w:cs="Arial"/>
+                <w:lang w:val="en-US"/>
+              </w:rPr>
+              <w:t xml:space="preserve">currently </w:t>
+            </w:r>
+            <w:r>
+              <w:rPr>
+                <w:rFonts w:ascii="Arial" w:hAnsi="Arial" w:cs="Arial"/>
+                <w:lang w:val="en-US"/>
+              </w:rPr>
+              <w:t xml:space="preserve">reduce food waste. The article by </w:t>
             </w:r>
             <w:r>
               <w:rPr>
@@ -4484,7 +4611,21 @@
                 <w:rFonts w:ascii="Arial" w:hAnsi="Arial" w:cs="Arial"/>
                 <w:lang w:val="en-US"/>
               </w:rPr>
-              <w:t>All these technologies would be expensive to replicate on a grand scale</w:t>
+              <w:t xml:space="preserve">All these technologies would be expensive to replicate </w:t>
+            </w:r>
+            <w:r>
+              <w:rPr>
+                <w:rFonts w:ascii="Arial" w:hAnsi="Arial" w:cs="Arial"/>
+                <w:lang w:val="en-US"/>
+              </w:rPr>
+              <w:t>at</w:t>
+            </w:r>
+            <w:r>
+              <w:rPr>
+                <w:rFonts w:ascii="Arial" w:hAnsi="Arial" w:cs="Arial"/>
+                <w:lang w:val="en-US"/>
+              </w:rPr>
+              <w:t xml:space="preserve"> scale</w:t>
             </w:r>
             <w:r>
               <w:rPr>
@@ -4775,7 +4916,7 @@
                 <w:rFonts w:ascii="Arial" w:hAnsi="Arial" w:cs="Arial"/>
                 <w:lang w:val="en-US"/>
               </w:rPr>
-              <w:t>a potential</w:t>
+              <w:t>potential</w:t>
             </w:r>
             <w:r>
               <w:rPr>
@@ -4874,7 +5015,19 @@
               <w:rPr>
                 <w:rFonts w:ascii="Arial" w:hAnsi="Arial" w:cs="Arial"/>
               </w:rPr>
-              <w:t>food-item detection under difficult conditions because of various augmentation methods, including hue modification, Gaussian blur,</w:t>
+              <w:t xml:space="preserve">food-item detection under difficult conditions </w:t>
+            </w:r>
+            <w:r>
+              <w:rPr>
+                <w:rFonts w:ascii="Arial" w:hAnsi="Arial" w:cs="Arial"/>
+              </w:rPr>
+              <w:t>through augmentation methods</w:t>
+            </w:r>
+            <w:r>
+              <w:rPr>
+                <w:rFonts w:ascii="Arial" w:hAnsi="Arial" w:cs="Arial"/>
+              </w:rPr>
+              <w:t xml:space="preserve"> including hue modification, Gaussian blur,</w:t>
             </w:r>
             <w:r>
               <w:rPr>
@@ -4939,7 +5092,21 @@
               <w:rPr>
                 <w:rFonts w:ascii="Arial" w:hAnsi="Arial" w:cs="Arial"/>
               </w:rPr>
-              <w:t xml:space="preserve"> model achieved an exceptional mean average precision (mAP) of 92.3% </w:t>
+              <w:t xml:space="preserve"> model achieved an exceptional mean average precision (</w:t>
+            </w:r>
+            <w:proofErr w:type="spellStart"/>
+            <w:r>
+              <w:rPr>
+                <w:rFonts w:ascii="Arial" w:hAnsi="Arial" w:cs="Arial"/>
+              </w:rPr>
+              <w:t>mAP</w:t>
+            </w:r>
+            <w:proofErr w:type="spellEnd"/>
+            <w:r>
+              <w:rPr>
+                <w:rFonts w:ascii="Arial" w:hAnsi="Arial" w:cs="Arial"/>
+              </w:rPr>
+              <w:t xml:space="preserve">) of 92.3% </w:t>
             </w:r>
             <w:r>
               <w:rPr>
@@ -5185,7 +5352,39 @@
                 <w:rFonts w:ascii="Arial" w:hAnsi="Arial" w:cs="Arial"/>
                 <w:lang w:val="en-US"/>
               </w:rPr>
-              <w:t>A similar application that I evaluated for the project was an app called NoWaste. NoWaste is an existing food inventory</w:t>
+              <w:t xml:space="preserve">A similar application that I evaluated for the project was an app called </w:t>
+            </w:r>
+            <w:proofErr w:type="spellStart"/>
+            <w:r>
+              <w:rPr>
+                <w:rFonts w:ascii="Arial" w:hAnsi="Arial" w:cs="Arial"/>
+                <w:lang w:val="en-US"/>
+              </w:rPr>
+              <w:t>NoWaste</w:t>
+            </w:r>
+            <w:proofErr w:type="spellEnd"/>
+            <w:r>
+              <w:rPr>
+                <w:rFonts w:ascii="Arial" w:hAnsi="Arial" w:cs="Arial"/>
+                <w:lang w:val="en-US"/>
+              </w:rPr>
+              <w:t xml:space="preserve">. </w:t>
+            </w:r>
+            <w:proofErr w:type="spellStart"/>
+            <w:r>
+              <w:rPr>
+                <w:rFonts w:ascii="Arial" w:hAnsi="Arial" w:cs="Arial"/>
+                <w:lang w:val="en-US"/>
+              </w:rPr>
+              <w:t>NoWaste</w:t>
+            </w:r>
+            <w:proofErr w:type="spellEnd"/>
+            <w:r>
+              <w:rPr>
+                <w:rFonts w:ascii="Arial" w:hAnsi="Arial" w:cs="Arial"/>
+                <w:lang w:val="en-US"/>
+              </w:rPr>
+              <w:t xml:space="preserve"> is an existing food inventory</w:t>
             </w:r>
             <w:r>
               <w:rPr>
@@ -5198,7 +5397,21 @@
               <w:rPr>
                 <w:rFonts w:ascii="Arial" w:eastAsiaTheme="minorEastAsia" w:hAnsi="Arial" w:cs="Arial"/>
               </w:rPr>
-              <w:t>KH Creations ApS.</w:t>
+              <w:t xml:space="preserve">KH Creations </w:t>
+            </w:r>
+            <w:proofErr w:type="spellStart"/>
+            <w:r>
+              <w:rPr>
+                <w:rFonts w:ascii="Arial" w:eastAsiaTheme="minorEastAsia" w:hAnsi="Arial" w:cs="Arial"/>
+              </w:rPr>
+              <w:t>ApS</w:t>
+            </w:r>
+            <w:proofErr w:type="spellEnd"/>
+            <w:r>
+              <w:rPr>
+                <w:rFonts w:ascii="Arial" w:eastAsiaTheme="minorEastAsia" w:hAnsi="Arial" w:cs="Arial"/>
+              </w:rPr>
+              <w:t>.</w:t>
             </w:r>
             <w:r>
               <w:rPr>
@@ -5381,7 +5594,23 @@
                 <w:rFonts w:ascii="Arial" w:hAnsi="Arial" w:cs="Arial"/>
                 <w:lang w:val="en-US"/>
               </w:rPr>
-              <w:t>To evaluate NoWaste personally,</w:t>
+              <w:t xml:space="preserve">To evaluate </w:t>
+            </w:r>
+            <w:proofErr w:type="spellStart"/>
+            <w:r>
+              <w:rPr>
+                <w:rFonts w:ascii="Arial" w:hAnsi="Arial" w:cs="Arial"/>
+                <w:lang w:val="en-US"/>
+              </w:rPr>
+              <w:t>NoWaste</w:t>
+            </w:r>
+            <w:proofErr w:type="spellEnd"/>
+            <w:r>
+              <w:rPr>
+                <w:rFonts w:ascii="Arial" w:hAnsi="Arial" w:cs="Arial"/>
+                <w:lang w:val="en-US"/>
+              </w:rPr>
+              <w:t xml:space="preserve"> personally,</w:t>
             </w:r>
             <w:r>
               <w:rPr>
@@ -5526,7 +5755,6 @@
               <w:spacing w:line="360" w:lineRule="atLeast"/>
               <w:rPr>
                 <w:rFonts w:ascii="Arial" w:hAnsi="Arial" w:cs="Arial"/>
-                <w:lang w:val="en-US"/>
               </w:rPr>
             </w:pPr>
             <w:r>
@@ -5548,14 +5776,21 @@
                 <w:rFonts w:ascii="Arial" w:hAnsi="Arial" w:cs="Arial"/>
                 <w:lang w:val="en-US"/>
               </w:rPr>
-              <w:t>, I took 3 pictures of the product from the front, back, and top</w:t>
-            </w:r>
-            <w:r>
-              <w:rPr>
-                <w:rFonts w:ascii="Arial" w:hAnsi="Arial" w:cs="Arial"/>
-                <w:lang w:val="en-US"/>
-              </w:rPr>
-              <w:t xml:space="preserve">. The expiry date was clearly visible in the top-down image in </w:t>
+              <w:t xml:space="preserve">, I took 3 pictures of the product from </w:t>
+            </w:r>
+            <w:r>
+              <w:rPr>
+                <w:rFonts w:ascii="Arial" w:hAnsi="Arial" w:cs="Arial"/>
+                <w:lang w:val="en-US"/>
+              </w:rPr>
+              <w:t>above</w:t>
+            </w:r>
+            <w:r>
+              <w:rPr>
+                <w:rFonts w:ascii="Arial" w:hAnsi="Arial" w:cs="Arial"/>
+                <w:lang w:val="en-US"/>
+              </w:rPr>
+              <w:t xml:space="preserve">. The expiry date was clearly visible in the image in </w:t>
             </w:r>
             <w:r>
               <w:rPr>
@@ -5625,13 +5860,27 @@
                 <w:rFonts w:ascii="Arial" w:eastAsiaTheme="minorEastAsia" w:hAnsi="Arial" w:cs="Arial"/>
                 <w:lang w:val="en-US"/>
               </w:rPr>
-              <w:t>system added the detected information to a form where the user could validate it, as shown</w:t>
+              <w:t xml:space="preserve">system added the detected information to a form </w:t>
             </w:r>
             <w:r>
               <w:rPr>
                 <w:rFonts w:ascii="Arial" w:eastAsiaTheme="minorEastAsia" w:hAnsi="Arial" w:cs="Arial"/>
                 <w:lang w:val="en-US"/>
               </w:rPr>
+              <w:t>for the user to validate</w:t>
+            </w:r>
+            <w:r>
+              <w:rPr>
+                <w:rFonts w:ascii="Arial" w:eastAsiaTheme="minorEastAsia" w:hAnsi="Arial" w:cs="Arial"/>
+                <w:lang w:val="en-US"/>
+              </w:rPr>
+              <w:t>, as shown</w:t>
+            </w:r>
+            <w:r>
+              <w:rPr>
+                <w:rFonts w:ascii="Arial" w:eastAsiaTheme="minorEastAsia" w:hAnsi="Arial" w:cs="Arial"/>
+                <w:lang w:val="en-US"/>
+              </w:rPr>
               <w:t xml:space="preserve"> </w:t>
             </w:r>
             <w:r>
@@ -5646,76 +5895,534 @@
                 <w:rFonts w:ascii="Arial" w:eastAsiaTheme="minorEastAsia" w:hAnsi="Arial" w:cs="Arial"/>
                 <w:lang w:val="en-US"/>
               </w:rPr>
-              <w:t xml:space="preserve"> The sample I </w:t>
+              <w:t xml:space="preserve"> </w:t>
             </w:r>
             <w:r>
               <w:rPr>
                 <w:rFonts w:ascii="Arial" w:eastAsiaTheme="minorEastAsia" w:hAnsi="Arial" w:cs="Arial"/>
                 <w:lang w:val="en-US"/>
               </w:rPr>
-              <w:t>used for testing</w:t>
+              <w:t>For testing, I used 3 images in good lighting conditions, with the expiry date clearly present and visible in one image</w:t>
             </w:r>
             <w:r>
               <w:rPr>
                 <w:rFonts w:ascii="Arial" w:eastAsiaTheme="minorEastAsia" w:hAnsi="Arial" w:cs="Arial"/>
                 <w:lang w:val="en-US"/>
               </w:rPr>
-              <w:t xml:space="preserve"> was 3 images in good lighting conditions</w:t>
+              <w:t xml:space="preserve">. I </w:t>
             </w:r>
             <w:r>
               <w:rPr>
                 <w:rFonts w:ascii="Arial" w:eastAsiaTheme="minorEastAsia" w:hAnsi="Arial" w:cs="Arial"/>
                 <w:lang w:val="en-US"/>
               </w:rPr>
-              <w:t>, with the expiry date</w:t>
+              <w:t>provided a small sample to make it easier for the system, but it did not accurately detect the product's expiry date</w:t>
             </w:r>
             <w:r>
               <w:rPr>
                 <w:rFonts w:ascii="Arial" w:eastAsiaTheme="minorEastAsia" w:hAnsi="Arial" w:cs="Arial"/>
                 <w:lang w:val="en-US"/>
               </w:rPr>
-              <w:t xml:space="preserve"> clearly present and visible in one of the images. I </w:t>
+              <w:t>.</w:t>
             </w:r>
             <w:r>
               <w:rPr>
                 <w:rFonts w:ascii="Arial" w:eastAsiaTheme="minorEastAsia" w:hAnsi="Arial" w:cs="Arial"/>
                 <w:lang w:val="en-US"/>
               </w:rPr>
-              <w:t>provided a small sample to make it easier for the system, but it did not accurately detect the product's expiry date</w:t>
+              <w:t xml:space="preserve"> My findings </w:t>
             </w:r>
             <w:r>
               <w:rPr>
                 <w:rFonts w:ascii="Arial" w:eastAsiaTheme="minorEastAsia" w:hAnsi="Arial" w:cs="Arial"/>
                 <w:lang w:val="en-US"/>
               </w:rPr>
-              <w:t>.</w:t>
+              <w:t>align with user concerns about expiry date recognition and accuracy, but further testing is needed</w:t>
             </w:r>
             <w:r>
               <w:rPr>
                 <w:rFonts w:ascii="Arial" w:eastAsiaTheme="minorEastAsia" w:hAnsi="Arial" w:cs="Arial"/>
                 <w:lang w:val="en-US"/>
               </w:rPr>
-              <w:t xml:space="preserve"> My findings </w:t>
-            </w:r>
-            <w:r>
-              <w:rPr>
-                <w:rFonts w:ascii="Arial" w:eastAsiaTheme="minorEastAsia" w:hAnsi="Arial" w:cs="Arial"/>
-                <w:lang w:val="en-US"/>
-              </w:rPr>
-              <w:t>align with user concerns about expiry date recognition and accuracy, but further testing is needed</w:t>
-            </w:r>
-            <w:r>
-              <w:rPr>
-                <w:rFonts w:ascii="Arial" w:eastAsiaTheme="minorEastAsia" w:hAnsi="Arial" w:cs="Arial"/>
-                <w:lang w:val="en-US"/>
-              </w:rPr>
               <w:t xml:space="preserve"> to determine its </w:t>
             </w:r>
             <w:r>
               <w:rPr>
                 <w:rFonts w:ascii="Arial" w:hAnsi="Arial" w:cs="Arial"/>
               </w:rPr>
-              <w:t>mean average precision (mAP) percentage.</w:t>
+              <w:t>mean average precision (</w:t>
+            </w:r>
+            <w:proofErr w:type="spellStart"/>
+            <w:r>
+              <w:rPr>
+                <w:rFonts w:ascii="Arial" w:hAnsi="Arial" w:cs="Arial"/>
+              </w:rPr>
+              <w:t>mAP</w:t>
+            </w:r>
+            <w:proofErr w:type="spellEnd"/>
+            <w:r>
+              <w:rPr>
+                <w:rFonts w:ascii="Arial" w:hAnsi="Arial" w:cs="Arial"/>
+              </w:rPr>
+              <w:t>) percentage.</w:t>
+            </w:r>
+          </w:p>
+          <w:p>
+            <w:pPr>
+              <w:spacing w:line="360" w:lineRule="atLeast"/>
+              <w:rPr>
+                <w:rFonts w:ascii="Arial" w:hAnsi="Arial" w:cs="Arial"/>
+              </w:rPr>
+            </w:pPr>
+          </w:p>
+          <w:p>
+            <w:pPr>
+              <w:spacing w:line="360" w:lineRule="atLeast"/>
+              <w:rPr>
+                <w:rFonts w:ascii="Arial" w:hAnsi="Arial" w:cs="Arial"/>
+                <w:lang w:val="en-US"/>
+              </w:rPr>
+            </w:pPr>
+          </w:p>
+          <w:p>
+            <w:pPr>
+              <w:spacing w:line="360" w:lineRule="atLeast"/>
+              <w:jc w:val="center"/>
+              <w:rPr>
+                <w:rFonts w:ascii="Arial" w:hAnsi="Arial" w:cs="Arial"/>
+                <w:lang w:val="en-US"/>
+              </w:rPr>
+            </w:pPr>
+            <w:r>
+              <w:rPr>
+                <w:rFonts w:ascii="Arial" w:hAnsi="Arial" w:cs="Arial"/>
+                <w:noProof/>
+                <w:lang w:val="en-US"/>
+              </w:rPr>
+              <w:drawing>
+                <wp:inline distT="0" distB="0" distL="0" distR="0" wp14:anchorId="50A0BC17" wp14:editId="7894BF3B">
+                  <wp:extent cx="4640467" cy="3480222"/>
+                  <wp:effectExtent l="8573" t="0" r="0" b="0"/>
+                  <wp:docPr id="842620856" name="Picture 7"/>
+                  <wp:cNvGraphicFramePr>
+                    <a:graphicFrameLocks xmlns:a="http://schemas.openxmlformats.org/drawingml/2006/main" noChangeAspect="1"/>
+                  </wp:cNvGraphicFramePr>
+                  <a:graphic xmlns:a="http://schemas.openxmlformats.org/drawingml/2006/main">
+                    <a:graphicData uri="http://schemas.openxmlformats.org/drawingml/2006/picture">
+                      <pic:pic xmlns:pic="http://schemas.openxmlformats.org/drawingml/2006/picture">
+                        <pic:nvPicPr>
+                          <pic:cNvPr id="0" name="Picture 29"/>
+                          <pic:cNvPicPr>
+                            <a:picLocks noChangeAspect="1" noChangeArrowheads="1"/>
+                          </pic:cNvPicPr>
+                        </pic:nvPicPr>
+                        <pic:blipFill>
+                          <a:blip r:embed="rId10" cstate="print">
+                            <a:extLst>
+                              <a:ext uri="{28A0092B-C50C-407E-A947-70E740481C1C}">
+                                <a14:useLocalDpi xmlns:a14="http://schemas.microsoft.com/office/drawing/2010/main" val="0"/>
+                              </a:ext>
+                            </a:extLst>
+                          </a:blip>
+                          <a:srcRect/>
+                          <a:stretch>
+                            <a:fillRect/>
+                          </a:stretch>
+                        </pic:blipFill>
+                        <pic:spPr bwMode="auto">
+                          <a:xfrm rot="5400000">
+                            <a:off x="0" y="0"/>
+                            <a:ext cx="4650115" cy="3487458"/>
+                          </a:xfrm>
+                          <a:prstGeom prst="rect">
+                            <a:avLst/>
+                          </a:prstGeom>
+                          <a:noFill/>
+                          <a:ln>
+                            <a:noFill/>
+                          </a:ln>
+                        </pic:spPr>
+                      </pic:pic>
+                    </a:graphicData>
+                  </a:graphic>
+                </wp:inline>
+              </w:drawing>
+            </w:r>
+          </w:p>
+          <w:p>
+            <w:pPr>
+              <w:spacing w:line="360" w:lineRule="atLeast"/>
+              <w:jc w:val="center"/>
+              <w:rPr>
+                <w:rFonts w:ascii="Arial" w:hAnsi="Arial" w:cs="Arial"/>
+                <w:lang w:val="en-US"/>
+              </w:rPr>
+            </w:pPr>
+            <w:r>
+              <w:rPr>
+                <w:rFonts w:ascii="Arial" w:hAnsi="Arial" w:cs="Arial"/>
+                <w:lang w:val="en-US"/>
+              </w:rPr>
+              <w:t>Figure 2: Product used during test</w:t>
+            </w:r>
+          </w:p>
+          <w:p>
+            <w:pPr>
+              <w:spacing w:line="360" w:lineRule="atLeast"/>
+              <w:jc w:val="center"/>
+              <w:rPr>
+                <w:rFonts w:ascii="Arial" w:hAnsi="Arial" w:cs="Arial"/>
+                <w:lang w:val="en-US"/>
+              </w:rPr>
+            </w:pPr>
+            <w:r>
+              <w:rPr>
+                <w:rFonts w:ascii="Arial" w:hAnsi="Arial" w:cs="Arial"/>
+                <w:lang w:val="en-US"/>
+              </w:rPr>
+              <w:t>Notes: Expiry date clearly visible in the bottom right corner</w:t>
+            </w:r>
+          </w:p>
+          <w:p>
+            <w:pPr>
+              <w:spacing w:line="360" w:lineRule="atLeast"/>
+              <w:rPr>
+                <w:rFonts w:ascii="Arial" w:hAnsi="Arial" w:cs="Arial"/>
+                <w:lang w:val="en-US"/>
+              </w:rPr>
+            </w:pPr>
+          </w:p>
+          <w:p>
+            <w:pPr>
+              <w:spacing w:line="360" w:lineRule="atLeast"/>
+              <w:rPr>
+                <w:rFonts w:ascii="Arial" w:hAnsi="Arial" w:cs="Arial"/>
+                <w:lang w:val="en-US"/>
+              </w:rPr>
+            </w:pPr>
+          </w:p>
+          <w:p>
+            <w:pPr>
+              <w:spacing w:line="360" w:lineRule="atLeast"/>
+              <w:rPr>
+                <w:rFonts w:ascii="Arial" w:hAnsi="Arial" w:cs="Arial"/>
+                <w:lang w:val="en-US"/>
+              </w:rPr>
+            </w:pPr>
+          </w:p>
+          <w:p>
+            <w:pPr>
+              <w:spacing w:line="360" w:lineRule="atLeast"/>
+              <w:rPr>
+                <w:rFonts w:ascii="Arial" w:hAnsi="Arial" w:cs="Arial"/>
+                <w:lang w:val="en-US"/>
+              </w:rPr>
+            </w:pPr>
+          </w:p>
+          <w:p>
+            <w:pPr>
+              <w:spacing w:line="360" w:lineRule="atLeast"/>
+              <w:rPr>
+                <w:rFonts w:ascii="Arial" w:hAnsi="Arial" w:cs="Arial"/>
+                <w:lang w:val="en-US"/>
+              </w:rPr>
+            </w:pPr>
+          </w:p>
+          <w:p>
+            <w:pPr>
+              <w:spacing w:line="360" w:lineRule="atLeast"/>
+              <w:rPr>
+                <w:rFonts w:ascii="Arial" w:hAnsi="Arial" w:cs="Arial"/>
+                <w:lang w:val="en-US"/>
+              </w:rPr>
+            </w:pPr>
+          </w:p>
+          <w:p>
+            <w:pPr>
+              <w:spacing w:line="360" w:lineRule="atLeast"/>
+              <w:rPr>
+                <w:rFonts w:ascii="Arial" w:hAnsi="Arial" w:cs="Arial"/>
+                <w:lang w:val="en-US"/>
+              </w:rPr>
+            </w:pPr>
+          </w:p>
+          <w:p>
+            <w:pPr>
+              <w:spacing w:line="360" w:lineRule="atLeast"/>
+              <w:rPr>
+                <w:rFonts w:ascii="Arial" w:hAnsi="Arial" w:cs="Arial"/>
+                <w:lang w:val="en-US"/>
+              </w:rPr>
+            </w:pPr>
+          </w:p>
+          <w:p>
+            <w:pPr>
+              <w:spacing w:line="360" w:lineRule="atLeast"/>
+              <w:rPr>
+                <w:rFonts w:ascii="Arial" w:hAnsi="Arial" w:cs="Arial"/>
+                <w:lang w:val="en-US"/>
+              </w:rPr>
+            </w:pPr>
+          </w:p>
+          <w:p>
+            <w:pPr>
+              <w:spacing w:line="360" w:lineRule="atLeast"/>
+              <w:rPr>
+                <w:rFonts w:ascii="Arial" w:hAnsi="Arial" w:cs="Arial"/>
+                <w:lang w:val="en-US"/>
+              </w:rPr>
+            </w:pPr>
+          </w:p>
+          <w:p>
+            <w:pPr>
+              <w:spacing w:line="360" w:lineRule="atLeast"/>
+              <w:rPr>
+                <w:rFonts w:ascii="Arial" w:hAnsi="Arial" w:cs="Arial"/>
+                <w:lang w:val="en-US"/>
+              </w:rPr>
+            </w:pPr>
+          </w:p>
+          <w:p>
+            <w:pPr>
+              <w:spacing w:line="360" w:lineRule="atLeast"/>
+              <w:rPr>
+                <w:rFonts w:ascii="Arial" w:hAnsi="Arial" w:cs="Arial"/>
+                <w:lang w:val="en-US"/>
+              </w:rPr>
+            </w:pPr>
+          </w:p>
+          <w:p>
+            <w:pPr>
+              <w:spacing w:line="360" w:lineRule="atLeast"/>
+              <w:rPr>
+                <w:rFonts w:ascii="Arial" w:hAnsi="Arial" w:cs="Arial"/>
+                <w:lang w:val="en-US"/>
+              </w:rPr>
+            </w:pPr>
+          </w:p>
+          <w:p>
+            <w:pPr>
+              <w:spacing w:line="360" w:lineRule="atLeast"/>
+              <w:rPr>
+                <w:rFonts w:ascii="Arial" w:hAnsi="Arial" w:cs="Arial"/>
+                <w:lang w:val="en-US"/>
+              </w:rPr>
+            </w:pPr>
+          </w:p>
+          <w:p>
+            <w:pPr>
+              <w:spacing w:line="360" w:lineRule="atLeast"/>
+              <w:rPr>
+                <w:rFonts w:ascii="Arial" w:hAnsi="Arial" w:cs="Arial"/>
+                <w:lang w:val="en-US"/>
+              </w:rPr>
+            </w:pPr>
+          </w:p>
+          <w:p>
+            <w:pPr>
+              <w:spacing w:line="360" w:lineRule="atLeast"/>
+              <w:rPr>
+                <w:rFonts w:ascii="Arial" w:hAnsi="Arial" w:cs="Arial"/>
+                <w:lang w:val="en-US"/>
+              </w:rPr>
+            </w:pPr>
+          </w:p>
+          <w:p>
+            <w:pPr>
+              <w:spacing w:line="360" w:lineRule="atLeast"/>
+              <w:rPr>
+                <w:rFonts w:ascii="Arial" w:hAnsi="Arial" w:cs="Arial"/>
+                <w:lang w:val="en-US"/>
+              </w:rPr>
+            </w:pPr>
+          </w:p>
+          <w:p>
+            <w:pPr>
+              <w:spacing w:line="360" w:lineRule="atLeast"/>
+              <w:rPr>
+                <w:rFonts w:ascii="Arial" w:hAnsi="Arial" w:cs="Arial"/>
+                <w:lang w:val="en-US"/>
+              </w:rPr>
+            </w:pPr>
+          </w:p>
+          <w:p>
+            <w:pPr>
+              <w:spacing w:line="360" w:lineRule="atLeast"/>
+              <w:rPr>
+                <w:rFonts w:ascii="Arial" w:hAnsi="Arial" w:cs="Arial"/>
+                <w:lang w:val="en-US"/>
+              </w:rPr>
+            </w:pPr>
+          </w:p>
+          <w:p>
+            <w:pPr>
+              <w:spacing w:line="360" w:lineRule="atLeast"/>
+              <w:rPr>
+                <w:rFonts w:ascii="Arial" w:hAnsi="Arial" w:cs="Arial"/>
+                <w:lang w:val="en-US"/>
+              </w:rPr>
+            </w:pPr>
+          </w:p>
+          <w:p>
+            <w:pPr>
+              <w:spacing w:line="360" w:lineRule="atLeast"/>
+              <w:rPr>
+                <w:rFonts w:ascii="Arial" w:hAnsi="Arial" w:cs="Arial"/>
+                <w:lang w:val="en-US"/>
+              </w:rPr>
+            </w:pPr>
+          </w:p>
+          <w:p>
+            <w:pPr>
+              <w:spacing w:line="360" w:lineRule="atLeast"/>
+              <w:rPr>
+                <w:rFonts w:ascii="Arial" w:hAnsi="Arial" w:cs="Arial"/>
+                <w:lang w:val="en-US"/>
+              </w:rPr>
+            </w:pPr>
+          </w:p>
+          <w:p>
+            <w:pPr>
+              <w:spacing w:line="360" w:lineRule="atLeast"/>
+              <w:rPr>
+                <w:rFonts w:ascii="Arial" w:hAnsi="Arial" w:cs="Arial"/>
+                <w:lang w:val="en-US"/>
+              </w:rPr>
+            </w:pPr>
+          </w:p>
+          <w:p>
+            <w:pPr>
+              <w:spacing w:line="360" w:lineRule="atLeast"/>
+              <w:rPr>
+                <w:rFonts w:ascii="Arial" w:hAnsi="Arial" w:cs="Arial"/>
+                <w:lang w:val="en-US"/>
+              </w:rPr>
+            </w:pPr>
+          </w:p>
+          <w:p>
+            <w:pPr>
+              <w:spacing w:line="360" w:lineRule="atLeast"/>
+              <w:rPr>
+                <w:rFonts w:ascii="Arial" w:hAnsi="Arial" w:cs="Arial"/>
+                <w:lang w:val="en-US"/>
+              </w:rPr>
+            </w:pPr>
+          </w:p>
+          <w:p>
+            <w:pPr>
+              <w:spacing w:line="360" w:lineRule="atLeast"/>
+              <w:rPr>
+                <w:rFonts w:ascii="Arial" w:hAnsi="Arial" w:cs="Arial"/>
+                <w:lang w:val="en-US"/>
+              </w:rPr>
+            </w:pPr>
+          </w:p>
+          <w:p>
+            <w:pPr>
+              <w:spacing w:line="360" w:lineRule="atLeast"/>
+              <w:rPr>
+                <w:rFonts w:ascii="Arial" w:hAnsi="Arial" w:cs="Arial"/>
+                <w:lang w:val="en-US"/>
+              </w:rPr>
+            </w:pPr>
+          </w:p>
+          <w:p>
+            <w:pPr>
+              <w:spacing w:line="360" w:lineRule="atLeast"/>
+              <w:jc w:val="center"/>
+              <w:rPr>
+                <w:rFonts w:ascii="Arial" w:hAnsi="Arial" w:cs="Arial"/>
+                <w:lang w:val="en-US"/>
+              </w:rPr>
+            </w:pPr>
+            <w:r>
+              <w:rPr>
+                <w:rFonts w:ascii="Arial" w:hAnsi="Arial" w:cs="Arial"/>
+                <w:noProof/>
+                <w:lang w:val="en-US"/>
+              </w:rPr>
+              <w:lastRenderedPageBreak/>
+              <w:drawing>
+                <wp:inline distT="0" distB="0" distL="0" distR="0" wp14:anchorId="70C377B7" wp14:editId="48FEF89F">
+                  <wp:extent cx="2332892" cy="5051359"/>
+                  <wp:effectExtent l="0" t="0" r="0" b="0"/>
+                  <wp:docPr id="1772680863" name="Picture 5"/>
+                  <wp:cNvGraphicFramePr>
+                    <a:graphicFrameLocks xmlns:a="http://schemas.openxmlformats.org/drawingml/2006/main" noChangeAspect="1"/>
+                  </wp:cNvGraphicFramePr>
+                  <a:graphic xmlns:a="http://schemas.openxmlformats.org/drawingml/2006/main">
+                    <a:graphicData uri="http://schemas.openxmlformats.org/drawingml/2006/picture">
+                      <pic:pic xmlns:pic="http://schemas.openxmlformats.org/drawingml/2006/picture">
+                        <pic:nvPicPr>
+                          <pic:cNvPr id="0" name="Picture 27"/>
+                          <pic:cNvPicPr>
+                            <a:picLocks noChangeAspect="1" noChangeArrowheads="1"/>
+                          </pic:cNvPicPr>
+                        </pic:nvPicPr>
+                        <pic:blipFill>
+                          <a:blip r:embed="rId11" cstate="print">
+                            <a:extLst>
+                              <a:ext uri="{28A0092B-C50C-407E-A947-70E740481C1C}">
+                                <a14:useLocalDpi xmlns:a14="http://schemas.microsoft.com/office/drawing/2010/main" val="0"/>
+                              </a:ext>
+                            </a:extLst>
+                          </a:blip>
+                          <a:srcRect/>
+                          <a:stretch>
+                            <a:fillRect/>
+                          </a:stretch>
+                        </pic:blipFill>
+                        <pic:spPr bwMode="auto">
+                          <a:xfrm>
+                            <a:off x="0" y="0"/>
+                            <a:ext cx="2344113" cy="5075655"/>
+                          </a:xfrm>
+                          <a:prstGeom prst="rect">
+                            <a:avLst/>
+                          </a:prstGeom>
+                          <a:noFill/>
+                          <a:ln>
+                            <a:noFill/>
+                          </a:ln>
+                        </pic:spPr>
+                      </pic:pic>
+                    </a:graphicData>
+                  </a:graphic>
+                </wp:inline>
+              </w:drawing>
+            </w:r>
+          </w:p>
+          <w:p>
+            <w:pPr>
+              <w:spacing w:line="360" w:lineRule="atLeast"/>
+              <w:jc w:val="center"/>
+              <w:rPr>
+                <w:rFonts w:ascii="Arial" w:hAnsi="Arial" w:cs="Arial"/>
+                <w:lang w:val="en-US"/>
+              </w:rPr>
+            </w:pPr>
+            <w:r>
+              <w:rPr>
+                <w:rFonts w:ascii="Arial" w:hAnsi="Arial" w:cs="Arial"/>
+                <w:lang w:val="en-US"/>
+              </w:rPr>
+              <w:t xml:space="preserve">Figure 3: </w:t>
+            </w:r>
+            <w:proofErr w:type="spellStart"/>
+            <w:r>
+              <w:rPr>
+                <w:rFonts w:ascii="Arial" w:hAnsi="Arial" w:cs="Arial"/>
+                <w:lang w:val="en-US"/>
+              </w:rPr>
+              <w:t>NoWaste</w:t>
+            </w:r>
+            <w:proofErr w:type="spellEnd"/>
+            <w:r>
+              <w:rPr>
+                <w:rFonts w:ascii="Arial" w:hAnsi="Arial" w:cs="Arial"/>
+                <w:lang w:val="en-US"/>
+              </w:rPr>
+              <w:t xml:space="preserve"> Product Adding UI</w:t>
             </w:r>
           </w:p>
           <w:p>
@@ -5771,17 +6478,117 @@
                 <w:rFonts w:ascii="Arial" w:hAnsi="Arial" w:cs="Arial"/>
                 <w:lang w:val="en-US"/>
               </w:rPr>
-              <w:t>Overall, the literature I have discussed highlights the potentital of technology to improve household food management, but challenges remain in making food tracking accessible and reliable. My evaluation of NoWaste identified a potential limitation in expiry-date recognition, while research into FridgeSense demonstrates the potential of AI-powered food tracking. My project will investigate whether computer vision can simplify food entry and expiry date recording, alongside expiration reminders, waste statistics and personalized recipe recommandations. These feature aim to help users manage food more effectively and reduce avoidable household waste. The application will be evaluated throught practival testing to access the accuracy of its computer vision features</w:t>
-            </w:r>
-          </w:p>
-          <w:p>
-            <w:pPr>
-              <w:spacing w:line="360" w:lineRule="atLeast"/>
-              <w:rPr>
-                <w:rFonts w:ascii="Arial" w:hAnsi="Arial" w:cs="Arial"/>
-                <w:lang w:val="en-US"/>
-              </w:rPr>
-            </w:pPr>
+              <w:t xml:space="preserve">Overall, the literature I have discussed highlights the </w:t>
+            </w:r>
+            <w:r>
+              <w:rPr>
+                <w:rFonts w:ascii="Arial" w:hAnsi="Arial" w:cs="Arial"/>
+                <w:lang w:val="en-US"/>
+              </w:rPr>
+              <w:t>potential</w:t>
+            </w:r>
+            <w:r>
+              <w:rPr>
+                <w:rFonts w:ascii="Arial" w:hAnsi="Arial" w:cs="Arial"/>
+                <w:lang w:val="en-US"/>
+              </w:rPr>
+              <w:t xml:space="preserve"> of technology to improve household food management, but challenges remain in making food tracking accessible and reliable. My evaluation of </w:t>
+            </w:r>
+            <w:proofErr w:type="spellStart"/>
+            <w:r>
+              <w:rPr>
+                <w:rFonts w:ascii="Arial" w:hAnsi="Arial" w:cs="Arial"/>
+                <w:lang w:val="en-US"/>
+              </w:rPr>
+              <w:t>NoWaste</w:t>
+            </w:r>
+            <w:proofErr w:type="spellEnd"/>
+            <w:r>
+              <w:rPr>
+                <w:rFonts w:ascii="Arial" w:hAnsi="Arial" w:cs="Arial"/>
+                <w:lang w:val="en-US"/>
+              </w:rPr>
+              <w:t xml:space="preserve"> identified a potential limitation in expiry-date recognition, while research into </w:t>
+            </w:r>
+            <w:proofErr w:type="spellStart"/>
+            <w:r>
+              <w:rPr>
+                <w:rFonts w:ascii="Arial" w:hAnsi="Arial" w:cs="Arial"/>
+                <w:lang w:val="en-US"/>
+              </w:rPr>
+              <w:t>FridgeSense</w:t>
+            </w:r>
+            <w:proofErr w:type="spellEnd"/>
+            <w:r>
+              <w:rPr>
+                <w:rFonts w:ascii="Arial" w:hAnsi="Arial" w:cs="Arial"/>
+                <w:lang w:val="en-US"/>
+              </w:rPr>
+              <w:t xml:space="preserve"> demonstrates the potential of AI-powered food tracking. My project will investigate whether computer vision can simplify food entry and expiry date recording, alongside expiration reminders, waste statistics</w:t>
+            </w:r>
+            <w:r>
+              <w:rPr>
+                <w:rFonts w:ascii="Arial" w:hAnsi="Arial" w:cs="Arial"/>
+                <w:lang w:val="en-US"/>
+              </w:rPr>
+              <w:t>, and personalized recipe recommendations</w:t>
+            </w:r>
+            <w:r>
+              <w:rPr>
+                <w:rFonts w:ascii="Arial" w:hAnsi="Arial" w:cs="Arial"/>
+                <w:lang w:val="en-US"/>
+              </w:rPr>
+              <w:t xml:space="preserve">. These </w:t>
+            </w:r>
+            <w:r>
+              <w:rPr>
+                <w:rFonts w:ascii="Arial" w:hAnsi="Arial" w:cs="Arial"/>
+                <w:lang w:val="en-US"/>
+              </w:rPr>
+              <w:t>features</w:t>
+            </w:r>
+            <w:r>
+              <w:rPr>
+                <w:rFonts w:ascii="Arial" w:hAnsi="Arial" w:cs="Arial"/>
+                <w:lang w:val="en-US"/>
+              </w:rPr>
+              <w:t xml:space="preserve"> aim to help users manage food more effectively and reduce avoidable household waste. The application will be evaluated </w:t>
+            </w:r>
+            <w:r>
+              <w:rPr>
+                <w:rFonts w:ascii="Arial" w:hAnsi="Arial" w:cs="Arial"/>
+                <w:lang w:val="en-US"/>
+              </w:rPr>
+              <w:t>through practical</w:t>
+            </w:r>
+            <w:r>
+              <w:rPr>
+                <w:rFonts w:ascii="Arial" w:hAnsi="Arial" w:cs="Arial"/>
+                <w:lang w:val="en-US"/>
+              </w:rPr>
+              <w:t xml:space="preserve"> testing to </w:t>
+            </w:r>
+            <w:r>
+              <w:rPr>
+                <w:rFonts w:ascii="Arial" w:hAnsi="Arial" w:cs="Arial"/>
+                <w:lang w:val="en-US"/>
+              </w:rPr>
+              <w:t>assess</w:t>
+            </w:r>
+            <w:r>
+              <w:rPr>
+                <w:rFonts w:ascii="Arial" w:hAnsi="Arial" w:cs="Arial"/>
+                <w:lang w:val="en-US"/>
+              </w:rPr>
+              <w:t xml:space="preserve"> the accuracy of its computer vision features</w:t>
+            </w:r>
+            <w:r>
+              <w:rPr>
+                <w:rFonts w:ascii="Arial" w:hAnsi="Arial" w:cs="Arial"/>
+                <w:lang w:val="en-US"/>
+              </w:rPr>
+              <w:t>.</w:t>
+            </w:r>
           </w:p>
         </w:tc>
       </w:tr>
@@ -5789,197 +6596,19 @@
     <w:p>
       <w:pPr>
         <w:spacing w:line="360" w:lineRule="atLeast"/>
-        <w:ind w:left="720" w:hanging="720"/>
-        <w:rPr>
-          <w:rFonts w:ascii="Arial" w:hAnsi="Arial" w:cs="Arial"/>
-        </w:rPr>
-      </w:pPr>
-    </w:p>
-    <w:p>
-      <w:pPr>
-        <w:spacing w:line="360" w:lineRule="atLeast"/>
         <w:rPr>
           <w:rFonts w:ascii="Arial" w:hAnsi="Arial" w:cs="Arial"/>
           <w:b/>
           <w:bCs/>
         </w:rPr>
       </w:pPr>
-    </w:p>
-    <w:p>
-      <w:pPr>
-        <w:spacing w:line="360" w:lineRule="atLeast"/>
+      <w:r>
         <w:rPr>
           <w:rFonts w:ascii="Arial" w:hAnsi="Arial" w:cs="Arial"/>
           <w:b/>
           <w:bCs/>
         </w:rPr>
-      </w:pPr>
-    </w:p>
-    <w:p>
-      <w:pPr>
-        <w:spacing w:line="360" w:lineRule="atLeast"/>
-        <w:rPr>
-          <w:rFonts w:ascii="Arial" w:hAnsi="Arial" w:cs="Arial"/>
-          <w:b/>
-          <w:bCs/>
-        </w:rPr>
-      </w:pPr>
-    </w:p>
-    <w:p>
-      <w:pPr>
-        <w:spacing w:line="360" w:lineRule="atLeast"/>
-        <w:rPr>
-          <w:rFonts w:ascii="Arial" w:hAnsi="Arial" w:cs="Arial"/>
-          <w:b/>
-          <w:bCs/>
-        </w:rPr>
-      </w:pPr>
-    </w:p>
-    <w:p>
-      <w:pPr>
-        <w:spacing w:line="360" w:lineRule="atLeast"/>
-        <w:rPr>
-          <w:rFonts w:ascii="Arial" w:hAnsi="Arial" w:cs="Arial"/>
-          <w:b/>
-          <w:bCs/>
-        </w:rPr>
-      </w:pPr>
-    </w:p>
-    <w:p>
-      <w:pPr>
-        <w:spacing w:line="360" w:lineRule="atLeast"/>
-        <w:rPr>
-          <w:rFonts w:ascii="Arial" w:hAnsi="Arial" w:cs="Arial"/>
-          <w:b/>
-          <w:bCs/>
-        </w:rPr>
-      </w:pPr>
-    </w:p>
-    <w:p>
-      <w:pPr>
-        <w:spacing w:line="360" w:lineRule="atLeast"/>
-        <w:rPr>
-          <w:rFonts w:ascii="Arial" w:hAnsi="Arial" w:cs="Arial"/>
-          <w:b/>
-          <w:bCs/>
-        </w:rPr>
-      </w:pPr>
-    </w:p>
-    <w:p>
-      <w:pPr>
-        <w:spacing w:line="360" w:lineRule="atLeast"/>
-        <w:rPr>
-          <w:rFonts w:ascii="Arial" w:hAnsi="Arial" w:cs="Arial"/>
-          <w:b/>
-          <w:bCs/>
-        </w:rPr>
-      </w:pPr>
-    </w:p>
-    <w:p>
-      <w:pPr>
-        <w:spacing w:line="360" w:lineRule="atLeast"/>
-        <w:rPr>
-          <w:rFonts w:ascii="Arial" w:hAnsi="Arial" w:cs="Arial"/>
-          <w:b/>
-          <w:bCs/>
-        </w:rPr>
-      </w:pPr>
-    </w:p>
-    <w:p>
-      <w:pPr>
-        <w:spacing w:line="360" w:lineRule="atLeast"/>
-        <w:rPr>
-          <w:rFonts w:ascii="Arial" w:hAnsi="Arial" w:cs="Arial"/>
-          <w:b/>
-          <w:bCs/>
-        </w:rPr>
-      </w:pPr>
-    </w:p>
-    <w:p>
-      <w:pPr>
-        <w:spacing w:line="360" w:lineRule="atLeast"/>
-        <w:rPr>
-          <w:rFonts w:ascii="Arial" w:hAnsi="Arial" w:cs="Arial"/>
-          <w:b/>
-          <w:bCs/>
-        </w:rPr>
-      </w:pPr>
-    </w:p>
-    <w:p>
-      <w:pPr>
-        <w:spacing w:line="360" w:lineRule="atLeast"/>
-        <w:rPr>
-          <w:rFonts w:ascii="Arial" w:hAnsi="Arial" w:cs="Arial"/>
-          <w:b/>
-          <w:bCs/>
-        </w:rPr>
-      </w:pPr>
-    </w:p>
-    <w:p>
-      <w:pPr>
-        <w:spacing w:line="360" w:lineRule="atLeast"/>
-        <w:rPr>
-          <w:rFonts w:ascii="Arial" w:hAnsi="Arial" w:cs="Arial"/>
-          <w:b/>
-          <w:bCs/>
-        </w:rPr>
-      </w:pPr>
-    </w:p>
-    <w:p>
-      <w:pPr>
-        <w:spacing w:line="360" w:lineRule="atLeast"/>
-        <w:rPr>
-          <w:rFonts w:ascii="Arial" w:hAnsi="Arial" w:cs="Arial"/>
-          <w:b/>
-          <w:bCs/>
-        </w:rPr>
-      </w:pPr>
-    </w:p>
-    <w:p>
-      <w:pPr>
-        <w:spacing w:line="360" w:lineRule="atLeast"/>
-        <w:rPr>
-          <w:rFonts w:ascii="Arial" w:hAnsi="Arial" w:cs="Arial"/>
-          <w:b/>
-          <w:bCs/>
-        </w:rPr>
-      </w:pPr>
-    </w:p>
-    <w:p>
-      <w:pPr>
-        <w:spacing w:line="360" w:lineRule="atLeast"/>
-        <w:rPr>
-          <w:rFonts w:ascii="Arial" w:hAnsi="Arial" w:cs="Arial"/>
-          <w:b/>
-          <w:bCs/>
-        </w:rPr>
-      </w:pPr>
-    </w:p>
-    <w:p>
-      <w:pPr>
-        <w:spacing w:line="360" w:lineRule="atLeast"/>
-        <w:rPr>
-          <w:rFonts w:ascii="Arial" w:hAnsi="Arial" w:cs="Arial"/>
-          <w:b/>
-          <w:bCs/>
-        </w:rPr>
-      </w:pPr>
-    </w:p>
-    <w:p>
-      <w:pPr>
-        <w:spacing w:line="360" w:lineRule="atLeast"/>
-        <w:rPr>
-          <w:rFonts w:ascii="Arial" w:hAnsi="Arial" w:cs="Arial"/>
-          <w:b/>
-          <w:bCs/>
-        </w:rPr>
-      </w:pPr>
-      <w:r>
-        <w:rPr>
-          <w:rFonts w:ascii="Arial" w:hAnsi="Arial" w:cs="Arial"/>
-          <w:b/>
-          <w:bCs/>
-        </w:rPr>
+        <w:lastRenderedPageBreak/>
         <w:t>5.</w:t>
       </w:r>
       <w:r>
@@ -6052,147 +6681,400 @@
               <w:spacing w:line="360" w:lineRule="atLeast"/>
               <w:rPr>
                 <w:rFonts w:ascii="Arial" w:hAnsi="Arial" w:cs="Arial"/>
-                <w:i/>
-                <w:iCs/>
-              </w:rPr>
-            </w:pPr>
-            <w:r>
-              <w:rPr>
-                <w:rFonts w:ascii="Arial" w:hAnsi="Arial" w:cs="Arial"/>
-                <w:i/>
-                <w:iCs/>
-              </w:rPr>
-              <w:t>How will you deliver this project?</w:t>
-            </w:r>
-          </w:p>
-          <w:p>
-            <w:pPr>
-              <w:spacing w:line="360" w:lineRule="atLeast"/>
-              <w:rPr>
-                <w:rFonts w:ascii="Arial" w:hAnsi="Arial" w:cs="Arial"/>
-                <w:i/>
-                <w:iCs/>
-              </w:rPr>
-            </w:pPr>
-            <w:r>
-              <w:rPr>
-                <w:rFonts w:ascii="Arial" w:hAnsi="Arial" w:cs="Arial"/>
-                <w:i/>
-                <w:iCs/>
-              </w:rPr>
-              <w:t>Detailed description of your proposed research methods – are you going to compare with another approach/against current research, will you be completing an experiment or study? How will you measure the success of this project?</w:t>
-            </w:r>
-          </w:p>
-          <w:p>
-            <w:pPr>
-              <w:spacing w:line="360" w:lineRule="atLeast"/>
-              <w:rPr>
-                <w:rFonts w:ascii="Arial" w:hAnsi="Arial" w:cs="Arial"/>
-                <w:i/>
-                <w:iCs/>
-              </w:rPr>
-            </w:pPr>
-            <w:r>
-              <w:rPr>
-                <w:rFonts w:ascii="Arial" w:hAnsi="Arial" w:cs="Arial"/>
-                <w:i/>
-                <w:iCs/>
-              </w:rPr>
-              <w:t>What software development methodology will you be using?</w:t>
-            </w:r>
-          </w:p>
-          <w:p>
-            <w:pPr>
-              <w:spacing w:line="360" w:lineRule="atLeast"/>
-              <w:rPr>
-                <w:rFonts w:ascii="Arial" w:hAnsi="Arial" w:cs="Arial"/>
-                <w:i/>
-                <w:iCs/>
-              </w:rPr>
-            </w:pPr>
-            <w:r>
-              <w:rPr>
-                <w:rFonts w:ascii="Arial" w:hAnsi="Arial" w:cs="Arial"/>
-                <w:i/>
-                <w:iCs/>
-              </w:rPr>
-              <w:t>How will you use modern software engineering and management tools to facilitate project delivery? (Jira, GitHub, Trello, etc.)</w:t>
-            </w:r>
-          </w:p>
-          <w:p>
-            <w:pPr>
-              <w:spacing w:line="360" w:lineRule="atLeast"/>
-              <w:rPr>
-                <w:rFonts w:ascii="Arial" w:hAnsi="Arial" w:cs="Arial"/>
-                <w:i/>
-                <w:iCs/>
-              </w:rPr>
-            </w:pPr>
-            <w:r>
-              <w:rPr>
-                <w:rFonts w:ascii="Arial" w:hAnsi="Arial" w:cs="Arial"/>
-                <w:i/>
-                <w:iCs/>
-              </w:rPr>
-              <w:t>Justification for proposed methods/tools/languages/libraries, etc.</w:t>
-            </w:r>
-          </w:p>
-          <w:p>
-            <w:pPr>
-              <w:spacing w:line="360" w:lineRule="atLeast"/>
-              <w:rPr>
-                <w:rFonts w:ascii="Arial" w:hAnsi="Arial" w:cs="Arial"/>
-                <w:i/>
-                <w:iCs/>
-              </w:rPr>
-            </w:pPr>
-            <w:r>
-              <w:rPr>
-                <w:rFonts w:ascii="Arial" w:hAnsi="Arial" w:cs="Arial"/>
-                <w:i/>
-                <w:iCs/>
-              </w:rPr>
-              <w:t>Any ethical considerations that would impact you completing this project?</w:t>
-            </w:r>
-          </w:p>
-          <w:p>
-            <w:pPr>
-              <w:spacing w:line="360" w:lineRule="atLeast"/>
-              <w:rPr>
-                <w:rFonts w:ascii="Arial" w:hAnsi="Arial" w:cs="Arial"/>
-                <w:i/>
-                <w:iCs/>
-              </w:rPr>
-            </w:pPr>
-            <w:r>
-              <w:rPr>
-                <w:rFonts w:ascii="Arial" w:hAnsi="Arial" w:cs="Arial"/>
-                <w:i/>
-                <w:iCs/>
-              </w:rPr>
-              <w:t>What are the legal, ethical and environmental considerations relating to this project?</w:t>
-            </w:r>
-          </w:p>
-          <w:p>
-            <w:pPr>
-              <w:spacing w:line="360" w:lineRule="atLeast"/>
-              <w:rPr>
-                <w:rFonts w:ascii="Arial" w:hAnsi="Arial" w:cs="Arial"/>
-                <w:i/>
-                <w:iCs/>
-              </w:rPr>
-            </w:pPr>
-          </w:p>
-          <w:p>
-            <w:pPr>
-              <w:pStyle w:val="ListParagraph"/>
-              <w:spacing w:line="360" w:lineRule="atLeast"/>
-              <w:rPr>
-                <w:rFonts w:ascii="Arial" w:hAnsi="Arial" w:cs="Arial"/>
-                <w:i/>
-                <w:iCs/>
-              </w:rPr>
-            </w:pPr>
+                <w:u w:val="single"/>
+              </w:rPr>
+            </w:pPr>
+          </w:p>
+          <w:p>
+            <w:pPr>
+              <w:spacing w:line="360" w:lineRule="atLeast"/>
+              <w:rPr>
+                <w:rFonts w:ascii="Arial" w:hAnsi="Arial" w:cs="Arial"/>
+                <w:u w:val="single"/>
+              </w:rPr>
+            </w:pPr>
+            <w:r>
+              <w:rPr>
+                <w:rFonts w:ascii="Arial" w:hAnsi="Arial" w:cs="Arial"/>
+                <w:u w:val="single"/>
+              </w:rPr>
+              <w:t>Research Methods and Evaluation</w:t>
+            </w:r>
+          </w:p>
+          <w:p>
+            <w:pPr>
+              <w:spacing w:line="360" w:lineRule="atLeast"/>
+              <w:rPr>
+                <w:rFonts w:ascii="Arial" w:hAnsi="Arial" w:cs="Arial"/>
+              </w:rPr>
+            </w:pPr>
+            <w:r>
+              <w:rPr>
+                <w:rFonts w:ascii="Arial" w:hAnsi="Arial" w:cs="Arial"/>
+              </w:rPr>
+              <w:t xml:space="preserve"> My project will use an iterative software development approach, developing the application in smaller sprints and testing each feature before proceeding to the next. I will compare the application with existing food management applications, </w:t>
+            </w:r>
+            <w:r>
+              <w:rPr>
+                <w:rFonts w:ascii="Arial" w:hAnsi="Arial" w:cs="Arial"/>
+              </w:rPr>
+              <w:t xml:space="preserve">mainly </w:t>
+            </w:r>
+            <w:proofErr w:type="spellStart"/>
+            <w:r>
+              <w:rPr>
+                <w:rFonts w:ascii="Arial" w:hAnsi="Arial" w:cs="Arial"/>
+              </w:rPr>
+              <w:t>NoWaste</w:t>
+            </w:r>
+            <w:proofErr w:type="spellEnd"/>
+            <w:r>
+              <w:rPr>
+                <w:rFonts w:ascii="Arial" w:hAnsi="Arial" w:cs="Arial"/>
+              </w:rPr>
+              <w:t xml:space="preserve">, to identify opportunities for improvement. I will use practical testing to determine whether the application meets its objectives, rather than conducting a formal user study. </w:t>
+            </w:r>
+          </w:p>
+          <w:p>
+            <w:pPr>
+              <w:spacing w:line="360" w:lineRule="atLeast"/>
+              <w:rPr>
+                <w:rFonts w:ascii="Arial" w:hAnsi="Arial" w:cs="Arial"/>
+              </w:rPr>
+            </w:pPr>
+          </w:p>
+          <w:p>
+            <w:pPr>
+              <w:spacing w:line="360" w:lineRule="atLeast"/>
+              <w:rPr>
+                <w:rFonts w:ascii="Arial" w:hAnsi="Arial" w:cs="Arial"/>
+              </w:rPr>
+            </w:pPr>
+            <w:r>
+              <w:rPr>
+                <w:rFonts w:ascii="Arial" w:hAnsi="Arial" w:cs="Arial"/>
+              </w:rPr>
+              <w:t xml:space="preserve">The application will be evaluated through a series of functional tests. These will include testing the accuracy of the YOLOv8 architecture to determine whether it can correctly identify food labels and </w:t>
+            </w:r>
+            <w:r>
+              <w:rPr>
+                <w:rFonts w:ascii="Arial" w:hAnsi="Arial" w:cs="Arial"/>
+              </w:rPr>
+              <w:t>testing the accuracy of the OCR software to</w:t>
+            </w:r>
+            <w:r>
+              <w:rPr>
+                <w:rFonts w:ascii="Arial" w:hAnsi="Arial" w:cs="Arial"/>
+              </w:rPr>
+              <w:t xml:space="preserve"> extract expiry dates from images input to the system. Testing will also assess whether notifications trigger at the correct times and whether personalized recipes use ingredients recorded in the inventory.</w:t>
+            </w:r>
+          </w:p>
+          <w:p>
+            <w:pPr>
+              <w:spacing w:line="360" w:lineRule="atLeast"/>
+              <w:rPr>
+                <w:rFonts w:ascii="Arial" w:hAnsi="Arial" w:cs="Arial"/>
+              </w:rPr>
+            </w:pPr>
+          </w:p>
+          <w:p>
+            <w:pPr>
+              <w:spacing w:line="360" w:lineRule="atLeast"/>
+              <w:rPr>
+                <w:rFonts w:ascii="Arial" w:hAnsi="Arial" w:cs="Arial"/>
+              </w:rPr>
+            </w:pPr>
+            <w:r>
+              <w:rPr>
+                <w:rFonts w:ascii="Arial" w:hAnsi="Arial" w:cs="Arial"/>
+              </w:rPr>
+              <w:t>Recognition accuracy will be measured by comparing the application's results against the actual product labels and expiry dates. A final demonstration will be given to the lecturers to demonstrate the application’s functionality and evaluate how effectively it addresses the project's objectives</w:t>
+            </w:r>
+            <w:r>
+              <w:rPr>
+                <w:rFonts w:ascii="Arial" w:hAnsi="Arial" w:cs="Arial"/>
+              </w:rPr>
+              <w:t>.</w:t>
+            </w:r>
+          </w:p>
+          <w:p>
+            <w:pPr>
+              <w:spacing w:line="360" w:lineRule="atLeast"/>
+              <w:rPr>
+                <w:rFonts w:ascii="Arial" w:hAnsi="Arial" w:cs="Arial"/>
+              </w:rPr>
+            </w:pPr>
+          </w:p>
+          <w:p>
+            <w:pPr>
+              <w:spacing w:line="360" w:lineRule="atLeast"/>
+              <w:rPr>
+                <w:rFonts w:ascii="Arial" w:hAnsi="Arial" w:cs="Arial"/>
+                <w:u w:val="single"/>
+              </w:rPr>
+            </w:pPr>
+            <w:r>
+              <w:rPr>
+                <w:rFonts w:ascii="Arial" w:hAnsi="Arial" w:cs="Arial"/>
+                <w:u w:val="single"/>
+              </w:rPr>
+              <w:t>Software Development Methodology</w:t>
+            </w:r>
+          </w:p>
+          <w:p>
+            <w:pPr>
+              <w:spacing w:line="360" w:lineRule="atLeast"/>
+              <w:rPr>
+                <w:rFonts w:ascii="Arial" w:hAnsi="Arial" w:cs="Arial"/>
+              </w:rPr>
+            </w:pPr>
+            <w:r>
+              <w:rPr>
+                <w:rFonts w:ascii="Arial" w:hAnsi="Arial" w:cs="Arial"/>
+              </w:rPr>
+              <w:t xml:space="preserve">An Agile iterative methodology will be used to develop the application. This approach allows the system's features to be developed and tested incrementally, making it easier to identify </w:t>
+            </w:r>
+            <w:r>
+              <w:rPr>
+                <w:rFonts w:ascii="Arial" w:hAnsi="Arial" w:cs="Arial"/>
+              </w:rPr>
+              <w:t>errors</w:t>
+            </w:r>
+            <w:r>
+              <w:rPr>
+                <w:rFonts w:ascii="Arial" w:hAnsi="Arial" w:cs="Arial"/>
+              </w:rPr>
+              <w:t xml:space="preserve"> early and adapt the project as necessary. The project will be divided into stages, including research and planning, interface design, database development, computer vision integration, AI recipe integration, testing, and final evaluation. This approach suits this type of software development because computer vision and optical character recognition (OCR) may require extensive experimentation before a reliable version can be achieved.</w:t>
+            </w:r>
+          </w:p>
+          <w:p>
+            <w:pPr>
+              <w:spacing w:line="360" w:lineRule="atLeast"/>
+              <w:rPr>
+                <w:rFonts w:ascii="Arial" w:hAnsi="Arial" w:cs="Arial"/>
+              </w:rPr>
+            </w:pPr>
+          </w:p>
+          <w:p>
+            <w:pPr>
+              <w:spacing w:line="360" w:lineRule="atLeast"/>
+              <w:rPr>
+                <w:rFonts w:ascii="Arial" w:hAnsi="Arial" w:cs="Arial"/>
+              </w:rPr>
+            </w:pPr>
+          </w:p>
+          <w:p>
+            <w:pPr>
+              <w:spacing w:line="360" w:lineRule="atLeast"/>
+              <w:rPr>
+                <w:rFonts w:ascii="Arial" w:hAnsi="Arial" w:cs="Arial"/>
+                <w:u w:val="single"/>
+              </w:rPr>
+            </w:pPr>
+            <w:r>
+              <w:rPr>
+                <w:rFonts w:ascii="Arial" w:hAnsi="Arial" w:cs="Arial"/>
+                <w:u w:val="single"/>
+              </w:rPr>
+              <w:t>Software Engineering and Management Tools</w:t>
+            </w:r>
+          </w:p>
+          <w:p>
+            <w:pPr>
+              <w:spacing w:line="360" w:lineRule="atLeast"/>
+              <w:rPr>
+                <w:rFonts w:ascii="Arial" w:hAnsi="Arial" w:cs="Arial"/>
+              </w:rPr>
+            </w:pPr>
+            <w:r>
+              <w:rPr>
+                <w:rFonts w:ascii="Arial" w:hAnsi="Arial" w:cs="Arial"/>
+              </w:rPr>
+              <w:t xml:space="preserve">I will use GitHub for version control and a feature-branching strategy. This allows changes to the main branch code to be made on an isolated feature branch, with testing completed before merging into the main branch. This will reduce main-branch breaks and speed up development. Jira will organize tasks, track progress, and </w:t>
+            </w:r>
+            <w:r>
+              <w:rPr>
+                <w:rFonts w:ascii="Arial" w:hAnsi="Arial" w:cs="Arial"/>
+              </w:rPr>
+              <w:lastRenderedPageBreak/>
+              <w:t>manage deadlines. These tools will help maintain an organized development process and ensure the project remains manageable within the available timeframe.</w:t>
+            </w:r>
+          </w:p>
+          <w:p>
+            <w:pPr>
+              <w:spacing w:line="360" w:lineRule="atLeast"/>
+              <w:rPr>
+                <w:rFonts w:ascii="Arial" w:hAnsi="Arial" w:cs="Arial"/>
+              </w:rPr>
+            </w:pPr>
+          </w:p>
+          <w:p>
+            <w:pPr>
+              <w:spacing w:line="360" w:lineRule="atLeast"/>
+              <w:rPr>
+                <w:rFonts w:ascii="Arial" w:hAnsi="Arial" w:cs="Arial"/>
+                <w:u w:val="single"/>
+              </w:rPr>
+            </w:pPr>
+            <w:r>
+              <w:rPr>
+                <w:rFonts w:ascii="Arial" w:hAnsi="Arial" w:cs="Arial"/>
+                <w:u w:val="single"/>
+              </w:rPr>
+              <w:t>Justification of Technologies and Tools</w:t>
+            </w:r>
+          </w:p>
+          <w:p>
+            <w:pPr>
+              <w:spacing w:line="360" w:lineRule="atLeast"/>
+              <w:rPr>
+                <w:rFonts w:ascii="Arial" w:hAnsi="Arial" w:cs="Arial"/>
+              </w:rPr>
+            </w:pPr>
+            <w:r>
+              <w:rPr>
+                <w:rFonts w:ascii="Arial" w:hAnsi="Arial" w:cs="Arial"/>
+              </w:rPr>
+              <w:t xml:space="preserve">Computer vision will be integrated using YOLOv8, with </w:t>
+            </w:r>
+            <w:proofErr w:type="spellStart"/>
+            <w:r>
+              <w:rPr>
+                <w:rFonts w:ascii="Arial" w:hAnsi="Arial" w:cs="Arial"/>
+              </w:rPr>
+              <w:t>Roboflow</w:t>
+            </w:r>
+            <w:proofErr w:type="spellEnd"/>
+            <w:r>
+              <w:rPr>
+                <w:rFonts w:ascii="Arial" w:hAnsi="Arial" w:cs="Arial"/>
+              </w:rPr>
+              <w:t xml:space="preserve"> </w:t>
+            </w:r>
+            <w:r>
+              <w:rPr>
+                <w:rFonts w:ascii="Arial" w:hAnsi="Arial" w:cs="Arial"/>
+              </w:rPr>
+              <w:t>used to prepare datasets and train</w:t>
+            </w:r>
+            <w:r>
+              <w:rPr>
+                <w:rFonts w:ascii="Arial" w:hAnsi="Arial" w:cs="Arial"/>
+              </w:rPr>
+              <w:t xml:space="preserve"> models. OCR technology will be explored to extract the expiry dates from food </w:t>
+            </w:r>
+            <w:r>
+              <w:rPr>
+                <w:rFonts w:ascii="Arial" w:hAnsi="Arial" w:cs="Arial"/>
+              </w:rPr>
+              <w:t>packaging. A MySQL database will store food information, including product names and expiry dates. The OpenAI API will generate personalized recipes based on available ingredients. These technologies support the project's main objectives: simplifying food entry, improving food tracking, and encouraging users to use ingredients before they go to waste. The final choice of tools may change depending on their suitability, accuracy, and feasibility within the project timeframe.</w:t>
+            </w:r>
+          </w:p>
+          <w:p>
+            <w:pPr>
+              <w:spacing w:line="360" w:lineRule="atLeast"/>
+              <w:rPr>
+                <w:rFonts w:ascii="Arial" w:hAnsi="Arial" w:cs="Arial"/>
+              </w:rPr>
+            </w:pPr>
+          </w:p>
+          <w:p>
+            <w:pPr>
+              <w:spacing w:line="360" w:lineRule="atLeast"/>
+              <w:rPr>
+                <w:rFonts w:ascii="Arial" w:hAnsi="Arial" w:cs="Arial"/>
+                <w:u w:val="single"/>
+              </w:rPr>
+            </w:pPr>
+            <w:r>
+              <w:rPr>
+                <w:rFonts w:ascii="Arial" w:hAnsi="Arial" w:cs="Arial"/>
+                <w:u w:val="single"/>
+              </w:rPr>
+              <w:t>Legal and Ethical Considerations</w:t>
+            </w:r>
+          </w:p>
+          <w:p>
+            <w:pPr>
+              <w:spacing w:line="360" w:lineRule="atLeast"/>
+              <w:rPr>
+                <w:rFonts w:ascii="Arial" w:hAnsi="Arial" w:cs="Arial"/>
+              </w:rPr>
+            </w:pPr>
+            <w:r>
+              <w:rPr>
+                <w:rFonts w:ascii="Arial" w:hAnsi="Arial" w:cs="Arial"/>
+              </w:rPr>
+              <w:t xml:space="preserve">The project will be developed with data privacy and protection in mind. </w:t>
+            </w:r>
+            <w:r>
+              <w:rPr>
+                <w:rFonts w:ascii="Arial" w:hAnsi="Arial" w:cs="Arial"/>
+              </w:rPr>
+              <w:t>The project will collect only necessary personal information, store it securely, and handle it</w:t>
+            </w:r>
+            <w:r>
+              <w:rPr>
+                <w:rFonts w:ascii="Arial" w:hAnsi="Arial" w:cs="Arial"/>
+              </w:rPr>
+              <w:t xml:space="preserve"> in accordance with the General Data Protection Regulation (GDPR). API keys and other credentials will be kept out of public GitHub repositories using a git ignore file. Images and datasets used to train the computer vision model will be obtained from appropriate sources. This will ensure that their licenses permit the intended use.</w:t>
+            </w:r>
+          </w:p>
+          <w:p>
+            <w:pPr>
+              <w:spacing w:line="360" w:lineRule="atLeast"/>
+              <w:rPr>
+                <w:rFonts w:ascii="Arial" w:hAnsi="Arial" w:cs="Arial"/>
+              </w:rPr>
+            </w:pPr>
+          </w:p>
+          <w:p>
+            <w:pPr>
+              <w:spacing w:line="360" w:lineRule="atLeast"/>
+              <w:rPr>
+                <w:rFonts w:ascii="Arial" w:hAnsi="Arial" w:cs="Arial"/>
+              </w:rPr>
+            </w:pPr>
+            <w:r>
+              <w:rPr>
+                <w:rFonts w:ascii="Arial" w:hAnsi="Arial" w:cs="Arial"/>
+              </w:rPr>
+              <w:t>Food safety is another big ethical consideration. The application must distinguish between use-by dates, which relate to food safety, and best before dates, which relate primarily to food quality. Notifications and AI-generated recipes must not encourage users to use food that may be unfit for consumption.</w:t>
+            </w:r>
+          </w:p>
+          <w:p>
+            <w:pPr>
+              <w:spacing w:line="360" w:lineRule="atLeast"/>
+              <w:rPr>
+                <w:rFonts w:ascii="Arial" w:hAnsi="Arial" w:cs="Arial"/>
+              </w:rPr>
+            </w:pPr>
+          </w:p>
+          <w:p>
+            <w:pPr>
+              <w:spacing w:line="360" w:lineRule="atLeast"/>
+              <w:rPr>
+                <w:rFonts w:ascii="Arial" w:hAnsi="Arial" w:cs="Arial"/>
+              </w:rPr>
+            </w:pPr>
+            <w:r>
+              <w:rPr>
+                <w:rFonts w:ascii="Arial" w:hAnsi="Arial" w:cs="Arial"/>
+              </w:rPr>
+              <w:t>Environmental considerations include the energy and computing resources required to train the computer vision model and use external AI services. Frequent API requests and model training can increase electricity usage and contribute to carbon emissions. The project should therefore minimize unnecessary processing and A</w:t>
+            </w:r>
+            <w:r>
+              <w:rPr>
+                <w:rFonts w:ascii="Arial" w:hAnsi="Arial" w:cs="Arial"/>
+              </w:rPr>
+              <w:t>PI</w:t>
+            </w:r>
+            <w:r>
+              <w:rPr>
+                <w:rFonts w:ascii="Arial" w:hAnsi="Arial" w:cs="Arial"/>
+              </w:rPr>
+              <w:t xml:space="preserve"> calls where possible. Images should be stored efficiently and unnecessary files removed when no longer needed.</w:t>
+            </w:r>
           </w:p>
         </w:tc>
       </w:tr>
@@ -6218,7 +7100,6 @@
           <w:rFonts w:ascii="Arial" w:hAnsi="Arial" w:cs="Arial"/>
           <w:u w:val="single"/>
         </w:rPr>
-        <w:lastRenderedPageBreak/>
         <w:t>Does this project require ethical approval?</w:t>
       </w:r>
       <w:r>
@@ -6273,7 +7154,7 @@
           </w:rPr>
           <w:id w:val="989213318"/>
           <w14:checkbox>
-            <w14:checked w14:val="0"/>
+            <w14:checked w14:val="1"/>
             <w14:checkedState w14:val="2612" w14:font="MS Gothic"/>
             <w14:uncheckedState w14:val="2610" w14:font="MS Gothic"/>
           </w14:checkbox>
@@ -6283,7 +7164,7 @@
             <w:rPr>
               <w:rFonts w:ascii="MS Gothic" w:eastAsia="MS Gothic" w:hAnsi="MS Gothic" w:cs="Arial" w:hint="eastAsia"/>
             </w:rPr>
-            <w:t>☐</w:t>
+            <w:t>☒</w:t>
           </w:r>
         </w:sdtContent>
       </w:sdt>
@@ -6323,14 +7204,6 @@
     <w:p>
       <w:pPr>
         <w:spacing w:line="360" w:lineRule="atLeast"/>
-        <w:rPr>
-          <w:rFonts w:ascii="Arial" w:hAnsi="Arial" w:cs="Arial"/>
-        </w:rPr>
-      </w:pPr>
-    </w:p>
-    <w:p>
-      <w:pPr>
-        <w:spacing w:line="360" w:lineRule="atLeast"/>
         <w:ind w:left="720" w:hanging="720"/>
         <w:rPr>
           <w:rFonts w:ascii="Arial" w:hAnsi="Arial" w:cs="Arial"/>
@@ -6344,7 +7217,8 @@
           <w:b/>
           <w:bCs/>
         </w:rPr>
-        <w:t>6</w:t>
+        <w:lastRenderedPageBreak/>
+        <w:t>6.</w:t>
       </w:r>
       <w:r>
         <w:rPr>
@@ -6352,49 +7226,8 @@
           <w:b/>
           <w:bCs/>
         </w:rPr>
-        <w:t>.</w:t>
-      </w:r>
-      <w:r>
-        <w:rPr>
-          <w:rFonts w:ascii="Arial" w:hAnsi="Arial" w:cs="Arial"/>
-          <w:b/>
-          <w:bCs/>
-        </w:rPr>
         <w:tab/>
-      </w:r>
-      <w:r>
-        <w:rPr>
-          <w:rFonts w:ascii="Arial" w:hAnsi="Arial" w:cs="Arial"/>
-          <w:b/>
-          <w:bCs/>
-        </w:rPr>
-        <w:t>Project Plan / Resources</w:t>
-      </w:r>
-      <w:r>
-        <w:rPr>
-          <w:rFonts w:ascii="Arial" w:hAnsi="Arial" w:cs="Arial"/>
-          <w:b/>
-          <w:bCs/>
-        </w:rPr>
-        <w:t xml:space="preserve"> (</w:t>
-      </w:r>
-      <w:r>
-        <w:rPr>
-          <w:rFonts w:ascii="Arial" w:hAnsi="Arial" w:cs="Arial"/>
-          <w:b/>
-          <w:bCs/>
-          <w:i/>
-          <w:iCs/>
-        </w:rPr>
-        <w:t>max 400 words</w:t>
-      </w:r>
-      <w:r>
-        <w:rPr>
-          <w:rFonts w:ascii="Arial" w:hAnsi="Arial" w:cs="Arial"/>
-          <w:b/>
-          <w:bCs/>
-        </w:rPr>
-        <w:t>)</w:t>
+        <w:t>Project Plan / Resources (max 400 words)</w:t>
       </w:r>
     </w:p>
     <w:tbl>
@@ -6419,115 +7252,765 @@
               <w:spacing w:line="360" w:lineRule="atLeast"/>
               <w:rPr>
                 <w:rFonts w:ascii="Arial" w:hAnsi="Arial" w:cs="Arial"/>
-                <w:i/>
-                <w:iCs/>
-              </w:rPr>
-            </w:pPr>
-            <w:r>
-              <w:rPr>
-                <w:rFonts w:ascii="Arial" w:hAnsi="Arial" w:cs="Arial"/>
-                <w:i/>
-                <w:iCs/>
-              </w:rPr>
-              <w:t>Timeline of key milestones and deliverables</w:t>
-            </w:r>
-            <w:r>
-              <w:rPr>
-                <w:rFonts w:ascii="Arial" w:hAnsi="Arial" w:cs="Arial"/>
-                <w:i/>
-                <w:iCs/>
-              </w:rPr>
-              <w:t>.</w:t>
-            </w:r>
-          </w:p>
-          <w:p>
-            <w:pPr>
-              <w:spacing w:line="360" w:lineRule="atLeast"/>
-              <w:rPr>
-                <w:rFonts w:ascii="Arial" w:hAnsi="Arial" w:cs="Arial"/>
-                <w:i/>
-                <w:iCs/>
-              </w:rPr>
-            </w:pPr>
-            <w:r>
-              <w:rPr>
-                <w:rFonts w:ascii="Arial" w:hAnsi="Arial" w:cs="Arial"/>
-                <w:i/>
-                <w:iCs/>
-              </w:rPr>
-              <w:t>Resource requirements (e.g., software, hardware, datasets)</w:t>
-            </w:r>
-            <w:r>
-              <w:rPr>
-                <w:rFonts w:ascii="Arial" w:hAnsi="Arial" w:cs="Arial"/>
-                <w:i/>
-                <w:iCs/>
-              </w:rPr>
-              <w:t>.</w:t>
-            </w:r>
-          </w:p>
-          <w:p>
-            <w:pPr>
-              <w:spacing w:line="360" w:lineRule="atLeast"/>
-              <w:rPr>
-                <w:rFonts w:ascii="Arial" w:hAnsi="Arial" w:cs="Arial"/>
-              </w:rPr>
-            </w:pPr>
-            <w:r>
-              <w:rPr>
-                <w:rFonts w:ascii="Arial" w:hAnsi="Arial" w:cs="Arial"/>
-                <w:i/>
-                <w:iCs/>
-              </w:rPr>
-              <w:t xml:space="preserve">If you are planning to borrow hardware </w:t>
-            </w:r>
-            <w:r>
-              <w:rPr>
-                <w:rFonts w:ascii="Arial" w:hAnsi="Arial" w:cs="Arial"/>
-                <w:i/>
-                <w:iCs/>
-              </w:rPr>
-              <w:t xml:space="preserve">from the department, </w:t>
-            </w:r>
-            <w:r>
-              <w:rPr>
-                <w:rFonts w:ascii="Arial" w:hAnsi="Arial" w:cs="Arial"/>
-                <w:i/>
-                <w:iCs/>
-              </w:rPr>
-              <w:t xml:space="preserve">make it clear in this section </w:t>
-            </w:r>
-            <w:r>
-              <w:rPr>
-                <w:rFonts w:ascii="Arial" w:hAnsi="Arial" w:cs="Arial"/>
-                <w:i/>
-                <w:iCs/>
-              </w:rPr>
-              <w:t>what you require. Also, outline a</w:t>
-            </w:r>
-            <w:r>
-              <w:rPr>
-                <w:rFonts w:ascii="Arial" w:hAnsi="Arial" w:cs="Arial"/>
-                <w:i/>
-                <w:iCs/>
-              </w:rPr>
-              <w:t>n alternative plan if you can</w:t>
-            </w:r>
-            <w:r>
-              <w:rPr>
-                <w:rFonts w:ascii="Arial" w:hAnsi="Arial" w:cs="Arial"/>
-                <w:i/>
-                <w:iCs/>
-              </w:rPr>
-              <w:t xml:space="preserve">not access </w:t>
-            </w:r>
-            <w:r>
-              <w:rPr>
-                <w:rFonts w:ascii="Arial" w:hAnsi="Arial" w:cs="Arial"/>
-                <w:i/>
-                <w:iCs/>
-              </w:rPr>
-              <w:t>this hardware.</w:t>
+                <w:b/>
+                <w:bCs/>
+                <w:u w:val="single"/>
+              </w:rPr>
+            </w:pPr>
+            <w:r>
+              <w:rPr>
+                <w:rFonts w:ascii="Arial" w:hAnsi="Arial" w:cs="Arial"/>
+                <w:b/>
+                <w:bCs/>
+                <w:u w:val="single"/>
+              </w:rPr>
+              <w:t>Timeline of Key Milestones and Deliverables</w:t>
+            </w:r>
+            <w:r>
+              <w:rPr>
+                <w:rFonts w:ascii="Arial" w:hAnsi="Arial" w:cs="Arial"/>
+                <w:b/>
+                <w:bCs/>
+                <w:u w:val="single"/>
+              </w:rPr>
+              <w:t xml:space="preserve"> </w:t>
+            </w:r>
+          </w:p>
+          <w:p>
+            <w:pPr>
+              <w:spacing w:line="360" w:lineRule="atLeast"/>
+              <w:rPr>
+                <w:rFonts w:ascii="Arial" w:hAnsi="Arial" w:cs="Arial"/>
+                <w:b/>
+                <w:bCs/>
+                <w:u w:val="single"/>
+              </w:rPr>
+            </w:pPr>
+          </w:p>
+          <w:p>
+            <w:pPr>
+              <w:spacing w:line="360" w:lineRule="atLeast"/>
+              <w:rPr>
+                <w:rFonts w:ascii="Arial" w:hAnsi="Arial" w:cs="Arial"/>
+              </w:rPr>
+            </w:pPr>
+            <w:r>
+              <w:rPr>
+                <w:rFonts w:ascii="Arial" w:hAnsi="Arial" w:cs="Arial"/>
+              </w:rPr>
+              <w:t xml:space="preserve">The project will be completed in stages/sprints to ensure </w:t>
+            </w:r>
+            <w:r>
+              <w:rPr>
+                <w:rFonts w:ascii="Arial" w:hAnsi="Arial" w:cs="Arial"/>
+              </w:rPr>
+              <w:t>sufficient time for development, testing,</w:t>
+            </w:r>
+            <w:r>
+              <w:rPr>
+                <w:rFonts w:ascii="Arial" w:hAnsi="Arial" w:cs="Arial"/>
+              </w:rPr>
+              <w:t xml:space="preserve"> and evaluation.</w:t>
+            </w:r>
+          </w:p>
+          <w:p>
+            <w:pPr>
+              <w:spacing w:line="360" w:lineRule="atLeast"/>
+              <w:rPr>
+                <w:rFonts w:ascii="Arial" w:hAnsi="Arial" w:cs="Arial"/>
+              </w:rPr>
+            </w:pPr>
+          </w:p>
+          <w:p>
+            <w:pPr>
+              <w:spacing w:line="360" w:lineRule="atLeast"/>
+              <w:rPr>
+                <w:rFonts w:ascii="Arial" w:hAnsi="Arial" w:cs="Arial"/>
+              </w:rPr>
+            </w:pPr>
+            <w:r>
+              <w:rPr>
+                <w:rFonts w:ascii="Arial" w:hAnsi="Arial" w:cs="Arial"/>
+              </w:rPr>
+              <w:t>The estimated project duration is 16 weeks, with extra time allocated to tasks likely to be difficult. Figure 4 shows a Gantt Chart of the Project, broken into summary tasks and the tasks to be undertaken during that timeframe.</w:t>
+            </w:r>
+          </w:p>
+          <w:p>
+            <w:pPr>
+              <w:spacing w:line="360" w:lineRule="atLeast"/>
+              <w:rPr>
+                <w:rFonts w:ascii="Arial" w:hAnsi="Arial" w:cs="Arial"/>
+              </w:rPr>
+            </w:pPr>
+          </w:p>
+          <w:p>
+            <w:pPr>
+              <w:spacing w:line="360" w:lineRule="atLeast"/>
+              <w:rPr>
+                <w:rFonts w:ascii="Arial" w:hAnsi="Arial" w:cs="Arial"/>
+              </w:rPr>
+            </w:pPr>
+            <w:r>
+              <w:rPr>
+                <w:rFonts w:ascii="Arial" w:hAnsi="Arial" w:cs="Arial"/>
+              </w:rPr>
+              <w:t>I’ve allocated two weeks to each sprint of the project's development, aside from Computer Vision Development, Integration, and Testing. These tasks will require extra time to account for unexpected challenges.</w:t>
+            </w:r>
+            <w:r>
+              <w:rPr>
+                <w:rFonts w:ascii="Arial" w:hAnsi="Arial" w:cs="Arial"/>
+              </w:rPr>
+              <w:t xml:space="preserve"> The Gantt chart estimates durations and may change during development; some milestones may be completed sooner than expected, allowing more time for refinement and testing.</w:t>
+            </w:r>
+          </w:p>
+          <w:p>
+            <w:pPr>
+              <w:spacing w:line="360" w:lineRule="atLeast"/>
+              <w:rPr>
+                <w:rFonts w:ascii="Arial" w:hAnsi="Arial" w:cs="Arial"/>
+              </w:rPr>
+            </w:pPr>
+          </w:p>
+          <w:p>
+            <w:pPr>
+              <w:spacing w:line="360" w:lineRule="atLeast"/>
+              <w:rPr>
+                <w:rFonts w:ascii="Arial" w:hAnsi="Arial" w:cs="Arial"/>
+                <w:b/>
+                <w:bCs/>
+                <w:u w:val="single"/>
+              </w:rPr>
+            </w:pPr>
+            <w:r>
+              <w:rPr>
+                <w:rFonts w:ascii="Arial" w:hAnsi="Arial" w:cs="Arial"/>
+                <w:b/>
+                <w:bCs/>
+                <w:u w:val="single"/>
+              </w:rPr>
+              <w:t>Estimated Project Milestones</w:t>
+            </w:r>
+            <w:r>
+              <w:rPr>
+                <w:rFonts w:ascii="Arial" w:hAnsi="Arial" w:cs="Arial"/>
+                <w:b/>
+                <w:bCs/>
+                <w:u w:val="single"/>
+              </w:rPr>
+              <w:br/>
+            </w:r>
+          </w:p>
+          <w:tbl>
+            <w:tblPr>
+              <w:tblStyle w:val="TableGrid"/>
+              <w:tblW w:w="0" w:type="auto"/>
+              <w:tblLook w:val="04A0" w:firstRow="1" w:lastRow="0" w:firstColumn="1" w:lastColumn="0" w:noHBand="0" w:noVBand="1"/>
+            </w:tblPr>
+            <w:tblGrid>
+              <w:gridCol w:w="4575"/>
+              <w:gridCol w:w="4576"/>
+            </w:tblGrid>
+            <w:tr>
+              <w:tc>
+                <w:tcPr>
+                  <w:tcW w:w="4575" w:type="dxa"/>
+                </w:tcPr>
+                <w:p>
+                  <w:pPr>
+                    <w:spacing w:line="360" w:lineRule="atLeast"/>
+                    <w:rPr>
+                      <w:rFonts w:ascii="Arial" w:hAnsi="Arial" w:cs="Arial"/>
+                      <w:b/>
+                      <w:bCs/>
+                    </w:rPr>
+                  </w:pPr>
+                  <w:r>
+                    <w:rPr>
+                      <w:rFonts w:ascii="Arial" w:hAnsi="Arial" w:cs="Arial"/>
+                      <w:b/>
+                      <w:bCs/>
+                    </w:rPr>
+                    <w:t>Objective</w:t>
+                  </w:r>
+                </w:p>
+                <w:p>
+                  <w:pPr>
+                    <w:spacing w:line="360" w:lineRule="atLeast"/>
+                    <w:rPr>
+                      <w:rFonts w:ascii="Arial" w:hAnsi="Arial" w:cs="Arial"/>
+                      <w:b/>
+                      <w:bCs/>
+                    </w:rPr>
+                  </w:pPr>
+                </w:p>
+              </w:tc>
+              <w:tc>
+                <w:tcPr>
+                  <w:tcW w:w="4576" w:type="dxa"/>
+                </w:tcPr>
+                <w:p>
+                  <w:pPr>
+                    <w:spacing w:line="360" w:lineRule="atLeast"/>
+                    <w:rPr>
+                      <w:rFonts w:ascii="Arial" w:hAnsi="Arial" w:cs="Arial"/>
+                      <w:b/>
+                      <w:bCs/>
+                    </w:rPr>
+                  </w:pPr>
+                  <w:r>
+                    <w:rPr>
+                      <w:rFonts w:ascii="Arial" w:hAnsi="Arial" w:cs="Arial"/>
+                      <w:b/>
+                      <w:bCs/>
+                    </w:rPr>
+                    <w:t>Duration</w:t>
+                  </w:r>
+                </w:p>
+              </w:tc>
+            </w:tr>
+            <w:tr>
+              <w:tc>
+                <w:tcPr>
+                  <w:tcW w:w="4575" w:type="dxa"/>
+                </w:tcPr>
+                <w:p>
+                  <w:pPr>
+                    <w:spacing w:line="360" w:lineRule="atLeast"/>
+                    <w:rPr>
+                      <w:rFonts w:ascii="Arial" w:hAnsi="Arial" w:cs="Arial"/>
+                    </w:rPr>
+                  </w:pPr>
+                  <w:r>
+                    <w:rPr>
+                      <w:rFonts w:ascii="Arial" w:hAnsi="Arial" w:cs="Arial"/>
+                    </w:rPr>
+                    <w:t>Literature Review and Research</w:t>
+                  </w:r>
+                </w:p>
+                <w:p>
+                  <w:pPr>
+                    <w:spacing w:line="360" w:lineRule="atLeast"/>
+                    <w:rPr>
+                      <w:rFonts w:ascii="Arial" w:hAnsi="Arial" w:cs="Arial"/>
+                    </w:rPr>
+                  </w:pPr>
+                </w:p>
+              </w:tc>
+              <w:tc>
+                <w:tcPr>
+                  <w:tcW w:w="4576" w:type="dxa"/>
+                </w:tcPr>
+                <w:p>
+                  <w:pPr>
+                    <w:spacing w:line="360" w:lineRule="atLeast"/>
+                    <w:rPr>
+                      <w:rFonts w:ascii="Arial" w:hAnsi="Arial" w:cs="Arial"/>
+                    </w:rPr>
+                  </w:pPr>
+                  <w:r>
+                    <w:rPr>
+                      <w:rFonts w:ascii="Arial" w:hAnsi="Arial" w:cs="Arial"/>
+                    </w:rPr>
+                    <w:t>2 weeks</w:t>
+                  </w:r>
+                </w:p>
+              </w:tc>
+            </w:tr>
+            <w:tr>
+              <w:tc>
+                <w:tcPr>
+                  <w:tcW w:w="4575" w:type="dxa"/>
+                </w:tcPr>
+                <w:p>
+                  <w:pPr>
+                    <w:spacing w:line="360" w:lineRule="atLeast"/>
+                    <w:rPr>
+                      <w:rFonts w:ascii="Arial" w:hAnsi="Arial" w:cs="Arial"/>
+                    </w:rPr>
+                  </w:pPr>
+                  <w:r>
+                    <w:rPr>
+                      <w:rFonts w:ascii="Arial" w:hAnsi="Arial" w:cs="Arial"/>
+                    </w:rPr>
+                    <w:t>System Design</w:t>
+                  </w:r>
+                </w:p>
+                <w:p>
+                  <w:pPr>
+                    <w:spacing w:line="360" w:lineRule="atLeast"/>
+                    <w:rPr>
+                      <w:rFonts w:ascii="Arial" w:hAnsi="Arial" w:cs="Arial"/>
+                    </w:rPr>
+                  </w:pPr>
+                </w:p>
+              </w:tc>
+              <w:tc>
+                <w:tcPr>
+                  <w:tcW w:w="4576" w:type="dxa"/>
+                </w:tcPr>
+                <w:p>
+                  <w:pPr>
+                    <w:spacing w:line="360" w:lineRule="atLeast"/>
+                    <w:rPr>
+                      <w:rFonts w:ascii="Arial" w:hAnsi="Arial" w:cs="Arial"/>
+                    </w:rPr>
+                  </w:pPr>
+                  <w:r>
+                    <w:rPr>
+                      <w:rFonts w:ascii="Arial" w:hAnsi="Arial" w:cs="Arial"/>
+                    </w:rPr>
+                    <w:t>1 week</w:t>
+                  </w:r>
+                </w:p>
+              </w:tc>
+            </w:tr>
+            <w:tr>
+              <w:tc>
+                <w:tcPr>
+                  <w:tcW w:w="4575" w:type="dxa"/>
+                </w:tcPr>
+                <w:p>
+                  <w:pPr>
+                    <w:spacing w:line="360" w:lineRule="atLeast"/>
+                    <w:rPr>
+                      <w:rFonts w:ascii="Arial" w:hAnsi="Arial" w:cs="Arial"/>
+                    </w:rPr>
+                  </w:pPr>
+                  <w:r>
+                    <w:rPr>
+                      <w:rFonts w:ascii="Arial" w:hAnsi="Arial" w:cs="Arial"/>
+                    </w:rPr>
+                    <w:t>Core Application Development</w:t>
+                  </w:r>
+                </w:p>
+                <w:p>
+                  <w:pPr>
+                    <w:spacing w:line="360" w:lineRule="atLeast"/>
+                    <w:rPr>
+                      <w:rFonts w:ascii="Arial" w:hAnsi="Arial" w:cs="Arial"/>
+                    </w:rPr>
+                  </w:pPr>
+                </w:p>
+              </w:tc>
+              <w:tc>
+                <w:tcPr>
+                  <w:tcW w:w="4576" w:type="dxa"/>
+                </w:tcPr>
+                <w:p>
+                  <w:pPr>
+                    <w:spacing w:line="360" w:lineRule="atLeast"/>
+                    <w:rPr>
+                      <w:rFonts w:ascii="Arial" w:hAnsi="Arial" w:cs="Arial"/>
+                    </w:rPr>
+                  </w:pPr>
+                  <w:r>
+                    <w:rPr>
+                      <w:rFonts w:ascii="Arial" w:hAnsi="Arial" w:cs="Arial"/>
+                    </w:rPr>
+                    <w:t>2 weeks</w:t>
+                  </w:r>
+                </w:p>
+              </w:tc>
+            </w:tr>
+            <w:tr>
+              <w:tc>
+                <w:tcPr>
+                  <w:tcW w:w="4575" w:type="dxa"/>
+                </w:tcPr>
+                <w:p>
+                  <w:pPr>
+                    <w:spacing w:line="360" w:lineRule="atLeast"/>
+                    <w:rPr>
+                      <w:rFonts w:ascii="Arial" w:hAnsi="Arial" w:cs="Arial"/>
+                    </w:rPr>
+                  </w:pPr>
+                  <w:r>
+                    <w:rPr>
+                      <w:rFonts w:ascii="Arial" w:hAnsi="Arial" w:cs="Arial"/>
+                    </w:rPr>
+                    <w:t>Food Expiry Management</w:t>
+                  </w:r>
+                </w:p>
+                <w:p>
+                  <w:pPr>
+                    <w:spacing w:line="360" w:lineRule="atLeast"/>
+                    <w:rPr>
+                      <w:rFonts w:ascii="Arial" w:hAnsi="Arial" w:cs="Arial"/>
+                    </w:rPr>
+                  </w:pPr>
+                </w:p>
+              </w:tc>
+              <w:tc>
+                <w:tcPr>
+                  <w:tcW w:w="4576" w:type="dxa"/>
+                </w:tcPr>
+                <w:p>
+                  <w:pPr>
+                    <w:spacing w:line="360" w:lineRule="atLeast"/>
+                    <w:rPr>
+                      <w:rFonts w:ascii="Arial" w:hAnsi="Arial" w:cs="Arial"/>
+                    </w:rPr>
+                  </w:pPr>
+                  <w:r>
+                    <w:rPr>
+                      <w:rFonts w:ascii="Arial" w:hAnsi="Arial" w:cs="Arial"/>
+                    </w:rPr>
+                    <w:t>1 week</w:t>
+                  </w:r>
+                </w:p>
+              </w:tc>
+            </w:tr>
+            <w:tr>
+              <w:tc>
+                <w:tcPr>
+                  <w:tcW w:w="4575" w:type="dxa"/>
+                </w:tcPr>
+                <w:p>
+                  <w:pPr>
+                    <w:spacing w:line="360" w:lineRule="atLeast"/>
+                    <w:rPr>
+                      <w:rFonts w:ascii="Arial" w:hAnsi="Arial" w:cs="Arial"/>
+                    </w:rPr>
+                  </w:pPr>
+                  <w:r>
+                    <w:rPr>
+                      <w:rFonts w:ascii="Arial" w:hAnsi="Arial" w:cs="Arial"/>
+                    </w:rPr>
+                    <w:t>Computer Vision Development</w:t>
+                  </w:r>
+                </w:p>
+                <w:p>
+                  <w:pPr>
+                    <w:spacing w:line="360" w:lineRule="atLeast"/>
+                    <w:rPr>
+                      <w:rFonts w:ascii="Arial" w:hAnsi="Arial" w:cs="Arial"/>
+                    </w:rPr>
+                  </w:pPr>
+                </w:p>
+              </w:tc>
+              <w:tc>
+                <w:tcPr>
+                  <w:tcW w:w="4576" w:type="dxa"/>
+                </w:tcPr>
+                <w:p>
+                  <w:pPr>
+                    <w:spacing w:line="360" w:lineRule="atLeast"/>
+                    <w:rPr>
+                      <w:rFonts w:ascii="Arial" w:hAnsi="Arial" w:cs="Arial"/>
+                    </w:rPr>
+                  </w:pPr>
+                  <w:r>
+                    <w:rPr>
+                      <w:rFonts w:ascii="Arial" w:hAnsi="Arial" w:cs="Arial"/>
+                    </w:rPr>
+                    <w:t>3 weeks</w:t>
+                  </w:r>
+                </w:p>
+              </w:tc>
+            </w:tr>
+            <w:tr>
+              <w:tc>
+                <w:tcPr>
+                  <w:tcW w:w="4575" w:type="dxa"/>
+                </w:tcPr>
+                <w:p>
+                  <w:pPr>
+                    <w:spacing w:line="360" w:lineRule="atLeast"/>
+                    <w:rPr>
+                      <w:rFonts w:ascii="Arial" w:hAnsi="Arial" w:cs="Arial"/>
+                    </w:rPr>
+                  </w:pPr>
+                  <w:r>
+                    <w:rPr>
+                      <w:rFonts w:ascii="Arial" w:hAnsi="Arial" w:cs="Arial"/>
+                    </w:rPr>
+                    <w:t>OCR Development</w:t>
+                  </w:r>
+                </w:p>
+                <w:p>
+                  <w:pPr>
+                    <w:spacing w:line="360" w:lineRule="atLeast"/>
+                    <w:rPr>
+                      <w:rFonts w:ascii="Arial" w:hAnsi="Arial" w:cs="Arial"/>
+                    </w:rPr>
+                  </w:pPr>
+                </w:p>
+              </w:tc>
+              <w:tc>
+                <w:tcPr>
+                  <w:tcW w:w="4576" w:type="dxa"/>
+                </w:tcPr>
+                <w:p>
+                  <w:pPr>
+                    <w:spacing w:line="360" w:lineRule="atLeast"/>
+                    <w:rPr>
+                      <w:rFonts w:ascii="Arial" w:hAnsi="Arial" w:cs="Arial"/>
+                    </w:rPr>
+                  </w:pPr>
+                  <w:r>
+                    <w:rPr>
+                      <w:rFonts w:ascii="Arial" w:hAnsi="Arial" w:cs="Arial"/>
+                    </w:rPr>
+                    <w:t>2 weeks</w:t>
+                  </w:r>
+                </w:p>
+              </w:tc>
+            </w:tr>
+            <w:tr>
+              <w:tc>
+                <w:tcPr>
+                  <w:tcW w:w="4575" w:type="dxa"/>
+                </w:tcPr>
+                <w:p>
+                  <w:pPr>
+                    <w:spacing w:line="360" w:lineRule="atLeast"/>
+                    <w:rPr>
+                      <w:rFonts w:ascii="Arial" w:hAnsi="Arial" w:cs="Arial"/>
+                    </w:rPr>
+                  </w:pPr>
+                  <w:r>
+                    <w:rPr>
+                      <w:rFonts w:ascii="Arial" w:hAnsi="Arial" w:cs="Arial"/>
+                    </w:rPr>
+                    <w:t>AI Recipe Integration</w:t>
+                  </w:r>
+                </w:p>
+                <w:p>
+                  <w:pPr>
+                    <w:spacing w:line="360" w:lineRule="atLeast"/>
+                    <w:rPr>
+                      <w:rFonts w:ascii="Arial" w:hAnsi="Arial" w:cs="Arial"/>
+                    </w:rPr>
+                  </w:pPr>
+                </w:p>
+              </w:tc>
+              <w:tc>
+                <w:tcPr>
+                  <w:tcW w:w="4576" w:type="dxa"/>
+                </w:tcPr>
+                <w:p>
+                  <w:pPr>
+                    <w:spacing w:line="360" w:lineRule="atLeast"/>
+                    <w:rPr>
+                      <w:rFonts w:ascii="Arial" w:hAnsi="Arial" w:cs="Arial"/>
+                    </w:rPr>
+                  </w:pPr>
+                  <w:r>
+                    <w:rPr>
+                      <w:rFonts w:ascii="Arial" w:hAnsi="Arial" w:cs="Arial"/>
+                    </w:rPr>
+                    <w:t>1 week</w:t>
+                  </w:r>
+                </w:p>
+              </w:tc>
+            </w:tr>
+            <w:tr>
+              <w:tc>
+                <w:tcPr>
+                  <w:tcW w:w="4575" w:type="dxa"/>
+                </w:tcPr>
+                <w:p>
+                  <w:pPr>
+                    <w:spacing w:line="360" w:lineRule="atLeast"/>
+                    <w:rPr>
+                      <w:rFonts w:ascii="Arial" w:hAnsi="Arial" w:cs="Arial"/>
+                    </w:rPr>
+                  </w:pPr>
+                  <w:r>
+                    <w:rPr>
+                      <w:rFonts w:ascii="Arial" w:hAnsi="Arial" w:cs="Arial"/>
+                    </w:rPr>
+                    <w:t>Integration and Testing</w:t>
+                  </w:r>
+                </w:p>
+                <w:p>
+                  <w:pPr>
+                    <w:spacing w:line="360" w:lineRule="atLeast"/>
+                    <w:rPr>
+                      <w:rFonts w:ascii="Arial" w:hAnsi="Arial" w:cs="Arial"/>
+                    </w:rPr>
+                  </w:pPr>
+                </w:p>
+              </w:tc>
+              <w:tc>
+                <w:tcPr>
+                  <w:tcW w:w="4576" w:type="dxa"/>
+                </w:tcPr>
+                <w:p>
+                  <w:pPr>
+                    <w:spacing w:line="360" w:lineRule="atLeast"/>
+                    <w:rPr>
+                      <w:rFonts w:ascii="Arial" w:hAnsi="Arial" w:cs="Arial"/>
+                    </w:rPr>
+                  </w:pPr>
+                  <w:r>
+                    <w:rPr>
+                      <w:rFonts w:ascii="Arial" w:hAnsi="Arial" w:cs="Arial"/>
+                    </w:rPr>
+                    <w:t>2-3 weeks</w:t>
+                  </w:r>
+                </w:p>
+              </w:tc>
+            </w:tr>
+            <w:tr>
+              <w:tc>
+                <w:tcPr>
+                  <w:tcW w:w="4575" w:type="dxa"/>
+                </w:tcPr>
+                <w:p>
+                  <w:pPr>
+                    <w:spacing w:line="360" w:lineRule="atLeast"/>
+                    <w:rPr>
+                      <w:rFonts w:ascii="Arial" w:hAnsi="Arial" w:cs="Arial"/>
+                    </w:rPr>
+                  </w:pPr>
+                  <w:r>
+                    <w:rPr>
+                      <w:rFonts w:ascii="Arial" w:hAnsi="Arial" w:cs="Arial"/>
+                    </w:rPr>
+                    <w:t>Final Evaluation and Documentation</w:t>
+                  </w:r>
+                </w:p>
+                <w:p>
+                  <w:pPr>
+                    <w:spacing w:line="360" w:lineRule="atLeast"/>
+                    <w:rPr>
+                      <w:rFonts w:ascii="Arial" w:hAnsi="Arial" w:cs="Arial"/>
+                    </w:rPr>
+                  </w:pPr>
+                </w:p>
+              </w:tc>
+              <w:tc>
+                <w:tcPr>
+                  <w:tcW w:w="4576" w:type="dxa"/>
+                </w:tcPr>
+                <w:p>
+                  <w:pPr>
+                    <w:spacing w:line="360" w:lineRule="atLeast"/>
+                    <w:rPr>
+                      <w:rFonts w:ascii="Arial" w:hAnsi="Arial" w:cs="Arial"/>
+                    </w:rPr>
+                  </w:pPr>
+                  <w:r>
+                    <w:rPr>
+                      <w:rFonts w:ascii="Arial" w:hAnsi="Arial" w:cs="Arial"/>
+                    </w:rPr>
+                    <w:t>2 weeks</w:t>
+                  </w:r>
+                </w:p>
+              </w:tc>
+            </w:tr>
+          </w:tbl>
+          <w:p>
+            <w:pPr>
+              <w:spacing w:line="360" w:lineRule="atLeast"/>
+              <w:rPr>
+                <w:rFonts w:ascii="Arial" w:hAnsi="Arial" w:cs="Arial"/>
+              </w:rPr>
+            </w:pPr>
+            <w:r>
+              <w:rPr>
+                <w:rFonts w:ascii="Arial" w:hAnsi="Arial" w:cs="Arial"/>
+              </w:rPr>
+              <w:lastRenderedPageBreak/>
+              <w:drawing>
+                <wp:inline distT="0" distB="0" distL="0" distR="0" wp14:anchorId="78D33D95" wp14:editId="5AEE67D3">
+                  <wp:extent cx="5781675" cy="4579620"/>
+                  <wp:effectExtent l="0" t="0" r="9525" b="0"/>
+                  <wp:docPr id="963608598" name="Picture 1"/>
+                  <wp:cNvGraphicFramePr>
+                    <a:graphicFrameLocks xmlns:a="http://schemas.openxmlformats.org/drawingml/2006/main" noChangeAspect="1"/>
+                  </wp:cNvGraphicFramePr>
+                  <a:graphic xmlns:a="http://schemas.openxmlformats.org/drawingml/2006/main">
+                    <a:graphicData uri="http://schemas.openxmlformats.org/drawingml/2006/picture">
+                      <pic:pic xmlns:pic="http://schemas.openxmlformats.org/drawingml/2006/picture">
+                        <pic:nvPicPr>
+                          <pic:cNvPr id="963608598" name=""/>
+                          <pic:cNvPicPr/>
+                        </pic:nvPicPr>
+                        <pic:blipFill>
+                          <a:blip r:embed="rId12"/>
+                          <a:stretch>
+                            <a:fillRect/>
+                          </a:stretch>
+                        </pic:blipFill>
+                        <pic:spPr>
+                          <a:xfrm>
+                            <a:off x="0" y="0"/>
+                            <a:ext cx="5781675" cy="4579620"/>
+                          </a:xfrm>
+                          <a:prstGeom prst="rect">
+                            <a:avLst/>
+                          </a:prstGeom>
+                        </pic:spPr>
+                      </pic:pic>
+                    </a:graphicData>
+                  </a:graphic>
+                </wp:inline>
+              </w:drawing>
+            </w:r>
+          </w:p>
+          <w:p>
+            <w:pPr>
+              <w:spacing w:line="360" w:lineRule="atLeast"/>
+              <w:rPr>
+                <w:rFonts w:ascii="Arial" w:hAnsi="Arial" w:cs="Arial"/>
+              </w:rPr>
+            </w:pPr>
+            <w:r>
+              <w:rPr>
+                <w:rFonts w:ascii="Arial" w:hAnsi="Arial" w:cs="Arial"/>
+              </w:rPr>
+              <w:drawing>
+                <wp:inline distT="0" distB="0" distL="0" distR="0" wp14:anchorId="2ECA2B22" wp14:editId="1CE576D1">
+                  <wp:extent cx="5781675" cy="3935730"/>
+                  <wp:effectExtent l="0" t="0" r="9525" b="7620"/>
+                  <wp:docPr id="309973520" name="Picture 1"/>
+                  <wp:cNvGraphicFramePr>
+                    <a:graphicFrameLocks xmlns:a="http://schemas.openxmlformats.org/drawingml/2006/main" noChangeAspect="1"/>
+                  </wp:cNvGraphicFramePr>
+                  <a:graphic xmlns:a="http://schemas.openxmlformats.org/drawingml/2006/main">
+                    <a:graphicData uri="http://schemas.openxmlformats.org/drawingml/2006/picture">
+                      <pic:pic xmlns:pic="http://schemas.openxmlformats.org/drawingml/2006/picture">
+                        <pic:nvPicPr>
+                          <pic:cNvPr id="309973520" name=""/>
+                          <pic:cNvPicPr/>
+                        </pic:nvPicPr>
+                        <pic:blipFill>
+                          <a:blip r:embed="rId13"/>
+                          <a:stretch>
+                            <a:fillRect/>
+                          </a:stretch>
+                        </pic:blipFill>
+                        <pic:spPr>
+                          <a:xfrm>
+                            <a:off x="0" y="0"/>
+                            <a:ext cx="5781675" cy="3935730"/>
+                          </a:xfrm>
+                          <a:prstGeom prst="rect">
+                            <a:avLst/>
+                          </a:prstGeom>
+                        </pic:spPr>
+                      </pic:pic>
+                    </a:graphicData>
+                  </a:graphic>
+                </wp:inline>
+              </w:drawing>
+            </w:r>
+          </w:p>
+          <w:p>
+            <w:pPr>
+              <w:spacing w:line="360" w:lineRule="atLeast"/>
+              <w:jc w:val="center"/>
+              <w:rPr>
+                <w:rFonts w:ascii="Arial" w:hAnsi="Arial" w:cs="Arial"/>
+              </w:rPr>
+            </w:pPr>
+            <w:r>
+              <w:rPr>
+                <w:rFonts w:ascii="Arial" w:hAnsi="Arial" w:cs="Arial"/>
+              </w:rPr>
+              <w:t>Figure 4: Gantt Chart showing project tasks and milestones</w:t>
             </w:r>
           </w:p>
         </w:tc>
@@ -6538,24 +8021,29 @@
         <w:spacing w:line="360" w:lineRule="atLeast"/>
         <w:rPr>
           <w:rFonts w:ascii="Arial" w:hAnsi="Arial" w:cs="Arial"/>
+        </w:rPr>
+      </w:pPr>
+      <w:r>
+        <w:rPr>
+          <w:rFonts w:ascii="Arial" w:hAnsi="Arial" w:cs="Arial"/>
           <w:u w:val="single"/>
         </w:rPr>
-      </w:pPr>
-    </w:p>
-    <w:p>
-      <w:pPr>
-        <w:spacing w:line="360" w:lineRule="atLeast"/>
-        <w:rPr>
-          <w:rFonts w:ascii="Arial" w:hAnsi="Arial" w:cs="Arial"/>
-        </w:rPr>
-      </w:pPr>
+        <w:lastRenderedPageBreak/>
+        <w:t xml:space="preserve">Are you requesting a </w:t>
+      </w:r>
       <w:r>
         <w:rPr>
           <w:rFonts w:ascii="Arial" w:hAnsi="Arial" w:cs="Arial"/>
           <w:u w:val="single"/>
         </w:rPr>
-        <w:lastRenderedPageBreak/>
-        <w:t>Are you requesting a loan of hardware from the department</w:t>
+        <w:t>hardware loan</w:t>
+      </w:r>
+      <w:r>
+        <w:rPr>
+          <w:rFonts w:ascii="Arial" w:hAnsi="Arial" w:cs="Arial"/>
+          <w:u w:val="single"/>
+        </w:rPr>
+        <w:t xml:space="preserve"> from the department</w:t>
       </w:r>
       <w:r>
         <w:rPr>
@@ -6604,7 +8092,7 @@
           </w:rPr>
           <w:id w:val="-353417151"/>
           <w14:checkbox>
-            <w14:checked w14:val="0"/>
+            <w14:checked w14:val="1"/>
             <w14:checkedState w14:val="2612" w14:font="MS Gothic"/>
             <w14:uncheckedState w14:val="2610" w14:font="MS Gothic"/>
           </w14:checkbox>
@@ -6614,58 +8102,10 @@
             <w:rPr>
               <w:rFonts w:ascii="MS Gothic" w:eastAsia="MS Gothic" w:hAnsi="MS Gothic" w:cs="Arial" w:hint="eastAsia"/>
             </w:rPr>
-            <w:t>☐</w:t>
+            <w:t>☒</w:t>
           </w:r>
         </w:sdtContent>
       </w:sdt>
-    </w:p>
-    <w:p>
-      <w:pPr>
-        <w:spacing w:line="360" w:lineRule="atLeast"/>
-        <w:rPr>
-          <w:rFonts w:ascii="Arial" w:hAnsi="Arial" w:cs="Arial"/>
-        </w:rPr>
-      </w:pPr>
-    </w:p>
-    <w:p>
-      <w:pPr>
-        <w:spacing w:line="360" w:lineRule="atLeast"/>
-        <w:rPr>
-          <w:rFonts w:ascii="Arial" w:hAnsi="Arial" w:cs="Arial"/>
-        </w:rPr>
-      </w:pPr>
-    </w:p>
-    <w:p>
-      <w:pPr>
-        <w:spacing w:line="360" w:lineRule="atLeast"/>
-        <w:rPr>
-          <w:rFonts w:ascii="Arial" w:hAnsi="Arial" w:cs="Arial"/>
-        </w:rPr>
-      </w:pPr>
-    </w:p>
-    <w:p>
-      <w:pPr>
-        <w:spacing w:line="360" w:lineRule="atLeast"/>
-        <w:rPr>
-          <w:rFonts w:ascii="Arial" w:hAnsi="Arial" w:cs="Arial"/>
-        </w:rPr>
-      </w:pPr>
-    </w:p>
-    <w:p>
-      <w:pPr>
-        <w:spacing w:line="360" w:lineRule="atLeast"/>
-        <w:rPr>
-          <w:rFonts w:ascii="Arial" w:hAnsi="Arial" w:cs="Arial"/>
-        </w:rPr>
-      </w:pPr>
-    </w:p>
-    <w:p>
-      <w:pPr>
-        <w:spacing w:line="360" w:lineRule="atLeast"/>
-        <w:rPr>
-          <w:rFonts w:ascii="Arial" w:hAnsi="Arial" w:cs="Arial"/>
-        </w:rPr>
-      </w:pPr>
     </w:p>
     <w:p>
       <w:pPr>
@@ -6743,7 +8183,6 @@
                 <w:i/>
                 <w:iCs/>
               </w:rPr>
-              <w:lastRenderedPageBreak/>
               <w:t xml:space="preserve">R   </w:t>
             </w:r>
           </w:p>
@@ -6783,7 +8222,23 @@
           <w:p/>
           <w:p>
             <w:r>
-              <w:t xml:space="preserve">Haldar, Dibyajyoti, Asma Musfira Shabbirahmed, Reeta Rani Singhania, et al. ‘Understanding the Management of Household Food Waste and Its Engineering for Sustainable Valorization- A State-of-the-Art Review’. </w:t>
+              <w:t xml:space="preserve">Haldar, </w:t>
+            </w:r>
+            <w:proofErr w:type="spellStart"/>
+            <w:r>
+              <w:t>Dibyajyoti</w:t>
+            </w:r>
+            <w:proofErr w:type="spellEnd"/>
+            <w:r>
+              <w:t xml:space="preserve">, Asma Musfira Shabbirahmed, Reeta Rani Singhania, et al. ‘Understanding the Management of Household Food Waste and Its Engineering for Sustainable </w:t>
+            </w:r>
+            <w:proofErr w:type="spellStart"/>
+            <w:r>
+              <w:t>Valorization</w:t>
+            </w:r>
+            <w:proofErr w:type="spellEnd"/>
+            <w:r>
+              <w:t xml:space="preserve">- A State-of-the-Art Review’. </w:t>
             </w:r>
             <w:r>
               <w:rPr>
@@ -6795,7 +8250,7 @@
             <w:r>
               <w:t xml:space="preserve"> 358 (August 2022): 127390. </w:t>
             </w:r>
-            <w:hyperlink r:id="rId10" w:history="1">
+            <w:hyperlink r:id="rId14" w:history="1">
               <w:r>
                 <w:rPr>
                   <w:color w:val="0000FF"/>
@@ -6824,7 +8279,15 @@
               <w:t xml:space="preserve">    Sc</w:t>
             </w:r>
             <w:r>
-              <w:t xml:space="preserve">hanes, Karin, Karin Dobernig, and Burcu Gözet. ‘Food Waste Matters - A Systematic Review of Household Food Waste Practices and Their Policy Implications’. </w:t>
+              <w:t xml:space="preserve">hanes, Karin, Karin Dobernig, and Burcu </w:t>
+            </w:r>
+            <w:proofErr w:type="spellStart"/>
+            <w:r>
+              <w:t>Gözet</w:t>
+            </w:r>
+            <w:proofErr w:type="spellEnd"/>
+            <w:r>
+              <w:t xml:space="preserve">. ‘Food Waste Matters - A Systematic Review of Household Food Waste Practices and Their Policy Implications’. </w:t>
             </w:r>
             <w:r>
               <w:rPr>
@@ -6836,7 +8299,7 @@
             <w:r>
               <w:t xml:space="preserve"> 182 (May 2018): 978–91. </w:t>
             </w:r>
-            <w:hyperlink r:id="rId11" w:history="1">
+            <w:hyperlink r:id="rId15" w:history="1">
               <w:r>
                 <w:rPr>
                   <w:color w:val="0000FF"/>
@@ -6882,7 +8345,7 @@
               </w:rPr>
               <w:t xml:space="preserve">. ‘Food Waste Statistics for Ireland’. Accessed 2 October 2026. </w:t>
             </w:r>
-            <w:hyperlink r:id="rId12" w:history="1">
+            <w:hyperlink r:id="rId16" w:history="1">
               <w:r>
                 <w:rPr>
                   <w:rStyle w:val="Hyperlink"/>
@@ -6920,9 +8383,25 @@
                 <w:i/>
                 <w:iCs/>
               </w:rPr>
-              <w:t xml:space="preserve">Creations, KH. ‘NoWaste - A Food Inventory App for the Whole Household’. Accessed 13 October 2026. </w:t>
-            </w:r>
-            <w:hyperlink r:id="rId13" w:history="1">
+              <w:t>Creations, KH. ‘</w:t>
+            </w:r>
+            <w:proofErr w:type="spellStart"/>
+            <w:r>
+              <w:rPr>
+                <w:i/>
+                <w:iCs/>
+              </w:rPr>
+              <w:t>NoWaste</w:t>
+            </w:r>
+            <w:proofErr w:type="spellEnd"/>
+            <w:r>
+              <w:rPr>
+                <w:i/>
+                <w:iCs/>
+              </w:rPr>
+              <w:t xml:space="preserve"> - A Food Inventory App for the Whole Household’. Accessed 13 October 2026. </w:t>
+            </w:r>
+            <w:hyperlink r:id="rId17" w:history="1">
               <w:r>
                 <w:rPr>
                   <w:rStyle w:val="Hyperlink"/>
@@ -6942,20 +8421,42 @@
           </w:p>
           <w:p/>
           <w:p>
-            <w:r>
-              <w:t>Liegeard, Julie, and Louise Manning. ‘Use of Intelligent Applications to Reduce Household Food Waste’.</w:t>
+            <w:proofErr w:type="spellStart"/>
+            <w:r>
+              <w:t>Liegeard</w:t>
+            </w:r>
+            <w:proofErr w:type="spellEnd"/>
+            <w:r>
+              <w:t xml:space="preserve">, Julie, and Louise Manning. ‘Use of Intelligent Applications to Reduce Household Food </w:t>
+            </w:r>
+            <w:proofErr w:type="spellStart"/>
+            <w:r>
+              <w:t>Waste</w:t>
+            </w:r>
+            <w:proofErr w:type="gramStart"/>
+            <w:r>
+              <w:t>’.</w:t>
             </w:r>
             <w:r>
               <w:rPr>
                 <w:i/>
                 <w:iCs/>
               </w:rPr>
-              <w:t>Critical Reviews in Food Science and Nutrition</w:t>
+              <w:t>Critical</w:t>
+            </w:r>
+            <w:proofErr w:type="spellEnd"/>
+            <w:proofErr w:type="gramEnd"/>
+            <w:r>
+              <w:rPr>
+                <w:i/>
+                <w:iCs/>
+              </w:rPr>
+              <w:t xml:space="preserve"> Reviews in Food Science and Nutrition</w:t>
             </w:r>
             <w:r>
               <w:t xml:space="preserve"> 60, no. 6 (2020): 1048–61. </w:t>
             </w:r>
-            <w:hyperlink r:id="rId14" w:history="1">
+            <w:hyperlink r:id="rId18" w:history="1">
               <w:r>
                 <w:rPr>
                   <w:color w:val="0000FF"/>
@@ -6971,9 +8472,17 @@
           <w:p/>
           <w:p>
             <w:r>
-              <w:t xml:space="preserve">Currys, IE. ‘Buy SAMSUNG Family Hub with AI Vision RF65DG9H0ESREU Smart Fridge Freezer - Silver | CurrysIE’. Accessed 14 October 2026. </w:t>
-            </w:r>
-            <w:hyperlink r:id="rId15" w:history="1">
+              <w:t xml:space="preserve">Currys, IE. ‘Buy SAMSUNG Family Hub with AI Vision RF65DG9H0ESREU Smart Fridge Freezer - Silver | </w:t>
+            </w:r>
+            <w:proofErr w:type="spellStart"/>
+            <w:r>
+              <w:t>CurrysIE</w:t>
+            </w:r>
+            <w:proofErr w:type="spellEnd"/>
+            <w:r>
+              <w:t xml:space="preserve">’. Accessed 14 October 2026. </w:t>
+            </w:r>
+            <w:hyperlink r:id="rId19" w:history="1">
               <w:r>
                 <w:rPr>
                   <w:color w:val="0000FF"/>
@@ -6988,8 +8497,27 @@
           </w:p>
           <w:p/>
           <w:p>
-            <w:r>
-              <w:t xml:space="preserve">Ifham, N. M., M. I. M. Abdulla, M. R. M. Rifadh, M. N. M. Hussain Ajward, N. H. P. Ravi Supunya Swarnakantha, and Karthiga Rajendran. ‘Machine Learning Based Approach to Reduce Food Wastage’. </w:t>
+            <w:proofErr w:type="spellStart"/>
+            <w:r>
+              <w:t>Ifham</w:t>
+            </w:r>
+            <w:proofErr w:type="spellEnd"/>
+            <w:r>
+              <w:t xml:space="preserve">, N. M., M. I. M. Abdulla, M. R. M. </w:t>
+            </w:r>
+            <w:proofErr w:type="spellStart"/>
+            <w:r>
+              <w:t>Rifadh</w:t>
+            </w:r>
+            <w:proofErr w:type="spellEnd"/>
+            <w:r>
+              <w:t xml:space="preserve">, M. N. M. Hussain Ajward, N. H. P. Ravi Supunya Swarnakantha, and Karthiga Rajendran. ‘Machine </w:t>
+            </w:r>
+            <w:r>
+              <w:t>Learning-Based</w:t>
+            </w:r>
+            <w:r>
+              <w:t xml:space="preserve"> Approach to Reduce Food Wastage’. </w:t>
             </w:r>
             <w:r>
               <w:rPr>
@@ -7001,7 +8529,7 @@
             <w:r>
               <w:t xml:space="preserve">, December 2023, 119–24. </w:t>
             </w:r>
-            <w:hyperlink r:id="rId16" w:history="1">
+            <w:hyperlink r:id="rId20" w:history="1">
               <w:r>
                 <w:rPr>
                   <w:rStyle w:val="Hyperlink"/>
@@ -7042,7 +8570,7 @@
     </w:p>
     <w:p/>
     <w:sectPr>
-      <w:footerReference w:type="default" r:id="rId17"/>
+      <w:footerReference w:type="default" r:id="rId21"/>
       <w:pgSz w:w="11906" w:h="16838"/>
       <w:pgMar w:top="1361" w:right="1440" w:bottom="1440" w:left="1361" w:header="709" w:footer="709" w:gutter="0"/>
       <w:cols w:space="708"/>
@@ -7603,13 +9131,13 @@
     </w:lvl>
   </w:abstractNum>
   <w:abstractNum w:abstractNumId="5" w15:restartNumberingAfterBreak="0">
-    <w:nsid w:val="6ED374E3"/>
+    <w:nsid w:val="52CB0639"/>
     <w:multiLevelType w:val="hybridMultilevel"/>
-    <w:tmpl w:val="10D64434"/>
-    <w:lvl w:ilvl="0" w:tplc="18090011">
+    <w:tmpl w:val="82A8EC60"/>
+    <w:lvl w:ilvl="0" w:tplc="C2EEA612">
       <w:start w:val="1"/>
       <w:numFmt w:val="decimal"/>
-      <w:lvlText w:val="%1)"/>
+      <w:lvlText w:val="%1-"/>
       <w:lvlJc w:val="left"/>
       <w:pPr>
         <w:ind w:left="720" w:hanging="360"/>
@@ -7692,6 +9220,184 @@
     </w:lvl>
   </w:abstractNum>
   <w:abstractNum w:abstractNumId="6" w15:restartNumberingAfterBreak="0">
+    <w:nsid w:val="69C034B0"/>
+    <w:multiLevelType w:val="hybridMultilevel"/>
+    <w:tmpl w:val="7C9E564C"/>
+    <w:lvl w:ilvl="0" w:tplc="1809000F">
+      <w:start w:val="1"/>
+      <w:numFmt w:val="decimal"/>
+      <w:lvlText w:val="%1."/>
+      <w:lvlJc w:val="left"/>
+      <w:pPr>
+        <w:ind w:left="720" w:hanging="360"/>
+      </w:pPr>
+      <w:rPr>
+        <w:rFonts w:hint="default"/>
+      </w:rPr>
+    </w:lvl>
+    <w:lvl w:ilvl="1" w:tplc="18090019" w:tentative="1">
+      <w:start w:val="1"/>
+      <w:numFmt w:val="lowerLetter"/>
+      <w:lvlText w:val="%2."/>
+      <w:lvlJc w:val="left"/>
+      <w:pPr>
+        <w:ind w:left="1440" w:hanging="360"/>
+      </w:pPr>
+    </w:lvl>
+    <w:lvl w:ilvl="2" w:tplc="1809001B" w:tentative="1">
+      <w:start w:val="1"/>
+      <w:numFmt w:val="lowerRoman"/>
+      <w:lvlText w:val="%3."/>
+      <w:lvlJc w:val="right"/>
+      <w:pPr>
+        <w:ind w:left="2160" w:hanging="180"/>
+      </w:pPr>
+    </w:lvl>
+    <w:lvl w:ilvl="3" w:tplc="1809000F" w:tentative="1">
+      <w:start w:val="1"/>
+      <w:numFmt w:val="decimal"/>
+      <w:lvlText w:val="%4."/>
+      <w:lvlJc w:val="left"/>
+      <w:pPr>
+        <w:ind w:left="2880" w:hanging="360"/>
+      </w:pPr>
+    </w:lvl>
+    <w:lvl w:ilvl="4" w:tplc="18090019" w:tentative="1">
+      <w:start w:val="1"/>
+      <w:numFmt w:val="lowerLetter"/>
+      <w:lvlText w:val="%5."/>
+      <w:lvlJc w:val="left"/>
+      <w:pPr>
+        <w:ind w:left="3600" w:hanging="360"/>
+      </w:pPr>
+    </w:lvl>
+    <w:lvl w:ilvl="5" w:tplc="1809001B" w:tentative="1">
+      <w:start w:val="1"/>
+      <w:numFmt w:val="lowerRoman"/>
+      <w:lvlText w:val="%6."/>
+      <w:lvlJc w:val="right"/>
+      <w:pPr>
+        <w:ind w:left="4320" w:hanging="180"/>
+      </w:pPr>
+    </w:lvl>
+    <w:lvl w:ilvl="6" w:tplc="1809000F" w:tentative="1">
+      <w:start w:val="1"/>
+      <w:numFmt w:val="decimal"/>
+      <w:lvlText w:val="%7."/>
+      <w:lvlJc w:val="left"/>
+      <w:pPr>
+        <w:ind w:left="5040" w:hanging="360"/>
+      </w:pPr>
+    </w:lvl>
+    <w:lvl w:ilvl="7" w:tplc="18090019" w:tentative="1">
+      <w:start w:val="1"/>
+      <w:numFmt w:val="lowerLetter"/>
+      <w:lvlText w:val="%8."/>
+      <w:lvlJc w:val="left"/>
+      <w:pPr>
+        <w:ind w:left="5760" w:hanging="360"/>
+      </w:pPr>
+    </w:lvl>
+    <w:lvl w:ilvl="8" w:tplc="1809001B" w:tentative="1">
+      <w:start w:val="1"/>
+      <w:numFmt w:val="lowerRoman"/>
+      <w:lvlText w:val="%9."/>
+      <w:lvlJc w:val="right"/>
+      <w:pPr>
+        <w:ind w:left="6480" w:hanging="180"/>
+      </w:pPr>
+    </w:lvl>
+  </w:abstractNum>
+  <w:abstractNum w:abstractNumId="7" w15:restartNumberingAfterBreak="0">
+    <w:nsid w:val="6ED374E3"/>
+    <w:multiLevelType w:val="hybridMultilevel"/>
+    <w:tmpl w:val="10D64434"/>
+    <w:lvl w:ilvl="0" w:tplc="18090011">
+      <w:start w:val="1"/>
+      <w:numFmt w:val="decimal"/>
+      <w:lvlText w:val="%1)"/>
+      <w:lvlJc w:val="left"/>
+      <w:pPr>
+        <w:ind w:left="720" w:hanging="360"/>
+      </w:pPr>
+      <w:rPr>
+        <w:rFonts w:hint="default"/>
+      </w:rPr>
+    </w:lvl>
+    <w:lvl w:ilvl="1" w:tplc="18090019" w:tentative="1">
+      <w:start w:val="1"/>
+      <w:numFmt w:val="lowerLetter"/>
+      <w:lvlText w:val="%2."/>
+      <w:lvlJc w:val="left"/>
+      <w:pPr>
+        <w:ind w:left="1440" w:hanging="360"/>
+      </w:pPr>
+    </w:lvl>
+    <w:lvl w:ilvl="2" w:tplc="1809001B" w:tentative="1">
+      <w:start w:val="1"/>
+      <w:numFmt w:val="lowerRoman"/>
+      <w:lvlText w:val="%3."/>
+      <w:lvlJc w:val="right"/>
+      <w:pPr>
+        <w:ind w:left="2160" w:hanging="180"/>
+      </w:pPr>
+    </w:lvl>
+    <w:lvl w:ilvl="3" w:tplc="1809000F" w:tentative="1">
+      <w:start w:val="1"/>
+      <w:numFmt w:val="decimal"/>
+      <w:lvlText w:val="%4."/>
+      <w:lvlJc w:val="left"/>
+      <w:pPr>
+        <w:ind w:left="2880" w:hanging="360"/>
+      </w:pPr>
+    </w:lvl>
+    <w:lvl w:ilvl="4" w:tplc="18090019" w:tentative="1">
+      <w:start w:val="1"/>
+      <w:numFmt w:val="lowerLetter"/>
+      <w:lvlText w:val="%5."/>
+      <w:lvlJc w:val="left"/>
+      <w:pPr>
+        <w:ind w:left="3600" w:hanging="360"/>
+      </w:pPr>
+    </w:lvl>
+    <w:lvl w:ilvl="5" w:tplc="1809001B" w:tentative="1">
+      <w:start w:val="1"/>
+      <w:numFmt w:val="lowerRoman"/>
+      <w:lvlText w:val="%6."/>
+      <w:lvlJc w:val="right"/>
+      <w:pPr>
+        <w:ind w:left="4320" w:hanging="180"/>
+      </w:pPr>
+    </w:lvl>
+    <w:lvl w:ilvl="6" w:tplc="1809000F" w:tentative="1">
+      <w:start w:val="1"/>
+      <w:numFmt w:val="decimal"/>
+      <w:lvlText w:val="%7."/>
+      <w:lvlJc w:val="left"/>
+      <w:pPr>
+        <w:ind w:left="5040" w:hanging="360"/>
+      </w:pPr>
+    </w:lvl>
+    <w:lvl w:ilvl="7" w:tplc="18090019" w:tentative="1">
+      <w:start w:val="1"/>
+      <w:numFmt w:val="lowerLetter"/>
+      <w:lvlText w:val="%8."/>
+      <w:lvlJc w:val="left"/>
+      <w:pPr>
+        <w:ind w:left="5760" w:hanging="360"/>
+      </w:pPr>
+    </w:lvl>
+    <w:lvl w:ilvl="8" w:tplc="1809001B" w:tentative="1">
+      <w:start w:val="1"/>
+      <w:numFmt w:val="lowerRoman"/>
+      <w:lvlText w:val="%9."/>
+      <w:lvlJc w:val="right"/>
+      <w:pPr>
+        <w:ind w:left="6480" w:hanging="180"/>
+      </w:pPr>
+    </w:lvl>
+  </w:abstractNum>
+  <w:abstractNum w:abstractNumId="8" w15:restartNumberingAfterBreak="0">
     <w:nsid w:val="73427328"/>
     <w:multiLevelType w:val="hybridMultilevel"/>
     <w:tmpl w:val="198C7220"/>
@@ -7808,7 +9514,7 @@
     <w:abstractNumId w:val="0"/>
   </w:num>
   <w:num w:numId="2" w16cid:durableId="883904202">
-    <w:abstractNumId w:val="6"/>
+    <w:abstractNumId w:val="8"/>
   </w:num>
   <w:num w:numId="3" w16cid:durableId="234435355">
     <w:abstractNumId w:val="4"/>
@@ -7817,13 +9523,19 @@
     <w:abstractNumId w:val="2"/>
   </w:num>
   <w:num w:numId="5" w16cid:durableId="466552741">
-    <w:abstractNumId w:val="5"/>
+    <w:abstractNumId w:val="7"/>
   </w:num>
   <w:num w:numId="6" w16cid:durableId="53432613">
     <w:abstractNumId w:val="3"/>
   </w:num>
   <w:num w:numId="7" w16cid:durableId="62992298">
     <w:abstractNumId w:val="1"/>
+  </w:num>
+  <w:num w:numId="8" w16cid:durableId="187839696">
+    <w:abstractNumId w:val="6"/>
+  </w:num>
+  <w:num w:numId="9" w16cid:durableId="585261661">
+    <w:abstractNumId w:val="5"/>
   </w:num>
 </w:numbering>
 </file>

</xml_diff>